<commit_message>
Ultime modifiche ed esportazione in pdf
Effettuate ultime modifiche al template e convertito in pdf per la consegna
</commit_message>
<xml_diff>
--- a/Guerra_Giacomo_0312500522.docx
+++ b/Guerra_Giacomo_0312500522.docx
@@ -45,7 +45,7 @@
                 <w14:ligatures w14:val="standardContextual"/>
               </w:rPr>
               <w:drawing>
-                <wp:inline distT="0" distB="0" distL="0" distR="0" wp14:anchorId="63CFB47A" wp14:editId="00F75EEF">
+                <wp:inline distT="0" distB="0" distL="0" distR="0" wp14:anchorId="63CFB47A" wp14:editId="4F93367A">
                   <wp:extent cx="728345" cy="571500"/>
                   <wp:effectExtent l="0" t="0" r="0" b="0"/>
                   <wp:docPr id="6" name="Immagine 6"/>
@@ -2719,6 +2719,15 @@
                 <w:szCs w:val="24"/>
                 <w:lang w:val="it-IT"/>
               </w:rPr>
+              <w:t>:</w:t>
+            </w:r>
+            <w:r>
+              <w:rPr>
+                <w:rFonts w:ascii="Times New Roman" w:hAnsi="Times New Roman" w:cs="Times New Roman"/>
+                <w:sz w:val="24"/>
+                <w:szCs w:val="24"/>
+                <w:lang w:val="it-IT"/>
+              </w:rPr>
               <w:t xml:space="preserve"> </w:t>
             </w:r>
             <w:hyperlink r:id="rId23" w:history="1">
@@ -2751,28 +2760,18 @@
               </w:rPr>
               <w:t xml:space="preserve">. Una copia dei file dell'elaborato è inoltre reperibile nella cartella condivisa al seguente indirizzo: </w:t>
             </w:r>
-            <w:r>
-              <w:fldChar w:fldCharType="begin"/>
-            </w:r>
-            <w:r>
-              <w:instrText>HYPERLINK "https://drive.google.com/drive/folders/1pqls3VNaQDDqZTrelvKedhvlV5NnJRjl?usp=drive_link"</w:instrText>
-            </w:r>
-            <w:r>
-              <w:fldChar w:fldCharType="separate"/>
-            </w:r>
-            <w:r>
-              <w:rPr>
-                <w:rStyle w:val="Hyperlink"/>
-                <w:rFonts w:ascii="Times New Roman" w:hAnsi="Times New Roman" w:cs="Times New Roman"/>
-                <w:sz w:val="24"/>
-                <w:szCs w:val="24"/>
-                <w:lang w:val="it-IT"/>
-              </w:rPr>
-              <w:t>https://drive.google.com/drive/folders/1pqls3VNaQDDqZTrelvKedhvlV5NnJRjl?usp=drive_link</w:t>
-            </w:r>
-            <w:r>
-              <w:fldChar w:fldCharType="end"/>
-            </w:r>
+            <w:hyperlink r:id="rId24" w:history="1">
+              <w:r>
+                <w:rPr>
+                  <w:rStyle w:val="Hyperlink"/>
+                  <w:rFonts w:ascii="Times New Roman" w:hAnsi="Times New Roman" w:cs="Times New Roman"/>
+                  <w:sz w:val="24"/>
+                  <w:szCs w:val="24"/>
+                  <w:lang w:val="it-IT"/>
+                </w:rPr>
+                <w:t>https://drive.google.com/drive/folders/1pqls3VNaQDDqZTrelvKedhvlV5NnJRjl?usp=drive_link</w:t>
+              </w:r>
+            </w:hyperlink>
             <w:r>
               <w:rPr>
                 <w:rFonts w:ascii="Times New Roman" w:hAnsi="Times New Roman" w:cs="Times New Roman"/>
@@ -2886,79 +2885,59 @@
               </w:rPr>
               <w:t xml:space="preserve">•  Agenzia per la Cybersicurezza Nazionale (ACN), documentazione e materiali informativi relativi ai soggetti e agli obblighi previsti dalla NIS2 (sito istituzionale </w:t>
             </w:r>
-            <w:r>
-              <w:fldChar w:fldCharType="begin"/>
-            </w:r>
-            <w:r>
-              <w:instrText>HYPERLINK "https://acn.gov.it"</w:instrText>
-            </w:r>
-            <w:r>
-              <w:fldChar w:fldCharType="separate"/>
-            </w:r>
-            <w:r>
-              <w:rPr>
-                <w:rStyle w:val="Hyperlink"/>
+            <w:hyperlink r:id="rId25" w:history="1">
+              <w:r>
+                <w:rPr>
+                  <w:rStyle w:val="Hyperlink"/>
+                  <w:rFonts w:ascii="Times New Roman" w:hAnsi="Times New Roman" w:cs="Times New Roman"/>
+                  <w:sz w:val="24"/>
+                  <w:szCs w:val="24"/>
+                  <w:lang w:val="it-IT"/>
+                </w:rPr>
+                <w:t>acn.gov.it</w:t>
+              </w:r>
+            </w:hyperlink>
+            <w:r>
+              <w:rPr>
                 <w:rFonts w:ascii="Times New Roman" w:hAnsi="Times New Roman" w:cs="Times New Roman"/>
                 <w:sz w:val="24"/>
                 <w:szCs w:val="24"/>
                 <w:lang w:val="it-IT"/>
               </w:rPr>
-              <w:t>acn.gov.it</w:t>
-            </w:r>
-            <w:r>
-              <w:fldChar w:fldCharType="end"/>
-            </w:r>
-            <w:r>
+              <w:t>).</w:t>
+            </w:r>
+          </w:p>
+          <w:p>
+            <w:pPr>
+              <w:jc w:val="both"/>
               <w:rPr>
                 <w:rFonts w:ascii="Times New Roman" w:hAnsi="Times New Roman" w:cs="Times New Roman"/>
                 <w:sz w:val="24"/>
                 <w:szCs w:val="24"/>
                 <w:lang w:val="it-IT"/>
               </w:rPr>
-              <w:t>).</w:t>
-            </w:r>
-          </w:p>
-          <w:p>
-            <w:pPr>
-              <w:jc w:val="both"/>
+            </w:pPr>
+            <w:r>
               <w:rPr>
                 <w:rFonts w:ascii="Times New Roman" w:hAnsi="Times New Roman" w:cs="Times New Roman"/>
                 <w:sz w:val="24"/>
                 <w:szCs w:val="24"/>
                 <w:lang w:val="it-IT"/>
               </w:rPr>
-            </w:pPr>
-            <w:r>
-              <w:rPr>
-                <w:rFonts w:ascii="Times New Roman" w:hAnsi="Times New Roman" w:cs="Times New Roman"/>
-                <w:sz w:val="24"/>
-                <w:szCs w:val="24"/>
-                <w:lang w:val="it-IT"/>
-              </w:rPr>
               <w:t xml:space="preserve">•  The PostgreSQL Global Development Group, PostgreSQL Documentation (versione 14 e successive), disponibile all’indirizzo </w:t>
             </w:r>
-            <w:r>
-              <w:fldChar w:fldCharType="begin"/>
-            </w:r>
-            <w:r>
-              <w:instrText>HYPERLINK "https://postgresql.org/docs"</w:instrText>
-            </w:r>
-            <w:r>
-              <w:fldChar w:fldCharType="separate"/>
-            </w:r>
-            <w:r>
-              <w:rPr>
-                <w:rStyle w:val="Hyperlink"/>
-                <w:rFonts w:ascii="Times New Roman" w:hAnsi="Times New Roman" w:cs="Times New Roman"/>
-                <w:sz w:val="24"/>
-                <w:szCs w:val="24"/>
-                <w:lang w:val="it-IT"/>
-              </w:rPr>
-              <w:t>https://postgresql.org/docs</w:t>
-            </w:r>
-            <w:r>
-              <w:fldChar w:fldCharType="end"/>
-            </w:r>
+            <w:hyperlink r:id="rId26" w:history="1">
+              <w:r>
+                <w:rPr>
+                  <w:rStyle w:val="Hyperlink"/>
+                  <w:rFonts w:ascii="Times New Roman" w:hAnsi="Times New Roman" w:cs="Times New Roman"/>
+                  <w:sz w:val="24"/>
+                  <w:szCs w:val="24"/>
+                  <w:lang w:val="it-IT"/>
+                </w:rPr>
+                <w:t>https://postgresql.org/docs</w:t>
+              </w:r>
+            </w:hyperlink>
             <w:r>
               <w:rPr>
                 <w:rFonts w:ascii="Times New Roman" w:hAnsi="Times New Roman" w:cs="Times New Roman"/>
@@ -3039,7 +3018,7 @@
                           <pic:cNvPicPr/>
                         </pic:nvPicPr>
                         <pic:blipFill>
-                          <a:blip r:embed="rId24">
+                          <a:blip r:embed="rId27">
                             <a:extLst>
                               <a:ext uri="{28A0092B-C50C-407E-A947-70E740481C1C}">
                                 <a14:useLocalDpi xmlns:a14="http://schemas.microsoft.com/office/drawing/2010/main" val="0"/>
@@ -3112,7 +3091,7 @@
                           <pic:cNvPicPr/>
                         </pic:nvPicPr>
                         <pic:blipFill>
-                          <a:blip r:embed="rId25">
+                          <a:blip r:embed="rId28">
                             <a:extLst>
                               <a:ext uri="{28A0092B-C50C-407E-A947-70E740481C1C}">
                                 <a14:useLocalDpi xmlns:a14="http://schemas.microsoft.com/office/drawing/2010/main" val="0"/>
@@ -3553,7 +3532,7 @@
                           <pic:cNvPicPr/>
                         </pic:nvPicPr>
                         <pic:blipFill>
-                          <a:blip r:embed="rId26">
+                          <a:blip r:embed="rId29">
                             <a:extLst>
                               <a:ext uri="{28A0092B-C50C-407E-A947-70E740481C1C}">
                                 <a14:useLocalDpi xmlns:a14="http://schemas.microsoft.com/office/drawing/2010/main" val="0"/>
@@ -4001,7 +3980,7 @@
                           <pic:cNvPicPr/>
                         </pic:nvPicPr>
                         <pic:blipFill>
-                          <a:blip r:embed="rId27">
+                          <a:blip r:embed="rId30">
                             <a:extLst>
                               <a:ext uri="{28A0092B-C50C-407E-A947-70E740481C1C}">
                                 <a14:useLocalDpi xmlns:a14="http://schemas.microsoft.com/office/drawing/2010/main" val="0"/>
@@ -6195,9 +6174,8 @@
                 <w:sz w:val="18"/>
                 <w:lang w:val="en-US"/>
               </w:rPr>
-              <w:t xml:space="preserve">CREATE OR REPLACE FUNCTION </w:t>
-            </w:r>
-            <w:proofErr w:type="spellStart"/>
+              <w:t>CREATE OR REPLACE FUNCTION fn_audit_asset()</w:t>
+            </w:r>
             <w:r>
               <w:rPr>
                 <w:rFonts w:ascii="Courier New" w:hAnsi="Courier New"/>
@@ -6205,9 +6183,9 @@
                 <w:sz w:val="18"/>
                 <w:lang w:val="en-US"/>
               </w:rPr>
-              <w:t>fn_audit_asset</w:t>
-            </w:r>
-            <w:proofErr w:type="spellEnd"/>
+              <w:br/>
+              <w:t>RETURNS TRIGGER LANGUAGE plpgsql AS $$</w:t>
+            </w:r>
             <w:r>
               <w:rPr>
                 <w:rFonts w:ascii="Courier New" w:hAnsi="Courier New"/>
@@ -6215,7 +6193,8 @@
                 <w:sz w:val="18"/>
                 <w:lang w:val="en-US"/>
               </w:rPr>
-              <w:t>()</w:t>
+              <w:br/>
+              <w:t>DECLARE</w:t>
             </w:r>
             <w:r>
               <w:rPr>
@@ -6225,9 +6204,8 @@
                 <w:lang w:val="en-US"/>
               </w:rPr>
               <w:br/>
-              <w:t xml:space="preserve">RETURNS TRIGGER LANGUAGE </w:t>
-            </w:r>
-            <w:proofErr w:type="spellStart"/>
+              <w:t xml:space="preserve">    v_utente TEXT := COALESCE(</w:t>
+            </w:r>
             <w:r>
               <w:rPr>
                 <w:rFonts w:ascii="Courier New" w:hAnsi="Courier New"/>
@@ -6235,9 +6213,9 @@
                 <w:sz w:val="18"/>
                 <w:lang w:val="en-US"/>
               </w:rPr>
-              <w:t>plpgsql</w:t>
-            </w:r>
-            <w:proofErr w:type="spellEnd"/>
+              <w:br/>
+              <w:t xml:space="preserve">        NULLIF(current_setting('nis2.utent</w:t>
+            </w:r>
             <w:r>
               <w:rPr>
                 <w:rFonts w:ascii="Courier New" w:hAnsi="Courier New"/>
@@ -6245,7 +6223,7 @@
                 <w:sz w:val="18"/>
                 <w:lang w:val="en-US"/>
               </w:rPr>
-              <w:t xml:space="preserve"> AS $$</w:t>
+              <w:t>è</w:t>
             </w:r>
             <w:r>
               <w:rPr>
@@ -6254,8 +6232,7 @@
                 <w:sz w:val="18"/>
                 <w:lang w:val="en-US"/>
               </w:rPr>
-              <w:br/>
-              <w:t>DECLARE</w:t>
+              <w:t>, TRUE), ''), current_user);</w:t>
             </w:r>
             <w:r>
               <w:rPr>
@@ -6265,9 +6242,8 @@
                 <w:lang w:val="en-US"/>
               </w:rPr>
               <w:br/>
-              <w:t xml:space="preserve">    </w:t>
-            </w:r>
-            <w:proofErr w:type="spellStart"/>
+              <w:t>BEGIN</w:t>
+            </w:r>
             <w:r>
               <w:rPr>
                 <w:rFonts w:ascii="Courier New" w:hAnsi="Courier New"/>
@@ -6275,9 +6251,9 @@
                 <w:sz w:val="18"/>
                 <w:lang w:val="en-US"/>
               </w:rPr>
-              <w:t>v_utente</w:t>
-            </w:r>
-            <w:proofErr w:type="spellEnd"/>
+              <w:br/>
+              <w:t xml:space="preserve">    IF NEW.categoria IS DISTINCT FROM OLD.categoria THEN</w:t>
+            </w:r>
             <w:r>
               <w:rPr>
                 <w:rFonts w:ascii="Courier New" w:hAnsi="Courier New"/>
@@ -6285,7 +6261,8 @@
                 <w:sz w:val="18"/>
                 <w:lang w:val="en-US"/>
               </w:rPr>
-              <w:t xml:space="preserve"> TEXT := COALESCE(</w:t>
+              <w:br/>
+              <w:t xml:space="preserve">        INSERT INTO asset_storico</w:t>
             </w:r>
             <w:r>
               <w:rPr>
@@ -6295,9 +6272,8 @@
                 <w:lang w:val="en-US"/>
               </w:rPr>
               <w:br/>
-              <w:t xml:space="preserve">        NULLIF(</w:t>
-            </w:r>
-            <w:proofErr w:type="spellStart"/>
+              <w:t xml:space="preserve">            (asset_id, campo_modificato, valore_precedente, valore_nuovo, modificato_da)</w:t>
+            </w:r>
             <w:r>
               <w:rPr>
                 <w:rFonts w:ascii="Courier New" w:hAnsi="Courier New"/>
@@ -6305,9 +6281,9 @@
                 <w:sz w:val="18"/>
                 <w:lang w:val="en-US"/>
               </w:rPr>
-              <w:t>current_setting</w:t>
-            </w:r>
-            <w:proofErr w:type="spellEnd"/>
+              <w:br/>
+              <w:t xml:space="preserve">        VALUES (OLD.id, 'categori</w:t>
+            </w:r>
             <w:r>
               <w:rPr>
                 <w:rFonts w:ascii="Courier New" w:hAnsi="Courier New"/>
@@ -6315,7 +6291,7 @@
                 <w:sz w:val="18"/>
                 <w:lang w:val="en-US"/>
               </w:rPr>
-              <w:t>('nis2.utent</w:t>
+              <w:t>a’</w:t>
             </w:r>
             <w:r>
               <w:rPr>
@@ -6324,7 +6300,7 @@
                 <w:sz w:val="18"/>
                 <w:lang w:val="en-US"/>
               </w:rPr>
-              <w:t>è</w:t>
+              <w:t>, OLD.categoria, NEW.categoria, v_utente);</w:t>
             </w:r>
             <w:r>
               <w:rPr>
@@ -6333,9 +6309,9 @@
                 <w:sz w:val="18"/>
                 <w:lang w:val="en-US"/>
               </w:rPr>
-              <w:t xml:space="preserve">, TRUE), ''), </w:t>
-            </w:r>
-            <w:proofErr w:type="spellStart"/>
+              <w:br/>
+              <w:t xml:space="preserve">    END IF;</w:t>
+            </w:r>
             <w:r>
               <w:rPr>
                 <w:rFonts w:ascii="Courier New" w:hAnsi="Courier New"/>
@@ -6343,9 +6319,9 @@
                 <w:sz w:val="18"/>
                 <w:lang w:val="en-US"/>
               </w:rPr>
-              <w:t>current_user</w:t>
-            </w:r>
-            <w:proofErr w:type="spellEnd"/>
+              <w:br/>
+              <w:t xml:space="preserve">    -- analogamente per stato, tipo_asset_cod, versione_sw, ip_address, ...</w:t>
+            </w:r>
             <w:r>
               <w:rPr>
                 <w:rFonts w:ascii="Courier New" w:hAnsi="Courier New"/>
@@ -6353,18 +6329,735 @@
                 <w:sz w:val="18"/>
                 <w:lang w:val="en-US"/>
               </w:rPr>
-              <w:t>);</w:t>
-            </w:r>
-            <w:r>
+              <w:br/>
+              <w:t xml:space="preserve">    </w:t>
+            </w:r>
+            <w:r>
+              <w:rPr>
+                <w:rFonts w:ascii="Courier New" w:hAnsi="Courier New"/>
+                <w:color w:val="1F3864"/>
+                <w:sz w:val="18"/>
+              </w:rPr>
+              <w:t>RETURN NEW;</w:t>
+            </w:r>
+            <w:r>
+              <w:rPr>
+                <w:rFonts w:ascii="Courier New" w:hAnsi="Courier New"/>
+                <w:color w:val="1F3864"/>
+                <w:sz w:val="18"/>
+              </w:rPr>
+              <w:br/>
+            </w:r>
+            <w:r>
+              <w:rPr>
+                <w:rFonts w:ascii="Courier New" w:hAnsi="Courier New"/>
+                <w:color w:val="1F3864"/>
+                <w:sz w:val="18"/>
+              </w:rPr>
+              <w:lastRenderedPageBreak/>
+              <w:t>END;</w:t>
+            </w:r>
+            <w:r>
+              <w:rPr>
+                <w:rFonts w:ascii="Courier New" w:hAnsi="Courier New"/>
+                <w:color w:val="1F3864"/>
+                <w:sz w:val="18"/>
+              </w:rPr>
+              <w:br/>
+              <w:t>$$;</w:t>
+            </w:r>
+          </w:p>
+          <w:p>
+            <w:pPr>
+              <w:spacing w:after="120"/>
+              <w:jc w:val="both"/>
+            </w:pPr>
+            <w:r>
+              <w:rPr>
+                <w:rFonts w:ascii="Times New Roman" w:hAnsi="Times New Roman"/>
+                <w:color w:val="000000"/>
+                <w:sz w:val="24"/>
+              </w:rPr>
+              <w:t xml:space="preserve">La regola che ammette un solo proprietario attivo per ciascun asset </w:t>
+            </w:r>
+            <w:r>
+              <w:rPr>
+                <w:rFonts w:ascii="Times New Roman" w:hAnsi="Times New Roman"/>
+                <w:color w:val="000000"/>
+                <w:sz w:val="24"/>
+              </w:rPr>
+              <w:t>è</w:t>
+            </w:r>
+            <w:r>
+              <w:rPr>
+                <w:rFonts w:ascii="Times New Roman" w:hAnsi="Times New Roman"/>
+                <w:color w:val="000000"/>
+                <w:sz w:val="24"/>
+              </w:rPr>
+              <w:t xml:space="preserve"> imposta da un indice univoco parziale, applicato cio</w:t>
+            </w:r>
+            <w:r>
+              <w:rPr>
+                <w:rFonts w:ascii="Times New Roman" w:hAnsi="Times New Roman"/>
+                <w:color w:val="000000"/>
+                <w:sz w:val="24"/>
+              </w:rPr>
+              <w:t>è</w:t>
+            </w:r>
+            <w:r>
+              <w:rPr>
+                <w:rFonts w:ascii="Times New Roman" w:hAnsi="Times New Roman"/>
+                <w:color w:val="000000"/>
+                <w:sz w:val="24"/>
+              </w:rPr>
+              <w:t xml:space="preserve"> soltanto alle righe che soddisfano una condizione:</w:t>
+            </w:r>
+          </w:p>
+          <w:p>
+            <w:pPr>
+              <w:spacing w:before="40" w:after="160"/>
+              <w:ind w:left="280"/>
+            </w:pPr>
+            <w:r>
+              <w:rPr>
+                <w:rFonts w:ascii="Courier New" w:hAnsi="Courier New"/>
+                <w:color w:val="1F3864"/>
+                <w:sz w:val="18"/>
+              </w:rPr>
+              <w:t>CREATE UNIQUE INDEX uq_asset_proprietario_attivo</w:t>
+            </w:r>
+            <w:r>
+              <w:rPr>
+                <w:rFonts w:ascii="Courier New" w:hAnsi="Courier New"/>
+                <w:color w:val="1F3864"/>
+                <w:sz w:val="18"/>
+              </w:rPr>
+              <w:br/>
+              <w:t xml:space="preserve">    ON responsabilita (asset_id)</w:t>
+            </w:r>
+            <w:r>
+              <w:rPr>
+                <w:rFonts w:ascii="Courier New" w:hAnsi="Courier New"/>
+                <w:color w:val="1F3864"/>
+                <w:sz w:val="18"/>
+              </w:rPr>
+              <w:br/>
+              <w:t xml:space="preserve">    WHERE tipo_responsabilita = 'proprietario'</w:t>
+            </w:r>
+            <w:r>
+              <w:rPr>
+                <w:rFonts w:ascii="Courier New" w:hAnsi="Courier New"/>
+                <w:color w:val="1F3864"/>
+                <w:sz w:val="18"/>
+              </w:rPr>
+              <w:br/>
+              <w:t xml:space="preserve">      AND data_fine IS NULL</w:t>
+            </w:r>
+            <w:r>
+              <w:rPr>
+                <w:rFonts w:ascii="Courier New" w:hAnsi="Courier New"/>
+                <w:color w:val="1F3864"/>
+                <w:sz w:val="18"/>
+              </w:rPr>
+              <w:br/>
+              <w:t xml:space="preserve">      AND asset_id IS NOT NULL;</w:t>
+            </w:r>
+          </w:p>
+          <w:p>
+            <w:pPr>
+              <w:spacing w:after="120"/>
+              <w:jc w:val="both"/>
+            </w:pPr>
+            <w:r>
+              <w:rPr>
+                <w:rFonts w:ascii="Times New Roman" w:hAnsi="Times New Roman"/>
+                <w:color w:val="000000"/>
+                <w:sz w:val="24"/>
+              </w:rPr>
+              <w:t>Il popolamento di prova avviene con istruzioni di inserimento come la seguente, relativa a un asset di tipo server dell’organizzazione del settore energetico:</w:t>
+            </w:r>
+          </w:p>
+          <w:p>
+            <w:pPr>
+              <w:spacing w:before="40" w:after="160"/>
+              <w:ind w:left="280"/>
+            </w:pPr>
+            <w:r>
+              <w:rPr>
+                <w:rFonts w:ascii="Courier New" w:hAnsi="Courier New"/>
+                <w:color w:val="1F3864"/>
+                <w:sz w:val="18"/>
+              </w:rPr>
+              <w:t>INSERT INTO asset</w:t>
+            </w:r>
+            <w:r>
+              <w:rPr>
+                <w:rFonts w:ascii="Courier New" w:hAnsi="Courier New"/>
+                <w:color w:val="1F3864"/>
+                <w:sz w:val="18"/>
+              </w:rPr>
+              <w:br/>
+              <w:t xml:space="preserve">    (id, organizzazione_id, sede_id, tipo_asset_cod, codice_inventario,</w:t>
+            </w:r>
+            <w:r>
+              <w:rPr>
+                <w:rFonts w:ascii="Courier New" w:hAnsi="Courier New"/>
+                <w:color w:val="1F3864"/>
+                <w:sz w:val="18"/>
+              </w:rPr>
+              <w:br/>
+              <w:t xml:space="preserve">     nome, categoria, stato, ip_address, versione_sw)</w:t>
+            </w:r>
+            <w:r>
+              <w:rPr>
+                <w:rFonts w:ascii="Courier New" w:hAnsi="Courier New"/>
+                <w:color w:val="1F3864"/>
+                <w:sz w:val="18"/>
+              </w:rPr>
+              <w:br/>
+              <w:t>VALUES</w:t>
+            </w:r>
+            <w:r>
+              <w:rPr>
+                <w:rFonts w:ascii="Courier New" w:hAnsi="Courier New"/>
+                <w:color w:val="1F3864"/>
+                <w:sz w:val="18"/>
+              </w:rPr>
+              <w:br/>
+              <w:t xml:space="preserve">    (1, 1, 2, 'SERVER_FISICO', 'INV-AE-001',</w:t>
+            </w:r>
+            <w:r>
+              <w:rPr>
+                <w:rFonts w:ascii="Courier New" w:hAnsi="Courier New"/>
+                <w:color w:val="1F3864"/>
+                <w:sz w:val="18"/>
+              </w:rPr>
+              <w:br/>
+              <w:t xml:space="preserve">     'SCADA Server Primario', 'critico', 'attivo', '10.0.1.10', 'SCADA 6.2.1');</w:t>
+            </w:r>
+          </w:p>
+          <w:p>
+            <w:pPr>
+              <w:spacing w:after="120"/>
+              <w:jc w:val="both"/>
+            </w:pPr>
+            <w:r>
+              <w:rPr>
+                <w:rFonts w:ascii="Times New Roman" w:hAnsi="Times New Roman"/>
+                <w:color w:val="000000"/>
+                <w:sz w:val="24"/>
+              </w:rPr>
+              <w:t>Infine, le interrogazioni di estrazione non si limitano a leggere i dati, ma li elaborano per produrre informazioni derivate. Nell’estratto seguente lo stato del contratto viene calcolato al momento dell’esecuzione confrontando la data di scadenza con la data corrente:</w:t>
+            </w:r>
+          </w:p>
+          <w:p>
+            <w:pPr>
+              <w:spacing w:before="40" w:after="160"/>
+              <w:ind w:left="280"/>
+            </w:pPr>
+            <w:r>
+              <w:rPr>
+                <w:rFonts w:ascii="Courier New" w:hAnsi="Courier New"/>
+                <w:color w:val="1F3864"/>
+                <w:sz w:val="18"/>
+              </w:rPr>
+              <w:t>SELECT COALESCE(a.nome, sv.nome) AS risorsa,</w:t>
+            </w:r>
+            <w:r>
+              <w:rPr>
+                <w:rFonts w:ascii="Courier New" w:hAnsi="Courier New"/>
+                <w:color w:val="1F3864"/>
+                <w:sz w:val="18"/>
+              </w:rPr>
+              <w:br/>
+              <w:t xml:space="preserve">       f.nome AS fornitore,</w:t>
+            </w:r>
+            <w:r>
+              <w:rPr>
+                <w:rFonts w:ascii="Courier New" w:hAnsi="Courier New"/>
+                <w:color w:val="1F3864"/>
+                <w:sz w:val="18"/>
+              </w:rPr>
+              <w:br/>
+              <w:t xml:space="preserve">       CASE WHEN c.data_scadenza &lt; CURRENT_DATE THEN 'SCADUTO'</w:t>
+            </w:r>
+            <w:r>
+              <w:rPr>
+                <w:rFonts w:ascii="Courier New" w:hAnsi="Courier New"/>
+                <w:color w:val="1F3864"/>
+                <w:sz w:val="18"/>
+              </w:rPr>
+              <w:br/>
+              <w:t xml:space="preserve">            WHEN c.data_scadenza &lt;= CURRENT_DATE + INTERVAL '90 days'</w:t>
+            </w:r>
+            <w:r>
+              <w:rPr>
+                <w:rFonts w:ascii="Courier New" w:hAnsi="Courier New"/>
+                <w:color w:val="1F3864"/>
+                <w:sz w:val="18"/>
+              </w:rPr>
+              <w:br/>
+              <w:t xml:space="preserve">                 THEN 'In scadenz</w:t>
+            </w:r>
+            <w:r>
+              <w:rPr>
+                <w:rFonts w:ascii="Courier New" w:hAnsi="Courier New"/>
+                <w:color w:val="1F3864"/>
+                <w:sz w:val="18"/>
+              </w:rPr>
+              <w:t>à</w:t>
+            </w:r>
+            <w:r>
+              <w:rPr>
+                <w:rFonts w:ascii="Courier New" w:hAnsi="Courier New"/>
+                <w:color w:val="1F3864"/>
+                <w:sz w:val="18"/>
+              </w:rPr>
+              <w:br/>
+              <w:t xml:space="preserve">            ELSE 'Valido' END AS stato_contratto</w:t>
+            </w:r>
+            <w:r>
+              <w:rPr>
+                <w:rFonts w:ascii="Courier New" w:hAnsi="Courier New"/>
+                <w:color w:val="1F3864"/>
+                <w:sz w:val="18"/>
+              </w:rPr>
+              <w:br/>
+              <w:t>FROM dipendenza d</w:t>
+            </w:r>
+            <w:r>
+              <w:rPr>
+                <w:rFonts w:ascii="Courier New" w:hAnsi="Courier New"/>
+                <w:color w:val="1F3864"/>
+                <w:sz w:val="18"/>
+              </w:rPr>
+              <w:br/>
+              <w:t>JOIN fornitore f  ON f.id = d.fornitore_id</w:t>
+            </w:r>
+            <w:r>
+              <w:rPr>
+                <w:rFonts w:ascii="Courier New" w:hAnsi="Courier New"/>
+                <w:color w:val="1F3864"/>
+                <w:sz w:val="18"/>
+              </w:rPr>
+              <w:br/>
+              <w:t>LEFT JOIN contratto c ON c.id = d.contratto_id</w:t>
+            </w:r>
+            <w:r>
+              <w:rPr>
+                <w:rFonts w:ascii="Courier New" w:hAnsi="Courier New"/>
+                <w:color w:val="1F3864"/>
+                <w:sz w:val="18"/>
+              </w:rPr>
+              <w:br/>
+              <w:t>WHERE d.organizzazione_id = 1 AND d.data_fine IS NULL;</w:t>
+            </w:r>
+          </w:p>
+          <w:p>
+            <w:pPr>
+              <w:spacing w:after="120"/>
+              <w:jc w:val="both"/>
+            </w:pPr>
+            <w:r>
+              <w:rPr>
+                <w:rFonts w:ascii="Times New Roman" w:hAnsi="Times New Roman"/>
+                <w:color w:val="000000"/>
+                <w:sz w:val="24"/>
+              </w:rPr>
+              <w:t>Questi estratti, pur nella loro sinteticit</w:t>
+            </w:r>
+            <w:r>
+              <w:rPr>
+                <w:rFonts w:ascii="Times New Roman" w:hAnsi="Times New Roman"/>
+                <w:color w:val="000000"/>
+                <w:sz w:val="24"/>
+              </w:rPr>
+              <w:t>à</w:t>
+            </w:r>
+            <w:r>
+              <w:rPr>
+                <w:rFonts w:ascii="Times New Roman" w:hAnsi="Times New Roman"/>
+                <w:color w:val="000000"/>
+                <w:sz w:val="24"/>
+              </w:rPr>
+              <w:t>, testimoniano l’uso coordinato dei principali strumenti offerti dal sistema di gestione: vincoli dichiarativi per l’integrit</w:t>
+            </w:r>
+            <w:r>
+              <w:rPr>
+                <w:rFonts w:ascii="Times New Roman" w:hAnsi="Times New Roman"/>
+                <w:color w:val="000000"/>
+                <w:sz w:val="24"/>
+              </w:rPr>
+              <w:t>à</w:t>
+            </w:r>
+            <w:r>
+              <w:rPr>
+                <w:rFonts w:ascii="Times New Roman" w:hAnsi="Times New Roman"/>
+                <w:color w:val="000000"/>
+                <w:sz w:val="24"/>
+              </w:rPr>
+              <w:t>, trigger per l’automazione dell’audit, indici per le prestazioni e l’integrit</w:t>
+            </w:r>
+            <w:r>
+              <w:rPr>
+                <w:rFonts w:ascii="Times New Roman" w:hAnsi="Times New Roman"/>
+                <w:color w:val="000000"/>
+                <w:sz w:val="24"/>
+              </w:rPr>
+              <w:t>à</w:t>
+            </w:r>
+            <w:r>
+              <w:rPr>
+                <w:rFonts w:ascii="Times New Roman" w:hAnsi="Times New Roman"/>
+                <w:color w:val="000000"/>
+                <w:sz w:val="24"/>
+              </w:rPr>
+              <w:t>, e interrogazioni evolute per la generazione del profilo.</w:t>
+            </w:r>
+          </w:p>
+          <w:p>
+            <w:pPr>
+              <w:spacing w:after="120"/>
+              <w:jc w:val="both"/>
+            </w:pPr>
+            <w:r>
+              <w:rPr>
+                <w:rFonts w:ascii="Times New Roman" w:hAnsi="Times New Roman"/>
+                <w:color w:val="000000"/>
+                <w:sz w:val="24"/>
+              </w:rPr>
+              <w:t>Merita un approfondimento il tema dei compromessi progettuali (trade-off). Ogni scelta di modellazione comporta un bilanciamento tra obiettivi in tensione tra loro, quali la purezza formale dello schema, l’efficienza delle interrogazioni e la semplicit</w:t>
+            </w:r>
+            <w:r>
+              <w:rPr>
+                <w:rFonts w:ascii="Times New Roman" w:hAnsi="Times New Roman"/>
+                <w:color w:val="000000"/>
+                <w:sz w:val="24"/>
+              </w:rPr>
+              <w:t>à</w:t>
+            </w:r>
+            <w:r>
+              <w:rPr>
+                <w:rFonts w:ascii="Times New Roman" w:hAnsi="Times New Roman"/>
+                <w:color w:val="000000"/>
+                <w:sz w:val="24"/>
+              </w:rPr>
+              <w:t xml:space="preserve"> d’uso. Nel presente elaborato sono state adottate, in modo consapevole e documentato, alcune soluzioni che si discostano dalla forma normale </w:t>
+            </w:r>
+            <w:r>
+              <w:rPr>
+                <w:rFonts w:ascii="Times New Roman" w:hAnsi="Times New Roman"/>
+                <w:color w:val="000000"/>
+                <w:sz w:val="24"/>
+              </w:rPr>
+              <w:t>più</w:t>
+            </w:r>
+            <w:r>
+              <w:rPr>
+                <w:rFonts w:ascii="Times New Roman" w:hAnsi="Times New Roman"/>
+                <w:color w:val="000000"/>
+                <w:sz w:val="24"/>
+              </w:rPr>
+              <w:t xml:space="preserve"> restrittiva, ciascuna motivata da un vantaggio concreto.</w:t>
+            </w:r>
+          </w:p>
+          <w:p>
+            <w:pPr>
+              <w:spacing w:after="120"/>
+              <w:jc w:val="both"/>
+            </w:pPr>
+            <w:r>
+              <w:rPr>
+                <w:rFonts w:ascii="Times New Roman" w:hAnsi="Times New Roman"/>
+                <w:color w:val="000000"/>
+                <w:sz w:val="24"/>
+              </w:rPr>
+              <w:t>La prima riguarda la presenza dell’identificatore dell’organizzazione anche in tabelle che vi sono gi</w:t>
+            </w:r>
+            <w:r>
+              <w:rPr>
+                <w:rFonts w:ascii="Times New Roman" w:hAnsi="Times New Roman"/>
+                <w:color w:val="000000"/>
+                <w:sz w:val="24"/>
+              </w:rPr>
+              <w:t>à</w:t>
+            </w:r>
+            <w:r>
+              <w:rPr>
+                <w:rFonts w:ascii="Times New Roman" w:hAnsi="Times New Roman"/>
+                <w:color w:val="000000"/>
+                <w:sz w:val="24"/>
+              </w:rPr>
+              <w:t xml:space="preserve"> collegate in modo indiretto, come quella delle dipendenze: si tratta di una ridondanza controllata che, a fronte di una minima duplicazione del dato, consente di estrarre il profilo di una singola organizzazione senza attraversare lunghe catene di join, con beneficio in termini di prestazioni e di leggibilit</w:t>
+            </w:r>
+            <w:r>
+              <w:rPr>
+                <w:rFonts w:ascii="Times New Roman" w:hAnsi="Times New Roman"/>
+                <w:color w:val="000000"/>
+                <w:sz w:val="24"/>
+              </w:rPr>
+              <w:t>à</w:t>
+            </w:r>
+            <w:r>
+              <w:rPr>
+                <w:rFonts w:ascii="Times New Roman" w:hAnsi="Times New Roman"/>
+                <w:color w:val="000000"/>
+                <w:sz w:val="24"/>
+              </w:rPr>
+              <w:t xml:space="preserve"> delle interrogazioni. La seconda riguarda la conservazione, sulle tabelle principali, di un campo di ultimo aggiornamento che sarebbe in linea di principio ricavabile dallo storico, ma che viene mantenuto per semplicit</w:t>
+            </w:r>
+            <w:r>
+              <w:rPr>
+                <w:rFonts w:ascii="Times New Roman" w:hAnsi="Times New Roman"/>
+                <w:color w:val="000000"/>
+                <w:sz w:val="24"/>
+              </w:rPr>
+              <w:t>à</w:t>
+            </w:r>
+            <w:r>
+              <w:rPr>
+                <w:rFonts w:ascii="Times New Roman" w:hAnsi="Times New Roman"/>
+                <w:color w:val="000000"/>
+                <w:sz w:val="24"/>
+              </w:rPr>
+              <w:t xml:space="preserve"> di accesso. Un ulteriore compromesso </w:t>
+            </w:r>
+            <w:r>
+              <w:rPr>
+                <w:rFonts w:ascii="Times New Roman" w:hAnsi="Times New Roman"/>
+                <w:color w:val="000000"/>
+                <w:sz w:val="24"/>
+              </w:rPr>
+              <w:t>è</w:t>
+            </w:r>
+            <w:r>
+              <w:rPr>
+                <w:rFonts w:ascii="Times New Roman" w:hAnsi="Times New Roman"/>
+                <w:color w:val="000000"/>
+                <w:sz w:val="24"/>
+              </w:rPr>
+              <w:t xml:space="preserve"> rappresentato dalla scelta di modellare le chiavi esterne facoltative verso asset e servizio con un vincolo di controllo, in luogo di soluzioni basate sull’ereditariet</w:t>
+            </w:r>
+            <w:r>
+              <w:rPr>
+                <w:rFonts w:ascii="Times New Roman" w:hAnsi="Times New Roman"/>
+                <w:color w:val="000000"/>
+                <w:sz w:val="24"/>
+              </w:rPr>
+              <w:t>à</w:t>
+            </w:r>
+            <w:r>
+              <w:rPr>
+                <w:rFonts w:ascii="Times New Roman" w:hAnsi="Times New Roman"/>
+                <w:color w:val="000000"/>
+                <w:sz w:val="24"/>
+              </w:rPr>
+              <w:t xml:space="preserve"> o su tabelle distinte: la soluzione adottata privilegia la compattezza e la chiarezza dello schema. Analogamente, la cancellazione </w:t>
+            </w:r>
+            <w:r>
+              <w:rPr>
+                <w:rFonts w:ascii="Times New Roman" w:hAnsi="Times New Roman"/>
+                <w:color w:val="000000"/>
+                <w:sz w:val="24"/>
+              </w:rPr>
+              <w:lastRenderedPageBreak/>
+              <w:t>logica degli asset antepone la conservazione della storicit</w:t>
+            </w:r>
+            <w:r>
+              <w:rPr>
+                <w:rFonts w:ascii="Times New Roman" w:hAnsi="Times New Roman"/>
+                <w:color w:val="000000"/>
+                <w:sz w:val="24"/>
+              </w:rPr>
+              <w:t>à</w:t>
+            </w:r>
+            <w:r>
+              <w:rPr>
+                <w:rFonts w:ascii="Times New Roman" w:hAnsi="Times New Roman"/>
+                <w:color w:val="000000"/>
+                <w:sz w:val="24"/>
+              </w:rPr>
+              <w:t xml:space="preserve"> alla minimizzazione dello spazio occupato. In tutti i casi, la ridondanza introdotta </w:t>
+            </w:r>
+            <w:r>
+              <w:rPr>
+                <w:rFonts w:ascii="Times New Roman" w:hAnsi="Times New Roman"/>
+                <w:color w:val="000000"/>
+                <w:sz w:val="24"/>
+              </w:rPr>
+              <w:t>è</w:t>
+            </w:r>
+            <w:r>
+              <w:rPr>
+                <w:rFonts w:ascii="Times New Roman" w:hAnsi="Times New Roman"/>
+                <w:color w:val="000000"/>
+                <w:sz w:val="24"/>
+              </w:rPr>
+              <w:t xml:space="preserve"> controllata e non compromette la coerenza complessiva dei dati.</w:t>
+            </w:r>
+          </w:p>
+          <w:p>
+            <w:pPr>
+              <w:spacing w:after="120"/>
+              <w:jc w:val="both"/>
+            </w:pPr>
+            <w:r>
+              <w:rPr>
+                <w:rFonts w:ascii="Times New Roman" w:hAnsi="Times New Roman"/>
+                <w:color w:val="000000"/>
+                <w:sz w:val="24"/>
+              </w:rPr>
+              <w:t>A completamento della documentazione sono state definite alcune linee guida per il popolamento e la manutenzione dei dati. In fase di inserimento si raccomanda di rispettare l’ordine di caricamento imposto dalle dipendenze referenziali, popolando dapprima le entit</w:t>
+            </w:r>
+            <w:r>
+              <w:rPr>
+                <w:rFonts w:ascii="Times New Roman" w:hAnsi="Times New Roman"/>
+                <w:color w:val="000000"/>
+                <w:sz w:val="24"/>
+              </w:rPr>
+              <w:t>à</w:t>
+            </w:r>
+            <w:r>
+              <w:rPr>
+                <w:rFonts w:ascii="Times New Roman" w:hAnsi="Times New Roman"/>
+                <w:color w:val="000000"/>
+                <w:sz w:val="24"/>
+              </w:rPr>
+              <w:t xml:space="preserve"> principali e successivamente le tabelle associative; di valorizzare sempre i campi che classificano gli asset e i servizi per criticit</w:t>
+            </w:r>
+            <w:r>
+              <w:rPr>
+                <w:rFonts w:ascii="Times New Roman" w:hAnsi="Times New Roman"/>
+                <w:color w:val="000000"/>
+                <w:sz w:val="24"/>
+              </w:rPr>
+              <w:t>à</w:t>
+            </w:r>
+            <w:r>
+              <w:rPr>
+                <w:rFonts w:ascii="Times New Roman" w:hAnsi="Times New Roman"/>
+                <w:color w:val="000000"/>
+                <w:sz w:val="24"/>
+              </w:rPr>
+              <w:t>, essenziali ai fini delle estrazioni; e di impostare la variabile di sessione che identifica l’autore delle modifiche, cosi’ da alimentare correttamente il registro di audit. In fase di manutenzione, la cancellazione logica va preferita a quella fisica, le associazioni terminate vanno chiuse valorizzandone la data di fine anzich</w:t>
+            </w:r>
+            <w:r>
+              <w:rPr>
+                <w:rFonts w:ascii="Times New Roman" w:hAnsi="Times New Roman"/>
+                <w:color w:val="000000"/>
+                <w:sz w:val="24"/>
+              </w:rPr>
+              <w:t>è</w:t>
+            </w:r>
+            <w:r>
+              <w:rPr>
+                <w:rFonts w:ascii="Times New Roman" w:hAnsi="Times New Roman"/>
+                <w:color w:val="000000"/>
+                <w:sz w:val="24"/>
+              </w:rPr>
+              <w:t xml:space="preserve"> eliminandole, e ogni nuova versione del profilo va tracciata nell’apposita tabella.</w:t>
+            </w:r>
+          </w:p>
+          <w:p>
+            <w:pPr>
+              <w:spacing w:after="120"/>
+              <w:jc w:val="both"/>
+            </w:pPr>
+            <w:r>
+              <w:rPr>
+                <w:rFonts w:ascii="Times New Roman" w:hAnsi="Times New Roman"/>
+                <w:color w:val="000000"/>
+                <w:sz w:val="24"/>
+              </w:rPr>
+              <w:t>L’elaborato comprende le</w:t>
+            </w:r>
+            <w:r>
+              <w:rPr>
+                <w:rFonts w:ascii="Times New Roman" w:hAnsi="Times New Roman"/>
+                <w:color w:val="000000"/>
+                <w:sz w:val="24"/>
+              </w:rPr>
+              <w:t xml:space="preserve"> istruzioni di installazione precise, che ne consentono la messa in esercizio in un ambiente pulito. I prerequisiti sono un’installazione di PostgreSQL in versione 14 o superiore, un database dedicato, un utente con privilegi sufficienti a eseguire istruzioni di definizione dei dati e la disponibilit</w:t>
+            </w:r>
+            <w:r>
+              <w:rPr>
+                <w:rFonts w:ascii="Times New Roman" w:hAnsi="Times New Roman"/>
+                <w:color w:val="000000"/>
+                <w:sz w:val="24"/>
+              </w:rPr>
+              <w:t>à</w:t>
+            </w:r>
+            <w:r>
+              <w:rPr>
+                <w:rFonts w:ascii="Times New Roman" w:hAnsi="Times New Roman"/>
+                <w:color w:val="000000"/>
+                <w:sz w:val="24"/>
+              </w:rPr>
+              <w:t xml:space="preserve"> del client a riga di comando. L’installazione si articola in pochi passi, da eseguire nell’ordine indicato</w:t>
+            </w:r>
+            <w:r>
+              <w:rPr>
+                <w:rFonts w:ascii="Times New Roman" w:hAnsi="Times New Roman"/>
+                <w:color w:val="000000"/>
+                <w:sz w:val="24"/>
+              </w:rPr>
+              <w:t xml:space="preserve"> tramite Windows Powershell</w:t>
+            </w:r>
+            <w:r>
+              <w:rPr>
+                <w:rFonts w:ascii="Times New Roman" w:hAnsi="Times New Roman"/>
+                <w:color w:val="000000"/>
+                <w:sz w:val="24"/>
+              </w:rPr>
+              <w:t>:</w:t>
+            </w:r>
+          </w:p>
+          <w:p>
+            <w:pPr>
+              <w:spacing w:before="40" w:after="160"/>
+              <w:ind w:left="280"/>
+              <w:rPr>
+                <w:rFonts w:ascii="Courier New" w:hAnsi="Courier New"/>
+                <w:color w:val="1F3864"/>
+                <w:sz w:val="18"/>
+              </w:rPr>
+            </w:pPr>
+            <w:r>
+              <w:rPr>
+                <w:rFonts w:ascii="Courier New" w:hAnsi="Courier New"/>
+                <w:color w:val="1F3864"/>
+                <w:sz w:val="18"/>
+              </w:rPr>
+              <w:t>Iniziali</w:t>
+            </w:r>
+            <w:r>
+              <w:rPr>
+                <w:rFonts w:ascii="Courier New" w:hAnsi="Courier New"/>
+                <w:color w:val="1F3864"/>
+                <w:sz w:val="18"/>
+              </w:rPr>
+              <w:t>zzazione</w:t>
+            </w:r>
+            <w:r>
+              <w:rPr>
+                <w:rFonts w:ascii="Courier New" w:hAnsi="Courier New"/>
+                <w:color w:val="1F3864"/>
+                <w:sz w:val="18"/>
+              </w:rPr>
+              <w:t xml:space="preserve"> db:</w:t>
+            </w:r>
+          </w:p>
+          <w:p>
+            <w:pPr>
+              <w:spacing w:before="40" w:after="160"/>
+              <w:ind w:left="280"/>
               <w:rPr>
                 <w:rFonts w:ascii="Courier New" w:hAnsi="Courier New"/>
                 <w:color w:val="1F3864"/>
                 <w:sz w:val="18"/>
                 <w:lang w:val="en-US"/>
               </w:rPr>
-              <w:br/>
-              <w:t>BEGIN</w:t>
-            </w:r>
+            </w:pPr>
             <w:r>
               <w:rPr>
                 <w:rFonts w:ascii="Courier New" w:hAnsi="Courier New"/>
@@ -6372,20 +7065,20 @@
                 <w:sz w:val="18"/>
                 <w:lang w:val="en-US"/>
               </w:rPr>
-              <w:br/>
-              <w:t xml:space="preserve">    IF </w:t>
-            </w:r>
-            <w:proofErr w:type="spellStart"/>
-            <w:r>
+              <w:t>&amp; "C:\Program Files\PostgreSQL\18\bin\createdb.exe" -U postgres nis2db</w:t>
+            </w:r>
+          </w:p>
+          <w:p>
+            <w:pPr>
+              <w:spacing w:before="40" w:after="160"/>
+              <w:ind w:left="280"/>
               <w:rPr>
                 <w:rFonts w:ascii="Courier New" w:hAnsi="Courier New"/>
                 <w:color w:val="1F3864"/>
                 <w:sz w:val="18"/>
                 <w:lang w:val="en-US"/>
               </w:rPr>
-              <w:t>NEW.categoria</w:t>
-            </w:r>
-            <w:proofErr w:type="spellEnd"/>
+            </w:pPr>
             <w:r>
               <w:rPr>
                 <w:rFonts w:ascii="Courier New" w:hAnsi="Courier New"/>
@@ -6393,19 +7086,20 @@
                 <w:sz w:val="18"/>
                 <w:lang w:val="en-US"/>
               </w:rPr>
-              <w:t xml:space="preserve"> IS DISTINCT FROM </w:t>
-            </w:r>
-            <w:proofErr w:type="spellStart"/>
-            <w:r>
+              <w:t>Creazione schema dati db:</w:t>
+            </w:r>
+          </w:p>
+          <w:p>
+            <w:pPr>
+              <w:spacing w:before="40" w:after="160"/>
+              <w:ind w:left="280"/>
               <w:rPr>
                 <w:rFonts w:ascii="Courier New" w:hAnsi="Courier New"/>
                 <w:color w:val="1F3864"/>
                 <w:sz w:val="18"/>
                 <w:lang w:val="en-US"/>
               </w:rPr>
-              <w:t>OLD.categoria</w:t>
-            </w:r>
-            <w:proofErr w:type="spellEnd"/>
+            </w:pPr>
             <w:r>
               <w:rPr>
                 <w:rFonts w:ascii="Courier New" w:hAnsi="Courier New"/>
@@ -6413,19 +7107,20 @@
                 <w:sz w:val="18"/>
                 <w:lang w:val="en-US"/>
               </w:rPr>
-              <w:t xml:space="preserve"> THEN</w:t>
-            </w:r>
-            <w:r>
+              <w:t>&amp; "C:\Program Files\PostgreSQL\18\bin\psql.exe" -U postgres -d nis2db -f nis2_schema.sql</w:t>
+            </w:r>
+          </w:p>
+          <w:p>
+            <w:pPr>
+              <w:spacing w:before="40" w:after="160"/>
+              <w:ind w:left="280"/>
               <w:rPr>
                 <w:rFonts w:ascii="Courier New" w:hAnsi="Courier New"/>
                 <w:color w:val="1F3864"/>
                 <w:sz w:val="18"/>
                 <w:lang w:val="en-US"/>
               </w:rPr>
-              <w:br/>
-              <w:t xml:space="preserve">        INSERT INTO </w:t>
-            </w:r>
-            <w:proofErr w:type="spellStart"/>
+            </w:pPr>
             <w:r>
               <w:rPr>
                 <w:rFonts w:ascii="Courier New" w:hAnsi="Courier New"/>
@@ -6433,20 +7128,20 @@
                 <w:sz w:val="18"/>
                 <w:lang w:val="en-US"/>
               </w:rPr>
-              <w:t>asset_storico</w:t>
-            </w:r>
-            <w:proofErr w:type="spellEnd"/>
-            <w:r>
+              <w:t>Popolazione db:</w:t>
+            </w:r>
+          </w:p>
+          <w:p>
+            <w:pPr>
+              <w:spacing w:before="40" w:after="160"/>
+              <w:ind w:left="280"/>
               <w:rPr>
                 <w:rFonts w:ascii="Courier New" w:hAnsi="Courier New"/>
                 <w:color w:val="1F3864"/>
                 <w:sz w:val="18"/>
                 <w:lang w:val="en-US"/>
               </w:rPr>
-              <w:br/>
-              <w:t xml:space="preserve">            (</w:t>
-            </w:r>
-            <w:proofErr w:type="spellStart"/>
+            </w:pPr>
             <w:r>
               <w:rPr>
                 <w:rFonts w:ascii="Courier New" w:hAnsi="Courier New"/>
@@ -6454,19 +7149,39 @@
                 <w:sz w:val="18"/>
                 <w:lang w:val="en-US"/>
               </w:rPr>
-              <w:t>asset_id</w:t>
-            </w:r>
-            <w:proofErr w:type="spellEnd"/>
-            <w:r>
+              <w:t>&amp; "C:\Program Files\PostgreSQL\18\bin\psql.exe" -U postgres -d nis2db -f nis2_testdata.sql</w:t>
+            </w:r>
+          </w:p>
+          <w:p>
+            <w:pPr>
+              <w:spacing w:before="40" w:after="160"/>
+              <w:ind w:left="280"/>
+              <w:rPr>
+                <w:rFonts w:ascii="Courier New" w:hAnsi="Courier New"/>
+                <w:color w:val="1F3864"/>
+                <w:sz w:val="18"/>
+              </w:rPr>
+            </w:pPr>
+            <w:r>
+              <w:rPr>
+                <w:rFonts w:ascii="Courier New" w:hAnsi="Courier New"/>
+                <w:color w:val="1F3864"/>
+                <w:sz w:val="18"/>
+              </w:rPr>
+              <w:t>Export dati db in csv (eseguire da cartella "csv", versione con separatore ','):</w:t>
+            </w:r>
+          </w:p>
+          <w:p>
+            <w:pPr>
+              <w:spacing w:after="120"/>
+              <w:jc w:val="both"/>
               <w:rPr>
                 <w:rFonts w:ascii="Courier New" w:hAnsi="Courier New"/>
                 <w:color w:val="1F3864"/>
                 <w:sz w:val="18"/>
                 <w:lang w:val="en-US"/>
               </w:rPr>
-              <w:t xml:space="preserve">, </w:t>
-            </w:r>
-            <w:proofErr w:type="spellStart"/>
+            </w:pPr>
             <w:r>
               <w:rPr>
                 <w:rFonts w:ascii="Courier New" w:hAnsi="Courier New"/>
@@ -6474,9 +7189,8 @@
                 <w:sz w:val="18"/>
                 <w:lang w:val="en-US"/>
               </w:rPr>
-              <w:t>campo_modificato</w:t>
-            </w:r>
-            <w:proofErr w:type="spellEnd"/>
+              <w:t xml:space="preserve"> </w:t>
+            </w:r>
             <w:r>
               <w:rPr>
                 <w:rFonts w:ascii="Courier New" w:hAnsi="Courier New"/>
@@ -6484,9 +7198,8 @@
                 <w:sz w:val="18"/>
                 <w:lang w:val="en-US"/>
               </w:rPr>
-              <w:t xml:space="preserve">, </w:t>
-            </w:r>
-            <w:proofErr w:type="spellStart"/>
+              <w:t xml:space="preserve"> </w:t>
+            </w:r>
             <w:r>
               <w:rPr>
                 <w:rFonts w:ascii="Courier New" w:hAnsi="Courier New"/>
@@ -6494,329 +7207,178 @@
                 <w:sz w:val="18"/>
                 <w:lang w:val="en-US"/>
               </w:rPr>
-              <w:t>valore_precedente</w:t>
-            </w:r>
-            <w:proofErr w:type="spellEnd"/>
-            <w:r>
-              <w:rPr>
-                <w:rFonts w:ascii="Courier New" w:hAnsi="Courier New"/>
-                <w:color w:val="1F3864"/>
-                <w:sz w:val="18"/>
-                <w:lang w:val="en-US"/>
-              </w:rPr>
-              <w:t xml:space="preserve">, </w:t>
-            </w:r>
-            <w:proofErr w:type="spellStart"/>
-            <w:r>
-              <w:rPr>
-                <w:rFonts w:ascii="Courier New" w:hAnsi="Courier New"/>
-                <w:color w:val="1F3864"/>
-                <w:sz w:val="18"/>
-                <w:lang w:val="en-US"/>
-              </w:rPr>
-              <w:t>valore_nuovo</w:t>
-            </w:r>
-            <w:proofErr w:type="spellEnd"/>
-            <w:r>
-              <w:rPr>
-                <w:rFonts w:ascii="Courier New" w:hAnsi="Courier New"/>
-                <w:color w:val="1F3864"/>
-                <w:sz w:val="18"/>
-                <w:lang w:val="en-US"/>
-              </w:rPr>
-              <w:t xml:space="preserve">, </w:t>
-            </w:r>
-            <w:proofErr w:type="spellStart"/>
-            <w:r>
-              <w:rPr>
-                <w:rFonts w:ascii="Courier New" w:hAnsi="Courier New"/>
-                <w:color w:val="1F3864"/>
-                <w:sz w:val="18"/>
-                <w:lang w:val="en-US"/>
-              </w:rPr>
-              <w:t>modificato_da</w:t>
-            </w:r>
-            <w:proofErr w:type="spellEnd"/>
-            <w:r>
-              <w:rPr>
-                <w:rFonts w:ascii="Courier New" w:hAnsi="Courier New"/>
-                <w:color w:val="1F3864"/>
-                <w:sz w:val="18"/>
-                <w:lang w:val="en-US"/>
-              </w:rPr>
-              <w:t>)</w:t>
-            </w:r>
-            <w:r>
-              <w:rPr>
-                <w:rFonts w:ascii="Courier New" w:hAnsi="Courier New"/>
-                <w:color w:val="1F3864"/>
-                <w:sz w:val="18"/>
-                <w:lang w:val="en-US"/>
-              </w:rPr>
-              <w:br/>
-              <w:t xml:space="preserve">        VALUES (OLD.id, '</w:t>
-            </w:r>
-            <w:proofErr w:type="spellStart"/>
-            <w:r>
-              <w:rPr>
-                <w:rFonts w:ascii="Courier New" w:hAnsi="Courier New"/>
-                <w:color w:val="1F3864"/>
-                <w:sz w:val="18"/>
-                <w:lang w:val="en-US"/>
-              </w:rPr>
-              <w:t>categori</w:t>
-            </w:r>
-            <w:r>
-              <w:rPr>
-                <w:rFonts w:ascii="Courier New" w:hAnsi="Courier New"/>
-                <w:color w:val="1F3864"/>
-                <w:sz w:val="18"/>
-                <w:lang w:val="en-US"/>
-              </w:rPr>
-              <w:t>a</w:t>
-            </w:r>
-            <w:proofErr w:type="spellEnd"/>
-            <w:r>
-              <w:rPr>
-                <w:rFonts w:ascii="Courier New" w:hAnsi="Courier New"/>
-                <w:color w:val="1F3864"/>
-                <w:sz w:val="18"/>
-                <w:lang w:val="en-US"/>
-              </w:rPr>
-              <w:t>’</w:t>
-            </w:r>
-            <w:r>
-              <w:rPr>
-                <w:rFonts w:ascii="Courier New" w:hAnsi="Courier New"/>
-                <w:color w:val="1F3864"/>
-                <w:sz w:val="18"/>
-                <w:lang w:val="en-US"/>
-              </w:rPr>
-              <w:t xml:space="preserve">, </w:t>
-            </w:r>
-            <w:proofErr w:type="spellStart"/>
-            <w:r>
-              <w:rPr>
-                <w:rFonts w:ascii="Courier New" w:hAnsi="Courier New"/>
-                <w:color w:val="1F3864"/>
-                <w:sz w:val="18"/>
-                <w:lang w:val="en-US"/>
-              </w:rPr>
-              <w:t>OLD.categoria</w:t>
-            </w:r>
-            <w:proofErr w:type="spellEnd"/>
-            <w:r>
-              <w:rPr>
-                <w:rFonts w:ascii="Courier New" w:hAnsi="Courier New"/>
-                <w:color w:val="1F3864"/>
-                <w:sz w:val="18"/>
-                <w:lang w:val="en-US"/>
-              </w:rPr>
-              <w:t xml:space="preserve">, </w:t>
-            </w:r>
-            <w:proofErr w:type="spellStart"/>
-            <w:r>
-              <w:rPr>
-                <w:rFonts w:ascii="Courier New" w:hAnsi="Courier New"/>
-                <w:color w:val="1F3864"/>
-                <w:sz w:val="18"/>
-                <w:lang w:val="en-US"/>
-              </w:rPr>
-              <w:t>NEW.categoria</w:t>
-            </w:r>
-            <w:proofErr w:type="spellEnd"/>
-            <w:r>
-              <w:rPr>
-                <w:rFonts w:ascii="Courier New" w:hAnsi="Courier New"/>
-                <w:color w:val="1F3864"/>
-                <w:sz w:val="18"/>
-                <w:lang w:val="en-US"/>
-              </w:rPr>
-              <w:t xml:space="preserve">, </w:t>
-            </w:r>
-            <w:proofErr w:type="spellStart"/>
-            <w:r>
-              <w:rPr>
-                <w:rFonts w:ascii="Courier New" w:hAnsi="Courier New"/>
-                <w:color w:val="1F3864"/>
-                <w:sz w:val="18"/>
-                <w:lang w:val="en-US"/>
-              </w:rPr>
-              <w:t>v_utente</w:t>
-            </w:r>
-            <w:proofErr w:type="spellEnd"/>
-            <w:r>
-              <w:rPr>
-                <w:rFonts w:ascii="Courier New" w:hAnsi="Courier New"/>
-                <w:color w:val="1F3864"/>
-                <w:sz w:val="18"/>
-                <w:lang w:val="en-US"/>
-              </w:rPr>
-              <w:t>);</w:t>
-            </w:r>
-            <w:r>
-              <w:rPr>
-                <w:rFonts w:ascii="Courier New" w:hAnsi="Courier New"/>
-                <w:color w:val="1F3864"/>
-                <w:sz w:val="18"/>
-                <w:lang w:val="en-US"/>
-              </w:rPr>
-              <w:br/>
-              <w:t xml:space="preserve">    END IF;</w:t>
-            </w:r>
-            <w:r>
-              <w:rPr>
-                <w:rFonts w:ascii="Courier New" w:hAnsi="Courier New"/>
-                <w:color w:val="1F3864"/>
-                <w:sz w:val="18"/>
-                <w:lang w:val="en-US"/>
-              </w:rPr>
-              <w:br/>
-              <w:t xml:space="preserve">    -- </w:t>
-            </w:r>
-            <w:proofErr w:type="spellStart"/>
-            <w:r>
-              <w:rPr>
-                <w:rFonts w:ascii="Courier New" w:hAnsi="Courier New"/>
-                <w:color w:val="1F3864"/>
-                <w:sz w:val="18"/>
-                <w:lang w:val="en-US"/>
-              </w:rPr>
-              <w:t>analogamente</w:t>
-            </w:r>
-            <w:proofErr w:type="spellEnd"/>
-            <w:r>
-              <w:rPr>
-                <w:rFonts w:ascii="Courier New" w:hAnsi="Courier New"/>
-                <w:color w:val="1F3864"/>
-                <w:sz w:val="18"/>
-                <w:lang w:val="en-US"/>
-              </w:rPr>
-              <w:t xml:space="preserve"> per </w:t>
-            </w:r>
-            <w:proofErr w:type="spellStart"/>
-            <w:r>
-              <w:rPr>
-                <w:rFonts w:ascii="Courier New" w:hAnsi="Courier New"/>
-                <w:color w:val="1F3864"/>
-                <w:sz w:val="18"/>
-                <w:lang w:val="en-US"/>
-              </w:rPr>
-              <w:t>stato</w:t>
-            </w:r>
-            <w:proofErr w:type="spellEnd"/>
-            <w:r>
-              <w:rPr>
-                <w:rFonts w:ascii="Courier New" w:hAnsi="Courier New"/>
-                <w:color w:val="1F3864"/>
-                <w:sz w:val="18"/>
-                <w:lang w:val="en-US"/>
-              </w:rPr>
-              <w:t xml:space="preserve">, </w:t>
-            </w:r>
-            <w:proofErr w:type="spellStart"/>
-            <w:r>
-              <w:rPr>
-                <w:rFonts w:ascii="Courier New" w:hAnsi="Courier New"/>
-                <w:color w:val="1F3864"/>
-                <w:sz w:val="18"/>
-                <w:lang w:val="en-US"/>
-              </w:rPr>
-              <w:t>tipo_asset_cod</w:t>
-            </w:r>
-            <w:proofErr w:type="spellEnd"/>
-            <w:r>
-              <w:rPr>
-                <w:rFonts w:ascii="Courier New" w:hAnsi="Courier New"/>
-                <w:color w:val="1F3864"/>
-                <w:sz w:val="18"/>
-                <w:lang w:val="en-US"/>
-              </w:rPr>
-              <w:t xml:space="preserve">, </w:t>
-            </w:r>
-            <w:proofErr w:type="spellStart"/>
-            <w:r>
-              <w:rPr>
-                <w:rFonts w:ascii="Courier New" w:hAnsi="Courier New"/>
-                <w:color w:val="1F3864"/>
-                <w:sz w:val="18"/>
-                <w:lang w:val="en-US"/>
-              </w:rPr>
-              <w:t>versione_sw</w:t>
-            </w:r>
-            <w:proofErr w:type="spellEnd"/>
-            <w:r>
-              <w:rPr>
-                <w:rFonts w:ascii="Courier New" w:hAnsi="Courier New"/>
-                <w:color w:val="1F3864"/>
-                <w:sz w:val="18"/>
-                <w:lang w:val="en-US"/>
-              </w:rPr>
-              <w:t xml:space="preserve">, </w:t>
-            </w:r>
-            <w:proofErr w:type="spellStart"/>
-            <w:r>
-              <w:rPr>
-                <w:rFonts w:ascii="Courier New" w:hAnsi="Courier New"/>
-                <w:color w:val="1F3864"/>
-                <w:sz w:val="18"/>
-                <w:lang w:val="en-US"/>
-              </w:rPr>
-              <w:t>ip_address</w:t>
-            </w:r>
-            <w:proofErr w:type="spellEnd"/>
-            <w:r>
-              <w:rPr>
-                <w:rFonts w:ascii="Courier New" w:hAnsi="Courier New"/>
-                <w:color w:val="1F3864"/>
-                <w:sz w:val="18"/>
-                <w:lang w:val="en-US"/>
-              </w:rPr>
-              <w:t>, ...</w:t>
-            </w:r>
-            <w:r>
-              <w:rPr>
-                <w:rFonts w:ascii="Courier New" w:hAnsi="Courier New"/>
-                <w:color w:val="1F3864"/>
-                <w:sz w:val="18"/>
-                <w:lang w:val="en-US"/>
-              </w:rPr>
-              <w:br/>
-              <w:t xml:space="preserve">    </w:t>
-            </w:r>
-            <w:r>
-              <w:rPr>
-                <w:rFonts w:ascii="Courier New" w:hAnsi="Courier New"/>
-                <w:color w:val="1F3864"/>
-                <w:sz w:val="18"/>
-              </w:rPr>
-              <w:t>RETURN NEW;</w:t>
-            </w:r>
-            <w:r>
-              <w:rPr>
-                <w:rFonts w:ascii="Courier New" w:hAnsi="Courier New"/>
-                <w:color w:val="1F3864"/>
-                <w:sz w:val="18"/>
-              </w:rPr>
-              <w:br/>
-            </w:r>
-            <w:r>
-              <w:rPr>
-                <w:rFonts w:ascii="Courier New" w:hAnsi="Courier New"/>
-                <w:color w:val="1F3864"/>
-                <w:sz w:val="18"/>
+              <w:t>&amp; "C:\Program Files\PostgreSQL\18\bin\psql.exe" -U postgres -d nis2db -f ..\sql\nis2_export_csv.sql</w:t>
+            </w:r>
+          </w:p>
+          <w:p>
+            <w:pPr>
+              <w:spacing w:after="120"/>
+              <w:jc w:val="both"/>
+            </w:pPr>
+            <w:r>
+              <w:rPr>
+                <w:rFonts w:ascii="Times New Roman" w:hAnsi="Times New Roman"/>
+                <w:color w:val="000000"/>
+                <w:sz w:val="24"/>
+              </w:rPr>
+              <w:t>Il primo comando crea il database; il secondo carica la struttura completa, comprensiva dei vincoli, degli indici, delle funzioni, dei trigger e delle viste, insieme ai dati di riferimento delle tipologie di asset; il terzo popola le restanti tabelle con il dataset di prova; il quarto genera i file CSV de</w:t>
+            </w:r>
+            <w:r>
+              <w:rPr>
+                <w:rFonts w:ascii="Times New Roman" w:hAnsi="Times New Roman"/>
+                <w:color w:val="000000"/>
+                <w:sz w:val="24"/>
+              </w:rPr>
+              <w:t>i</w:t>
+            </w:r>
+            <w:r>
+              <w:rPr>
+                <w:rFonts w:ascii="Times New Roman" w:hAnsi="Times New Roman"/>
+                <w:color w:val="000000"/>
+                <w:sz w:val="24"/>
+              </w:rPr>
+              <w:t xml:space="preserve"> profil</w:t>
+            </w:r>
+            <w:r>
+              <w:rPr>
+                <w:rFonts w:ascii="Times New Roman" w:hAnsi="Times New Roman"/>
+                <w:color w:val="000000"/>
+                <w:sz w:val="24"/>
+              </w:rPr>
+              <w:t>i</w:t>
+            </w:r>
+            <w:r>
+              <w:rPr>
+                <w:rFonts w:ascii="Times New Roman" w:hAnsi="Times New Roman"/>
+                <w:color w:val="000000"/>
+                <w:sz w:val="24"/>
+              </w:rPr>
+              <w:t xml:space="preserve">. La selezione dell’organizzazione da esportare avviene tramite un parametro, e i file vengono prodotti nella cartella di lavoro corrente. </w:t>
+            </w:r>
+            <w:r>
+              <w:rPr>
+                <w:rFonts w:ascii="Times New Roman" w:hAnsi="Times New Roman"/>
+                <w:color w:val="000000"/>
+                <w:sz w:val="24"/>
+              </w:rPr>
+              <w:t>È</w:t>
+            </w:r>
+            <w:r>
+              <w:rPr>
+                <w:rFonts w:ascii="Times New Roman" w:hAnsi="Times New Roman"/>
+                <w:color w:val="000000"/>
+                <w:sz w:val="24"/>
+              </w:rPr>
+              <w:t xml:space="preserve"> inoltre disponibile una procedura lato server per l’esportazione verso un percorso personalizzato, subordinata pero’ a privilegi amministrativi.</w:t>
+            </w:r>
+          </w:p>
+          <w:p>
+            <w:pPr>
+              <w:spacing w:after="120"/>
+              <w:jc w:val="both"/>
+            </w:pPr>
+            <w:r>
+              <w:rPr>
+                <w:rFonts w:ascii="Times New Roman" w:hAnsi="Times New Roman"/>
+                <w:color w:val="000000"/>
+                <w:sz w:val="24"/>
+              </w:rPr>
+              <w:t xml:space="preserve">Particolare attenzione </w:t>
+            </w:r>
+            <w:r>
+              <w:rPr>
+                <w:rFonts w:ascii="Times New Roman" w:hAnsi="Times New Roman"/>
+                <w:color w:val="000000"/>
+                <w:sz w:val="24"/>
+              </w:rPr>
+              <w:t>è</w:t>
+            </w:r>
+            <w:r>
+              <w:rPr>
+                <w:rFonts w:ascii="Times New Roman" w:hAnsi="Times New Roman"/>
+                <w:color w:val="000000"/>
+                <w:sz w:val="24"/>
+              </w:rPr>
+              <w:t xml:space="preserve"> stata dedicata alla gestione dell’evoluzione dello schema nel tempo, requisito esplicito della traccia. La procedura raccomandata prevede di raccogliere le modifiche in file di migrazione dedicati, contenenti le sole istruzioni differenziali di alterazione delle tabelle o di creazione di nuovi indici, e di eseguirle all’interno di una transazione, cosi’ da garantirne l’atomicit</w:t>
+            </w:r>
+            <w:r>
+              <w:rPr>
+                <w:rFonts w:ascii="Times New Roman" w:hAnsi="Times New Roman"/>
+                <w:color w:val="000000"/>
+                <w:sz w:val="24"/>
+              </w:rPr>
+              <w:t>à</w:t>
+            </w:r>
+            <w:r>
+              <w:rPr>
+                <w:rFonts w:ascii="Times New Roman" w:hAnsi="Times New Roman"/>
+                <w:color w:val="000000"/>
+                <w:sz w:val="24"/>
+              </w:rPr>
+              <w:t>: se una qualsiasi istruzione fallisce, l’intera migrazione viene annullata, evitando stati intermedi incoerenti. Ove necessario, i contatori automatici degli identificatori vengono riallineati e lo stato dei profili interessati viene aggiornato per segnalarne la necessit</w:t>
+            </w:r>
+            <w:r>
+              <w:rPr>
+                <w:rFonts w:ascii="Times New Roman" w:hAnsi="Times New Roman"/>
+                <w:color w:val="000000"/>
+                <w:sz w:val="24"/>
+              </w:rPr>
+              <w:t>à</w:t>
+            </w:r>
+            <w:r>
+              <w:rPr>
+                <w:rFonts w:ascii="Times New Roman" w:hAnsi="Times New Roman"/>
+                <w:color w:val="000000"/>
+                <w:sz w:val="24"/>
+              </w:rPr>
+              <w:t xml:space="preserve"> di revisione. La suddivisione del codice in file distinti, unita all’uso di un sistema di controllo di versione, completa la strategia di gestione delle versioni e assicura la tracciabilit</w:t>
+            </w:r>
+            <w:r>
+              <w:rPr>
+                <w:rFonts w:ascii="Times New Roman" w:hAnsi="Times New Roman"/>
+                <w:color w:val="000000"/>
+                <w:sz w:val="24"/>
+              </w:rPr>
+              <w:t>à</w:t>
+            </w:r>
+            <w:r>
+              <w:rPr>
+                <w:rFonts w:ascii="Times New Roman" w:hAnsi="Times New Roman"/>
+                <w:color w:val="000000"/>
+                <w:sz w:val="24"/>
+              </w:rPr>
+              <w:t xml:space="preserve"> delle modifiche apportate al prodotto.</w:t>
+            </w:r>
+          </w:p>
+          <w:p>
+            <w:pPr>
+              <w:spacing w:after="120"/>
+              <w:jc w:val="both"/>
+            </w:pPr>
+            <w:r>
+              <w:rPr>
+                <w:rFonts w:ascii="Times New Roman" w:hAnsi="Times New Roman"/>
+                <w:color w:val="000000"/>
+                <w:sz w:val="24"/>
               </w:rPr>
               <w:lastRenderedPageBreak/>
-              <w:t>END;</w:t>
-            </w:r>
-            <w:r>
-              <w:rPr>
-                <w:rFonts w:ascii="Courier New" w:hAnsi="Courier New"/>
-                <w:color w:val="1F3864"/>
-                <w:sz w:val="18"/>
-              </w:rPr>
-              <w:br/>
-              <w:t>$$;</w:t>
+              <w:t xml:space="preserve">La verifica del prodotto </w:t>
+            </w:r>
+            <w:r>
+              <w:rPr>
+                <w:rFonts w:ascii="Times New Roman" w:hAnsi="Times New Roman"/>
+                <w:color w:val="000000"/>
+                <w:sz w:val="24"/>
+              </w:rPr>
+              <w:t>è</w:t>
+            </w:r>
+            <w:r>
+              <w:rPr>
+                <w:rFonts w:ascii="Times New Roman" w:hAnsi="Times New Roman"/>
+                <w:color w:val="000000"/>
+                <w:sz w:val="24"/>
+              </w:rPr>
+              <w:t xml:space="preserve"> affidata a un dataset simulato e a un insieme di controlli, che consentono di collaudare le interrogazioni e la generazione dei file senza accedere a sistemi reali, come espressamente richiesto dalla traccia. Il dataset comprende cinque organizzazioni e circa duecentonove record complessivi, distribuiti su tutte le tabelle secondo conteggi noti e verificabili.</w:t>
             </w:r>
           </w:p>
           <w:p>
@@ -6830,7 +7392,7 @@
                 <w:color w:val="000000"/>
                 <w:sz w:val="24"/>
               </w:rPr>
-              <w:t xml:space="preserve">La regola che ammette un solo proprietario attivo per ciascun asset </w:t>
+              <w:t xml:space="preserve">La correttezza dell’installazione puo’ essere accertata confrontando il numero degli oggetti creati con quello previsto: lo schema definisce quattordici tabelle, cinque viste, due funzioni e sei trigger, oltre a un ampio insieme di indici. Analogamente, il numero dei record inseriti in ciascuna tabella </w:t>
             </w:r>
             <w:r>
               <w:rPr>
@@ -6846,824 +7408,7 @@
                 <w:color w:val="000000"/>
                 <w:sz w:val="24"/>
               </w:rPr>
-              <w:t xml:space="preserve"> imposta da un indice univoco parziale, applicato cio</w:t>
-            </w:r>
-            <w:r>
-              <w:rPr>
-                <w:rFonts w:ascii="Times New Roman" w:hAnsi="Times New Roman"/>
-                <w:color w:val="000000"/>
-                <w:sz w:val="24"/>
-              </w:rPr>
-              <w:t>è</w:t>
-            </w:r>
-            <w:r>
-              <w:rPr>
-                <w:rFonts w:ascii="Times New Roman" w:hAnsi="Times New Roman"/>
-                <w:color w:val="000000"/>
-                <w:sz w:val="24"/>
-              </w:rPr>
-              <w:t xml:space="preserve"> soltanto alle righe che soddisfano una condizione:</w:t>
-            </w:r>
-          </w:p>
-          <w:p>
-            <w:pPr>
-              <w:spacing w:before="40" w:after="160"/>
-              <w:ind w:left="280"/>
-            </w:pPr>
-            <w:r>
-              <w:rPr>
-                <w:rFonts w:ascii="Courier New" w:hAnsi="Courier New"/>
-                <w:color w:val="1F3864"/>
-                <w:sz w:val="18"/>
-              </w:rPr>
-              <w:t>CREATE UNIQUE INDEX uq_asset_proprietario_attivo</w:t>
-            </w:r>
-            <w:r>
-              <w:rPr>
-                <w:rFonts w:ascii="Courier New" w:hAnsi="Courier New"/>
-                <w:color w:val="1F3864"/>
-                <w:sz w:val="18"/>
-              </w:rPr>
-              <w:br/>
-              <w:t xml:space="preserve">    ON responsabilita (asset_id)</w:t>
-            </w:r>
-            <w:r>
-              <w:rPr>
-                <w:rFonts w:ascii="Courier New" w:hAnsi="Courier New"/>
-                <w:color w:val="1F3864"/>
-                <w:sz w:val="18"/>
-              </w:rPr>
-              <w:br/>
-              <w:t xml:space="preserve">    WHERE tipo_responsabilita = 'proprietario'</w:t>
-            </w:r>
-            <w:r>
-              <w:rPr>
-                <w:rFonts w:ascii="Courier New" w:hAnsi="Courier New"/>
-                <w:color w:val="1F3864"/>
-                <w:sz w:val="18"/>
-              </w:rPr>
-              <w:br/>
-              <w:t xml:space="preserve">      AND data_fine IS NULL</w:t>
-            </w:r>
-            <w:r>
-              <w:rPr>
-                <w:rFonts w:ascii="Courier New" w:hAnsi="Courier New"/>
-                <w:color w:val="1F3864"/>
-                <w:sz w:val="18"/>
-              </w:rPr>
-              <w:br/>
-              <w:t xml:space="preserve">      AND asset_id IS NOT NULL;</w:t>
-            </w:r>
-          </w:p>
-          <w:p>
-            <w:pPr>
-              <w:spacing w:after="120"/>
-              <w:jc w:val="both"/>
-            </w:pPr>
-            <w:r>
-              <w:rPr>
-                <w:rFonts w:ascii="Times New Roman" w:hAnsi="Times New Roman"/>
-                <w:color w:val="000000"/>
-                <w:sz w:val="24"/>
-              </w:rPr>
-              <w:t>Il popolamento di prova avviene con istruzioni di inserimento come la seguente, relativa a un asset di tipo server dell’organizzazione del settore energetico:</w:t>
-            </w:r>
-          </w:p>
-          <w:p>
-            <w:pPr>
-              <w:spacing w:before="40" w:after="160"/>
-              <w:ind w:left="280"/>
-            </w:pPr>
-            <w:r>
-              <w:rPr>
-                <w:rFonts w:ascii="Courier New" w:hAnsi="Courier New"/>
-                <w:color w:val="1F3864"/>
-                <w:sz w:val="18"/>
-              </w:rPr>
-              <w:t>INSERT INTO asset</w:t>
-            </w:r>
-            <w:r>
-              <w:rPr>
-                <w:rFonts w:ascii="Courier New" w:hAnsi="Courier New"/>
-                <w:color w:val="1F3864"/>
-                <w:sz w:val="18"/>
-              </w:rPr>
-              <w:br/>
-              <w:t xml:space="preserve">    (id, organizzazione_id, sede_id, tipo_asset_cod, codice_inventario,</w:t>
-            </w:r>
-            <w:r>
-              <w:rPr>
-                <w:rFonts w:ascii="Courier New" w:hAnsi="Courier New"/>
-                <w:color w:val="1F3864"/>
-                <w:sz w:val="18"/>
-              </w:rPr>
-              <w:br/>
-              <w:t xml:space="preserve">     nome, categoria, stato, ip_address, versione_sw)</w:t>
-            </w:r>
-            <w:r>
-              <w:rPr>
-                <w:rFonts w:ascii="Courier New" w:hAnsi="Courier New"/>
-                <w:color w:val="1F3864"/>
-                <w:sz w:val="18"/>
-              </w:rPr>
-              <w:br/>
-              <w:t>VALUES</w:t>
-            </w:r>
-            <w:r>
-              <w:rPr>
-                <w:rFonts w:ascii="Courier New" w:hAnsi="Courier New"/>
-                <w:color w:val="1F3864"/>
-                <w:sz w:val="18"/>
-              </w:rPr>
-              <w:br/>
-              <w:t xml:space="preserve">    (1, 1, 2, 'SERVER_FISICO', 'INV-AE-001',</w:t>
-            </w:r>
-            <w:r>
-              <w:rPr>
-                <w:rFonts w:ascii="Courier New" w:hAnsi="Courier New"/>
-                <w:color w:val="1F3864"/>
-                <w:sz w:val="18"/>
-              </w:rPr>
-              <w:br/>
-              <w:t xml:space="preserve">     'SCADA Server Primario', 'critico', 'attivo', '10.0.1.10', 'SCADA 6.2.1');</w:t>
-            </w:r>
-          </w:p>
-          <w:p>
-            <w:pPr>
-              <w:spacing w:after="120"/>
-              <w:jc w:val="both"/>
-            </w:pPr>
-            <w:r>
-              <w:rPr>
-                <w:rFonts w:ascii="Times New Roman" w:hAnsi="Times New Roman"/>
-                <w:color w:val="000000"/>
-                <w:sz w:val="24"/>
-              </w:rPr>
-              <w:t>Infine, le interrogazioni di estrazione non si limitano a leggere i dati, ma li elaborano per produrre informazioni derivate. Nell’estratto seguente lo stato del contratto viene calcolato al momento dell’esecuzione confrontando la data di scadenza con la data corrente:</w:t>
-            </w:r>
-          </w:p>
-          <w:p>
-            <w:pPr>
-              <w:spacing w:before="40" w:after="160"/>
-              <w:ind w:left="280"/>
-            </w:pPr>
-            <w:r>
-              <w:rPr>
-                <w:rFonts w:ascii="Courier New" w:hAnsi="Courier New"/>
-                <w:color w:val="1F3864"/>
-                <w:sz w:val="18"/>
-              </w:rPr>
-              <w:t>SELECT COALESCE(a.nome, sv.nome) AS risorsa,</w:t>
-            </w:r>
-            <w:r>
-              <w:rPr>
-                <w:rFonts w:ascii="Courier New" w:hAnsi="Courier New"/>
-                <w:color w:val="1F3864"/>
-                <w:sz w:val="18"/>
-              </w:rPr>
-              <w:br/>
-              <w:t xml:space="preserve">       f.nome AS fornitore,</w:t>
-            </w:r>
-            <w:r>
-              <w:rPr>
-                <w:rFonts w:ascii="Courier New" w:hAnsi="Courier New"/>
-                <w:color w:val="1F3864"/>
-                <w:sz w:val="18"/>
-              </w:rPr>
-              <w:br/>
-              <w:t xml:space="preserve">       CASE WHEN c.data_scadenza &lt; CURRENT_DATE THEN 'SCADUTO'</w:t>
-            </w:r>
-            <w:r>
-              <w:rPr>
-                <w:rFonts w:ascii="Courier New" w:hAnsi="Courier New"/>
-                <w:color w:val="1F3864"/>
-                <w:sz w:val="18"/>
-              </w:rPr>
-              <w:br/>
-              <w:t xml:space="preserve">            WHEN c.data_scadenza &lt;= CURRENT_DATE + INTERVAL '90 days'</w:t>
-            </w:r>
-            <w:r>
-              <w:rPr>
-                <w:rFonts w:ascii="Courier New" w:hAnsi="Courier New"/>
-                <w:color w:val="1F3864"/>
-                <w:sz w:val="18"/>
-              </w:rPr>
-              <w:br/>
-              <w:t xml:space="preserve">                 THEN 'In scadenz</w:t>
-            </w:r>
-            <w:r>
-              <w:rPr>
-                <w:rFonts w:ascii="Courier New" w:hAnsi="Courier New"/>
-                <w:color w:val="1F3864"/>
-                <w:sz w:val="18"/>
-              </w:rPr>
-              <w:t>à</w:t>
-            </w:r>
-            <w:r>
-              <w:rPr>
-                <w:rFonts w:ascii="Courier New" w:hAnsi="Courier New"/>
-                <w:color w:val="1F3864"/>
-                <w:sz w:val="18"/>
-              </w:rPr>
-              <w:br/>
-              <w:t xml:space="preserve">            ELSE 'Valido' END AS stato_contratto</w:t>
-            </w:r>
-            <w:r>
-              <w:rPr>
-                <w:rFonts w:ascii="Courier New" w:hAnsi="Courier New"/>
-                <w:color w:val="1F3864"/>
-                <w:sz w:val="18"/>
-              </w:rPr>
-              <w:br/>
-              <w:t>FROM dipendenza d</w:t>
-            </w:r>
-            <w:r>
-              <w:rPr>
-                <w:rFonts w:ascii="Courier New" w:hAnsi="Courier New"/>
-                <w:color w:val="1F3864"/>
-                <w:sz w:val="18"/>
-              </w:rPr>
-              <w:br/>
-              <w:t>JOIN fornitore f  ON f.id = d.fornitore_id</w:t>
-            </w:r>
-            <w:r>
-              <w:rPr>
-                <w:rFonts w:ascii="Courier New" w:hAnsi="Courier New"/>
-                <w:color w:val="1F3864"/>
-                <w:sz w:val="18"/>
-              </w:rPr>
-              <w:br/>
-              <w:t>LEFT JOIN contratto c ON c.id = d.contratto_id</w:t>
-            </w:r>
-            <w:r>
-              <w:rPr>
-                <w:rFonts w:ascii="Courier New" w:hAnsi="Courier New"/>
-                <w:color w:val="1F3864"/>
-                <w:sz w:val="18"/>
-              </w:rPr>
-              <w:br/>
-              <w:t>WHERE d.organizzazione_id = 1 AND d.data_fine IS NULL;</w:t>
-            </w:r>
-          </w:p>
-          <w:p>
-            <w:pPr>
-              <w:spacing w:after="120"/>
-              <w:jc w:val="both"/>
-            </w:pPr>
-            <w:r>
-              <w:rPr>
-                <w:rFonts w:ascii="Times New Roman" w:hAnsi="Times New Roman"/>
-                <w:color w:val="000000"/>
-                <w:sz w:val="24"/>
-              </w:rPr>
-              <w:t>Questi estratti, pur nella loro sinteticit</w:t>
-            </w:r>
-            <w:r>
-              <w:rPr>
-                <w:rFonts w:ascii="Times New Roman" w:hAnsi="Times New Roman"/>
-                <w:color w:val="000000"/>
-                <w:sz w:val="24"/>
-              </w:rPr>
-              <w:t>à</w:t>
-            </w:r>
-            <w:r>
-              <w:rPr>
-                <w:rFonts w:ascii="Times New Roman" w:hAnsi="Times New Roman"/>
-                <w:color w:val="000000"/>
-                <w:sz w:val="24"/>
-              </w:rPr>
-              <w:t>, testimoniano l’uso coordinato dei principali strumenti offerti dal sistema di gestione: vincoli dichiarativi per l’integrit</w:t>
-            </w:r>
-            <w:r>
-              <w:rPr>
-                <w:rFonts w:ascii="Times New Roman" w:hAnsi="Times New Roman"/>
-                <w:color w:val="000000"/>
-                <w:sz w:val="24"/>
-              </w:rPr>
-              <w:t>à</w:t>
-            </w:r>
-            <w:r>
-              <w:rPr>
-                <w:rFonts w:ascii="Times New Roman" w:hAnsi="Times New Roman"/>
-                <w:color w:val="000000"/>
-                <w:sz w:val="24"/>
-              </w:rPr>
-              <w:t>, trigger per l’automazione dell’audit, indici per le prestazioni e l’integrit</w:t>
-            </w:r>
-            <w:r>
-              <w:rPr>
-                <w:rFonts w:ascii="Times New Roman" w:hAnsi="Times New Roman"/>
-                <w:color w:val="000000"/>
-                <w:sz w:val="24"/>
-              </w:rPr>
-              <w:t>à</w:t>
-            </w:r>
-            <w:r>
-              <w:rPr>
-                <w:rFonts w:ascii="Times New Roman" w:hAnsi="Times New Roman"/>
-                <w:color w:val="000000"/>
-                <w:sz w:val="24"/>
-              </w:rPr>
-              <w:t>, e interrogazioni evolute per la generazione del profilo.</w:t>
-            </w:r>
-          </w:p>
-          <w:p>
-            <w:pPr>
-              <w:spacing w:after="120"/>
-              <w:jc w:val="both"/>
-            </w:pPr>
-            <w:r>
-              <w:rPr>
-                <w:rFonts w:ascii="Times New Roman" w:hAnsi="Times New Roman"/>
-                <w:color w:val="000000"/>
-                <w:sz w:val="24"/>
-              </w:rPr>
-              <w:t>Merita un approfondimento il tema dei compromessi progettuali (trade-off). Ogni scelta di modellazione comporta un bilanciamento tra obiettivi in tensione tra loro, quali la purezza formale dello schema, l’efficienza delle interrogazioni e la semplicit</w:t>
-            </w:r>
-            <w:r>
-              <w:rPr>
-                <w:rFonts w:ascii="Times New Roman" w:hAnsi="Times New Roman"/>
-                <w:color w:val="000000"/>
-                <w:sz w:val="24"/>
-              </w:rPr>
-              <w:t>à</w:t>
-            </w:r>
-            <w:r>
-              <w:rPr>
-                <w:rFonts w:ascii="Times New Roman" w:hAnsi="Times New Roman"/>
-                <w:color w:val="000000"/>
-                <w:sz w:val="24"/>
-              </w:rPr>
-              <w:t xml:space="preserve"> d’uso. Nel presente elaborato sono state adottate, in modo consapevole e documentato, alcune soluzioni che si discostano dalla forma normale </w:t>
-            </w:r>
-            <w:r>
-              <w:rPr>
-                <w:rFonts w:ascii="Times New Roman" w:hAnsi="Times New Roman"/>
-                <w:color w:val="000000"/>
-                <w:sz w:val="24"/>
-              </w:rPr>
-              <w:t>più</w:t>
-            </w:r>
-            <w:r>
-              <w:rPr>
-                <w:rFonts w:ascii="Times New Roman" w:hAnsi="Times New Roman"/>
-                <w:color w:val="000000"/>
-                <w:sz w:val="24"/>
-              </w:rPr>
-              <w:t xml:space="preserve"> restrittiva, ciascuna motivata da un vantaggio concreto.</w:t>
-            </w:r>
-          </w:p>
-          <w:p>
-            <w:pPr>
-              <w:spacing w:after="120"/>
-              <w:jc w:val="both"/>
-            </w:pPr>
-            <w:r>
-              <w:rPr>
-                <w:rFonts w:ascii="Times New Roman" w:hAnsi="Times New Roman"/>
-                <w:color w:val="000000"/>
-                <w:sz w:val="24"/>
-              </w:rPr>
-              <w:t>La prima riguarda la presenza dell’identificatore dell’organizzazione anche in tabelle che vi sono gi</w:t>
-            </w:r>
-            <w:r>
-              <w:rPr>
-                <w:rFonts w:ascii="Times New Roman" w:hAnsi="Times New Roman"/>
-                <w:color w:val="000000"/>
-                <w:sz w:val="24"/>
-              </w:rPr>
-              <w:t>à</w:t>
-            </w:r>
-            <w:r>
-              <w:rPr>
-                <w:rFonts w:ascii="Times New Roman" w:hAnsi="Times New Roman"/>
-                <w:color w:val="000000"/>
-                <w:sz w:val="24"/>
-              </w:rPr>
-              <w:t xml:space="preserve"> collegate in modo indiretto, come quella delle dipendenze: si tratta di una ridondanza controllata che, a fronte di una minima duplicazione del dato, consente di estrarre il profilo di una singola organizzazione senza attraversare lunghe catene di join, con beneficio in termini di prestazioni e di leggibilit</w:t>
-            </w:r>
-            <w:r>
-              <w:rPr>
-                <w:rFonts w:ascii="Times New Roman" w:hAnsi="Times New Roman"/>
-                <w:color w:val="000000"/>
-                <w:sz w:val="24"/>
-              </w:rPr>
-              <w:t>à</w:t>
-            </w:r>
-            <w:r>
-              <w:rPr>
-                <w:rFonts w:ascii="Times New Roman" w:hAnsi="Times New Roman"/>
-                <w:color w:val="000000"/>
-                <w:sz w:val="24"/>
-              </w:rPr>
-              <w:t xml:space="preserve"> delle interrogazioni. La seconda riguarda la conservazione, sulle tabelle principali, di un campo di ultimo aggiornamento che sarebbe in linea di principio ricavabile dallo storico, ma che viene mantenuto per semplicit</w:t>
-            </w:r>
-            <w:r>
-              <w:rPr>
-                <w:rFonts w:ascii="Times New Roman" w:hAnsi="Times New Roman"/>
-                <w:color w:val="000000"/>
-                <w:sz w:val="24"/>
-              </w:rPr>
-              <w:t>à</w:t>
-            </w:r>
-            <w:r>
-              <w:rPr>
-                <w:rFonts w:ascii="Times New Roman" w:hAnsi="Times New Roman"/>
-                <w:color w:val="000000"/>
-                <w:sz w:val="24"/>
-              </w:rPr>
-              <w:t xml:space="preserve"> di accesso. Un ulteriore compromesso </w:t>
-            </w:r>
-            <w:r>
-              <w:rPr>
-                <w:rFonts w:ascii="Times New Roman" w:hAnsi="Times New Roman"/>
-                <w:color w:val="000000"/>
-                <w:sz w:val="24"/>
-              </w:rPr>
-              <w:t>è</w:t>
-            </w:r>
-            <w:r>
-              <w:rPr>
-                <w:rFonts w:ascii="Times New Roman" w:hAnsi="Times New Roman"/>
-                <w:color w:val="000000"/>
-                <w:sz w:val="24"/>
-              </w:rPr>
-              <w:t xml:space="preserve"> rappresentato dalla scelta di modellare le chiavi esterne facoltative verso asset e servizio con un vincolo di controllo, in luogo di soluzioni basate sull’ereditariet</w:t>
-            </w:r>
-            <w:r>
-              <w:rPr>
-                <w:rFonts w:ascii="Times New Roman" w:hAnsi="Times New Roman"/>
-                <w:color w:val="000000"/>
-                <w:sz w:val="24"/>
-              </w:rPr>
-              <w:t>à</w:t>
-            </w:r>
-            <w:r>
-              <w:rPr>
-                <w:rFonts w:ascii="Times New Roman" w:hAnsi="Times New Roman"/>
-                <w:color w:val="000000"/>
-                <w:sz w:val="24"/>
-              </w:rPr>
-              <w:t xml:space="preserve"> o su tabelle distinte: la soluzione adottata privilegia la compattezza e la chiarezza dello schema. Analogamente, la cancellazione </w:t>
-            </w:r>
-            <w:r>
-              <w:rPr>
-                <w:rFonts w:ascii="Times New Roman" w:hAnsi="Times New Roman"/>
-                <w:color w:val="000000"/>
-                <w:sz w:val="24"/>
-              </w:rPr>
-              <w:lastRenderedPageBreak/>
-              <w:t>logica degli asset antepone la conservazione della storicit</w:t>
-            </w:r>
-            <w:r>
-              <w:rPr>
-                <w:rFonts w:ascii="Times New Roman" w:hAnsi="Times New Roman"/>
-                <w:color w:val="000000"/>
-                <w:sz w:val="24"/>
-              </w:rPr>
-              <w:t>à</w:t>
-            </w:r>
-            <w:r>
-              <w:rPr>
-                <w:rFonts w:ascii="Times New Roman" w:hAnsi="Times New Roman"/>
-                <w:color w:val="000000"/>
-                <w:sz w:val="24"/>
-              </w:rPr>
-              <w:t xml:space="preserve"> alla minimizzazione dello spazio occupato. In tutti i casi, la ridondanza introdotta </w:t>
-            </w:r>
-            <w:r>
-              <w:rPr>
-                <w:rFonts w:ascii="Times New Roman" w:hAnsi="Times New Roman"/>
-                <w:color w:val="000000"/>
-                <w:sz w:val="24"/>
-              </w:rPr>
-              <w:t>è</w:t>
-            </w:r>
-            <w:r>
-              <w:rPr>
-                <w:rFonts w:ascii="Times New Roman" w:hAnsi="Times New Roman"/>
-                <w:color w:val="000000"/>
-                <w:sz w:val="24"/>
-              </w:rPr>
-              <w:t xml:space="preserve"> controllata e non compromette la coerenza complessiva dei dati.</w:t>
-            </w:r>
-          </w:p>
-          <w:p>
-            <w:pPr>
-              <w:spacing w:after="120"/>
-              <w:jc w:val="both"/>
-            </w:pPr>
-            <w:r>
-              <w:rPr>
-                <w:rFonts w:ascii="Times New Roman" w:hAnsi="Times New Roman"/>
-                <w:color w:val="000000"/>
-                <w:sz w:val="24"/>
-              </w:rPr>
-              <w:t>A completamento della documentazione sono state definite alcune linee guida per il popolamento e la manutenzione dei dati. In fase di inserimento si raccomanda di rispettare l’ordine di caricamento imposto dalle dipendenze referenziali, popolando dapprima le entit</w:t>
-            </w:r>
-            <w:r>
-              <w:rPr>
-                <w:rFonts w:ascii="Times New Roman" w:hAnsi="Times New Roman"/>
-                <w:color w:val="000000"/>
-                <w:sz w:val="24"/>
-              </w:rPr>
-              <w:t>à</w:t>
-            </w:r>
-            <w:r>
-              <w:rPr>
-                <w:rFonts w:ascii="Times New Roman" w:hAnsi="Times New Roman"/>
-                <w:color w:val="000000"/>
-                <w:sz w:val="24"/>
-              </w:rPr>
-              <w:t xml:space="preserve"> principali e successivamente le tabelle associative; di valorizzare sempre i campi che classificano gli asset e i servizi per criticit</w:t>
-            </w:r>
-            <w:r>
-              <w:rPr>
-                <w:rFonts w:ascii="Times New Roman" w:hAnsi="Times New Roman"/>
-                <w:color w:val="000000"/>
-                <w:sz w:val="24"/>
-              </w:rPr>
-              <w:t>à</w:t>
-            </w:r>
-            <w:r>
-              <w:rPr>
-                <w:rFonts w:ascii="Times New Roman" w:hAnsi="Times New Roman"/>
-                <w:color w:val="000000"/>
-                <w:sz w:val="24"/>
-              </w:rPr>
-              <w:t>, essenziali ai fini delle estrazioni; e di impostare la variabile di sessione che identifica l’autore delle modifiche, cosi’ da alimentare correttamente il registro di audit. In fase di manutenzione, la cancellazione logica va preferita a quella fisica, le associazioni terminate vanno chiuse valorizzandone la data di fine anzich</w:t>
-            </w:r>
-            <w:r>
-              <w:rPr>
-                <w:rFonts w:ascii="Times New Roman" w:hAnsi="Times New Roman"/>
-                <w:color w:val="000000"/>
-                <w:sz w:val="24"/>
-              </w:rPr>
-              <w:t>è</w:t>
-            </w:r>
-            <w:r>
-              <w:rPr>
-                <w:rFonts w:ascii="Times New Roman" w:hAnsi="Times New Roman"/>
-                <w:color w:val="000000"/>
-                <w:sz w:val="24"/>
-              </w:rPr>
-              <w:t xml:space="preserve"> eliminandole, e ogni nuova versione del profilo va tracciata nell’apposita tabella.</w:t>
-            </w:r>
-          </w:p>
-          <w:p>
-            <w:pPr>
-              <w:spacing w:after="120"/>
-              <w:jc w:val="both"/>
-            </w:pPr>
-            <w:r>
-              <w:rPr>
-                <w:rFonts w:ascii="Times New Roman" w:hAnsi="Times New Roman"/>
-                <w:color w:val="000000"/>
-                <w:sz w:val="24"/>
-              </w:rPr>
-              <w:t>L’elaborato comprende le</w:t>
-            </w:r>
-            <w:r>
-              <w:rPr>
-                <w:rFonts w:ascii="Times New Roman" w:hAnsi="Times New Roman"/>
-                <w:color w:val="000000"/>
-                <w:sz w:val="24"/>
-              </w:rPr>
-              <w:t xml:space="preserve"> istruzioni di installazione precise, che ne consentono la messa in esercizio in un ambiente pulito. I prerequisiti sono un’installazione di PostgreSQL in versione 14 o superiore, un database dedicato, un utente con privilegi sufficienti a eseguire istruzioni di definizione dei dati e la disponibilit</w:t>
-            </w:r>
-            <w:r>
-              <w:rPr>
-                <w:rFonts w:ascii="Times New Roman" w:hAnsi="Times New Roman"/>
-                <w:color w:val="000000"/>
-                <w:sz w:val="24"/>
-              </w:rPr>
-              <w:t>à</w:t>
-            </w:r>
-            <w:r>
-              <w:rPr>
-                <w:rFonts w:ascii="Times New Roman" w:hAnsi="Times New Roman"/>
-                <w:color w:val="000000"/>
-                <w:sz w:val="24"/>
-              </w:rPr>
-              <w:t xml:space="preserve"> del client a riga di comando. L’installazione si articola in pochi passi, da eseguire nell’ordine indicato:</w:t>
-            </w:r>
-          </w:p>
-          <w:p>
-            <w:pPr>
-              <w:spacing w:before="40" w:after="160"/>
-              <w:ind w:left="280"/>
-            </w:pPr>
-            <w:r>
-              <w:rPr>
-                <w:rFonts w:ascii="Courier New" w:hAnsi="Courier New"/>
-                <w:color w:val="1F3864"/>
-                <w:sz w:val="18"/>
-              </w:rPr>
-              <w:t>createdb nis2db</w:t>
-            </w:r>
-            <w:r>
-              <w:rPr>
-                <w:rFonts w:ascii="Courier New" w:hAnsi="Courier New"/>
-                <w:color w:val="1F3864"/>
-                <w:sz w:val="18"/>
-              </w:rPr>
-              <w:br/>
-              <w:t>psql -d nis2db -f nis2_schema.sql      -- struttura, vincoli, trigger, viste</w:t>
-            </w:r>
-            <w:r>
-              <w:rPr>
-                <w:rFonts w:ascii="Courier New" w:hAnsi="Courier New"/>
-                <w:color w:val="1F3864"/>
-                <w:sz w:val="18"/>
-              </w:rPr>
-              <w:br/>
-              <w:t>psql -d nis2db -f nis2_testdata.sql    -- dataset di test (circa 209 record)</w:t>
-            </w:r>
-            <w:r>
-              <w:rPr>
-                <w:rFonts w:ascii="Courier New" w:hAnsi="Courier New"/>
-                <w:color w:val="1F3864"/>
-                <w:sz w:val="18"/>
-              </w:rPr>
-              <w:br/>
-              <w:t>psql -d nis2db -f nis2_export_csv.sql  -- generazione dei CSV del profilo</w:t>
-            </w:r>
-          </w:p>
-          <w:p>
-            <w:pPr>
-              <w:spacing w:after="120"/>
-              <w:jc w:val="both"/>
-            </w:pPr>
-            <w:r>
-              <w:rPr>
-                <w:rFonts w:ascii="Times New Roman" w:hAnsi="Times New Roman"/>
-                <w:color w:val="000000"/>
-                <w:sz w:val="24"/>
-              </w:rPr>
-              <w:t xml:space="preserve">Il primo comando crea il database; il secondo carica la struttura completa, comprensiva dei vincoli, degli indici, delle funzioni, dei trigger e delle viste, insieme ai dati di riferimento delle tipologie di asset; il terzo popola le restanti tabelle con il dataset di prova; il quarto genera i file CSV del profilo. La selezione dell’organizzazione da esportare avviene tramite un parametro, e i file vengono prodotti nella cartella di lavoro corrente. </w:t>
-            </w:r>
-            <w:r>
-              <w:rPr>
-                <w:rFonts w:ascii="Times New Roman" w:hAnsi="Times New Roman"/>
-                <w:color w:val="000000"/>
-                <w:sz w:val="24"/>
-              </w:rPr>
-              <w:t>È</w:t>
-            </w:r>
-            <w:r>
-              <w:rPr>
-                <w:rFonts w:ascii="Times New Roman" w:hAnsi="Times New Roman"/>
-                <w:color w:val="000000"/>
-                <w:sz w:val="24"/>
-              </w:rPr>
-              <w:t xml:space="preserve"> inoltre disponibile una procedura lato server per l’esportazione verso un percorso personalizzato, subordinata pero’ a privilegi amministrativi.</w:t>
-            </w:r>
-          </w:p>
-          <w:p>
-            <w:pPr>
-              <w:spacing w:after="120"/>
-              <w:jc w:val="both"/>
-            </w:pPr>
-            <w:r>
-              <w:rPr>
-                <w:rFonts w:ascii="Times New Roman" w:hAnsi="Times New Roman"/>
-                <w:color w:val="000000"/>
-                <w:sz w:val="24"/>
-              </w:rPr>
-              <w:t xml:space="preserve">Particolare attenzione </w:t>
-            </w:r>
-            <w:r>
-              <w:rPr>
-                <w:rFonts w:ascii="Times New Roman" w:hAnsi="Times New Roman"/>
-                <w:color w:val="000000"/>
-                <w:sz w:val="24"/>
-              </w:rPr>
-              <w:t>è</w:t>
-            </w:r>
-            <w:r>
-              <w:rPr>
-                <w:rFonts w:ascii="Times New Roman" w:hAnsi="Times New Roman"/>
-                <w:color w:val="000000"/>
-                <w:sz w:val="24"/>
-              </w:rPr>
-              <w:t xml:space="preserve"> stata dedicata alla gestione dell’evoluzione dello schema nel tempo, requisito esplicito della traccia. La procedura raccomandata prevede di raccogliere le modifiche in file di migrazione dedicati, contenenti le sole istruzioni differenziali di alterazione delle tabelle o di creazione di nuovi indici, e di eseguirle all’interno di una transazione, cosi’ da garantirne l’atomicit</w:t>
-            </w:r>
-            <w:r>
-              <w:rPr>
-                <w:rFonts w:ascii="Times New Roman" w:hAnsi="Times New Roman"/>
-                <w:color w:val="000000"/>
-                <w:sz w:val="24"/>
-              </w:rPr>
-              <w:t>à</w:t>
-            </w:r>
-            <w:r>
-              <w:rPr>
-                <w:rFonts w:ascii="Times New Roman" w:hAnsi="Times New Roman"/>
-                <w:color w:val="000000"/>
-                <w:sz w:val="24"/>
-              </w:rPr>
-              <w:t>: se una qualsiasi istruzione fallisce, l’intera migrazione viene annullata, evitando stati intermedi incoerenti. Ove necessario, i contatori automatici degli identificatori vengono riallineati e lo stato dei profili interessati viene aggiornato per segnalarne la necessit</w:t>
-            </w:r>
-            <w:r>
-              <w:rPr>
-                <w:rFonts w:ascii="Times New Roman" w:hAnsi="Times New Roman"/>
-                <w:color w:val="000000"/>
-                <w:sz w:val="24"/>
-              </w:rPr>
-              <w:t>à</w:t>
-            </w:r>
-            <w:r>
-              <w:rPr>
-                <w:rFonts w:ascii="Times New Roman" w:hAnsi="Times New Roman"/>
-                <w:color w:val="000000"/>
-                <w:sz w:val="24"/>
-              </w:rPr>
-              <w:t xml:space="preserve"> di revisione. La suddivisione del codice in file distinti, unita all’uso di un sistema di controllo di versione, completa la strategia di gestione delle versioni e assicura la tracciabilit</w:t>
-            </w:r>
-            <w:r>
-              <w:rPr>
-                <w:rFonts w:ascii="Times New Roman" w:hAnsi="Times New Roman"/>
-                <w:color w:val="000000"/>
-                <w:sz w:val="24"/>
-              </w:rPr>
-              <w:t>à</w:t>
-            </w:r>
-            <w:r>
-              <w:rPr>
-                <w:rFonts w:ascii="Times New Roman" w:hAnsi="Times New Roman"/>
-                <w:color w:val="000000"/>
-                <w:sz w:val="24"/>
-              </w:rPr>
-              <w:t xml:space="preserve"> delle modifiche apportate al prodotto.</w:t>
-            </w:r>
-          </w:p>
-          <w:p>
-            <w:pPr>
-              <w:spacing w:after="120"/>
-              <w:jc w:val="both"/>
-            </w:pPr>
-            <w:r>
-              <w:rPr>
-                <w:rFonts w:ascii="Times New Roman" w:hAnsi="Times New Roman"/>
-                <w:color w:val="000000"/>
-                <w:sz w:val="24"/>
-              </w:rPr>
-              <w:t xml:space="preserve">La verifica del prodotto </w:t>
-            </w:r>
-            <w:r>
-              <w:rPr>
-                <w:rFonts w:ascii="Times New Roman" w:hAnsi="Times New Roman"/>
-                <w:color w:val="000000"/>
-                <w:sz w:val="24"/>
-              </w:rPr>
-              <w:t>è</w:t>
-            </w:r>
-            <w:r>
-              <w:rPr>
-                <w:rFonts w:ascii="Times New Roman" w:hAnsi="Times New Roman"/>
-                <w:color w:val="000000"/>
-                <w:sz w:val="24"/>
-              </w:rPr>
-              <w:t xml:space="preserve"> affidata a un dataset simulato e a un insieme di controlli, che consentono di collaudare le interrogazioni e la generazione dei file senza accedere a sistemi reali, come espressamente richiesto dalla traccia. Il dataset comprende cinque organizzazioni e circa duecentonove record complessivi, distribuiti su tutte le tabelle secondo conteggi noti e verificabili.</w:t>
-            </w:r>
-          </w:p>
-          <w:p>
-            <w:pPr>
-              <w:spacing w:after="120"/>
-              <w:jc w:val="both"/>
-            </w:pPr>
-            <w:r>
-              <w:rPr>
-                <w:rFonts w:ascii="Times New Roman" w:hAnsi="Times New Roman"/>
-                <w:color w:val="000000"/>
-                <w:sz w:val="24"/>
-              </w:rPr>
-              <w:t xml:space="preserve">La correttezza dell’installazione puo’ essere accertata confrontando il numero degli oggetti creati con quello previsto: lo schema definisce quattordici tabelle, cinque viste, due funzioni e sei trigger, oltre a un ampio insieme di indici. Analogamente, il numero dei record inseriti in ciascuna tabella </w:t>
-            </w:r>
-            <w:r>
-              <w:rPr>
-                <w:rFonts w:ascii="Times New Roman" w:hAnsi="Times New Roman"/>
-                <w:color w:val="000000"/>
-                <w:sz w:val="24"/>
-              </w:rPr>
-              <w:t>è</w:t>
-            </w:r>
-            <w:r>
-              <w:rPr>
-                <w:rFonts w:ascii="Times New Roman" w:hAnsi="Times New Roman"/>
-                <w:color w:val="000000"/>
-                <w:sz w:val="24"/>
-              </w:rPr>
-              <w:t xml:space="preserve"> confrontabile con i valori attesi, ad esempio ventinove asset, quindici servizi, venti dipendenze e </w:t>
-            </w:r>
-            <w:r>
-              <w:rPr>
-                <w:rFonts w:ascii="Times New Roman" w:hAnsi="Times New Roman"/>
-                <w:color w:val="000000"/>
-                <w:sz w:val="24"/>
-              </w:rPr>
-              <w:lastRenderedPageBreak/>
-              <w:t>venticinque misure di sicurezza. L’esecuzione delle cinque viste restituisce immediatamente le porzioni del profilo, offrendo un ulteriore riscontro della coerenza dei dati. Il dataset include volutamente casi limite, quali contratti gi</w:t>
+              <w:t xml:space="preserve"> confrontabile con i valori attesi, ad esempio ventinove asset, quindici servizi, venti dipendenze e venticinque misure di sicurezza. L’esecuzione delle cinque viste restituisce immediatamente le porzioni del profilo, offrendo un ulteriore riscontro della coerenza dei dati. Il dataset include volutamente casi limite, quali contratti gi</w:t>
             </w:r>
             <w:r>
               <w:rPr>
@@ -7873,7 +7618,7 @@
                           <pic:cNvPicPr/>
                         </pic:nvPicPr>
                         <pic:blipFill>
-                          <a:blip r:embed="rId28">
+                          <a:blip r:embed="rId31">
                             <a:extLst>
                               <a:ext uri="{28A0092B-C50C-407E-A947-70E740481C1C}">
                                 <a14:useLocalDpi xmlns:a14="http://schemas.microsoft.com/office/drawing/2010/main" val="0"/>
@@ -8029,7 +7774,16 @@
                 <w:color w:val="000000"/>
                 <w:sz w:val="24"/>
               </w:rPr>
-              <w:t xml:space="preserve"> organizzative associate ad asset e servizi; per monitorare lo stato di attuazione delle misure di sicurezza previste dall’articolo 21; e, infine, per estrarre automaticamente le sezioni del profilo ACN in formato strutturato, pronte per essere trasmesse o integrate in altri sistemi.</w:t>
+              <w:t xml:space="preserve"> organizzative associate ad asset e servizi; per monitorare lo stato di attuazione delle misure di sicurezza previste dall’articolo 21; e, infine, per estrarre </w:t>
+            </w:r>
+            <w:r>
+              <w:rPr>
+                <w:rFonts w:ascii="Times New Roman" w:hAnsi="Times New Roman"/>
+                <w:color w:val="000000"/>
+                <w:sz w:val="24"/>
+              </w:rPr>
+              <w:lastRenderedPageBreak/>
+              <w:t>automaticamente le sezioni del profilo ACN in formato strutturato, pronte per essere trasmesse o integrate in altri sistemi.</w:t>
             </w:r>
           </w:p>
           <w:p>
@@ -8089,7 +7843,6 @@
                 <w:color w:val="000000"/>
                 <w:sz w:val="24"/>
               </w:rPr>
-              <w:lastRenderedPageBreak/>
               <w:t>A titolo esemplificativo, un operatore del settore energetico puo’ impiegare la base dati per censire i sistemi di supervisione e controllo e le loro dipendenze dai fornitori di manutenzione e di connettivit</w:t>
             </w:r>
             <w:r>
@@ -8268,7 +8021,7 @@
                           <pic:cNvPicPr/>
                         </pic:nvPicPr>
                         <pic:blipFill>
-                          <a:blip r:embed="rId29">
+                          <a:blip r:embed="rId32">
                             <a:extLst>
                               <a:ext uri="{28A0092B-C50C-407E-A947-70E740481C1C}">
                                 <a14:useLocalDpi xmlns:a14="http://schemas.microsoft.com/office/drawing/2010/main" val="0"/>
@@ -8440,6 +8193,7 @@
                 <w:b/>
                 <w:sz w:val="24"/>
               </w:rPr>
+              <w:lastRenderedPageBreak/>
               <w:t>Limiti</w:t>
             </w:r>
           </w:p>
@@ -8500,16 +8254,7 @@
                 <w:color w:val="000000"/>
                 <w:sz w:val="24"/>
               </w:rPr>
-              <w:t xml:space="preserve"> privilegiata l’esportazione lato client. Infine, la gestione del </w:t>
-            </w:r>
-            <w:r>
-              <w:rPr>
-                <w:rFonts w:ascii="Times New Roman" w:hAnsi="Times New Roman"/>
-                <w:color w:val="000000"/>
-                <w:sz w:val="24"/>
-              </w:rPr>
-              <w:lastRenderedPageBreak/>
-              <w:t>flusso di notifica degli incidenti, pur prevista dalla direttiva, non rientra nel perimetro dell’elaborato, che si concentra sulla rappresentazione del profilo del soggetto.</w:t>
+              <w:t xml:space="preserve"> privilegiata l’esportazione lato client. Infine, la gestione del flusso di notifica degli incidenti, pur prevista dalla direttiva, non rientra nel perimetro dell’elaborato, che si concentra sulla rappresentazione del profilo del soggetto.</w:t>
             </w:r>
           </w:p>
           <w:p>
@@ -9389,6 +9134,7 @@
   <w:style w:type="character" w:default="1" w:styleId="DefaultParagraphFont">
     <w:name w:val="Default Paragraph Font"/>
     <w:uiPriority w:val="1"/>
+    <w:semiHidden/>
     <w:unhideWhenUsed/>
   </w:style>
   <w:style w:type="table" w:default="1" w:styleId="TableNormal">

</xml_diff>

<commit_message>
Aggiornamento File consegna + doc
Aggiornamento con modifiche effettuate  del documento di consegna e aggiornamento diagramma nel file di documentazione.
</commit_message>
<xml_diff>
--- a/Guerra_Giacomo_0312500522.docx
+++ b/Guerra_Giacomo_0312500522.docx
@@ -45,7 +45,7 @@
                 <w14:ligatures w14:val="standardContextual"/>
               </w:rPr>
               <w:drawing>
-                <wp:inline distT="0" distB="0" distL="0" distR="0" wp14:anchorId="63CFB47A" wp14:editId="4F93367A">
+                <wp:inline distT="0" distB="0" distL="0" distR="0" wp14:anchorId="63CFB47A" wp14:editId="10F85138">
                   <wp:extent cx="728345" cy="571500"/>
                   <wp:effectExtent l="0" t="0" r="0" b="0"/>
                   <wp:docPr id="6" name="Immagine 6"/>
@@ -2953,6 +2953,26 @@
               <w:jc w:val="both"/>
               <w:rPr>
                 <w:rFonts w:ascii="Times New Roman" w:hAnsi="Times New Roman" w:cs="Times New Roman"/>
+                <w:sz w:val="24"/>
+                <w:szCs w:val="24"/>
+                <w:lang w:val="it-IT"/>
+              </w:rPr>
+            </w:pPr>
+            <w:r>
+              <w:rPr>
+                <w:rFonts w:ascii="Times New Roman" w:hAnsi="Times New Roman" w:cs="Times New Roman"/>
+                <w:sz w:val="24"/>
+                <w:szCs w:val="24"/>
+                <w:lang w:val="it-IT"/>
+              </w:rPr>
+              <w:t>•  Riferimenti sul modello relazionale e sulla teoria della normalizzazione, in particolare E. F. Codd, «A Relational Model of Data for Large Shared Data Banks», Communications of the ACM, 1970, e la successiva letteratura sulle forme normali.</w:t>
+            </w:r>
+          </w:p>
+          <w:p>
+            <w:pPr>
+              <w:jc w:val="both"/>
+              <w:rPr>
+                <w:rFonts w:ascii="Times New Roman" w:hAnsi="Times New Roman" w:cs="Times New Roman"/>
                 <w:sz w:val="28"/>
                 <w:szCs w:val="28"/>
                 <w:lang w:val="it-IT"/>
@@ -2965,7 +2985,67 @@
                 <w:szCs w:val="24"/>
                 <w:lang w:val="it-IT"/>
               </w:rPr>
-              <w:t>•  Riferimenti sul modello relazionale e sulla teoria della normalizzazione, in particolare E. F. Codd, «A Relational Model of Data for Large Shared Data Banks», Communications of the ACM, 1970, e la successiva letteratura sulle forme normali.</w:t>
+              <w:lastRenderedPageBreak/>
+              <w:t>•  Framework Nazionale per la Cybersecurity e la Data Protection, edizione 2025 (versione 2.1), CIS Sapienza e Laboratorio Nazionale di Cybersecurity CINI</w:t>
+            </w:r>
+            <w:r>
+              <w:rPr>
+                <w:rFonts w:ascii="Times New Roman" w:hAnsi="Times New Roman" w:cs="Times New Roman"/>
+                <w:sz w:val="24"/>
+                <w:szCs w:val="24"/>
+                <w:lang w:val="it-IT"/>
+              </w:rPr>
+              <w:t xml:space="preserve"> (</w:t>
+            </w:r>
+            <w:hyperlink r:id="rId27" w:history="1">
+              <w:r>
+                <w:rPr>
+                  <w:rStyle w:val="Hyperlink"/>
+                  <w:rFonts w:ascii="Times New Roman" w:hAnsi="Times New Roman" w:cs="Times New Roman"/>
+                  <w:sz w:val="24"/>
+                  <w:szCs w:val="24"/>
+                  <w:lang w:val="it-IT"/>
+                </w:rPr>
+                <w:t>https://www.cybersecurityfram</w:t>
+              </w:r>
+              <w:r>
+                <w:rPr>
+                  <w:rStyle w:val="Hyperlink"/>
+                  <w:rFonts w:ascii="Times New Roman" w:hAnsi="Times New Roman" w:cs="Times New Roman"/>
+                  <w:sz w:val="24"/>
+                  <w:szCs w:val="24"/>
+                  <w:lang w:val="it-IT"/>
+                </w:rPr>
+                <w:t>e</w:t>
+              </w:r>
+              <w:r>
+                <w:rPr>
+                  <w:rStyle w:val="Hyperlink"/>
+                  <w:rFonts w:ascii="Times New Roman" w:hAnsi="Times New Roman" w:cs="Times New Roman"/>
+                  <w:sz w:val="24"/>
+                  <w:szCs w:val="24"/>
+                  <w:lang w:val="it-IT"/>
+                </w:rPr>
+                <w:t>work.it</w:t>
+              </w:r>
+            </w:hyperlink>
+            <w:r>
+              <w:rPr>
+                <w:rFonts w:ascii="Times New Roman" w:hAnsi="Times New Roman" w:cs="Times New Roman"/>
+                <w:sz w:val="24"/>
+                <w:szCs w:val="24"/>
+                <w:lang w:val="it-IT"/>
+              </w:rPr>
+              <w:t>)</w:t>
+            </w:r>
+            <w:r>
+              <w:rPr>
+                <w:rFonts w:ascii="Times New Roman" w:hAnsi="Times New Roman" w:cs="Times New Roman"/>
+                <w:sz w:val="24"/>
+                <w:szCs w:val="24"/>
+                <w:lang w:val="it-IT"/>
+              </w:rPr>
+              <w:t>.</w:t>
             </w:r>
           </w:p>
         </w:tc>
@@ -3018,7 +3098,7 @@
                           <pic:cNvPicPr/>
                         </pic:nvPicPr>
                         <pic:blipFill>
-                          <a:blip r:embed="rId27">
+                          <a:blip r:embed="rId28">
                             <a:extLst>
                               <a:ext uri="{28A0092B-C50C-407E-A947-70E740481C1C}">
                                 <a14:useLocalDpi xmlns:a14="http://schemas.microsoft.com/office/drawing/2010/main" val="0"/>
@@ -3074,7 +3154,6 @@
                 <w:lang w:val="it-IT"/>
                 <w14:ligatures w14:val="standardContextual"/>
               </w:rPr>
-              <w:lastRenderedPageBreak/>
               <w:drawing>
                 <wp:inline distT="0" distB="0" distL="0" distR="0" wp14:anchorId="785AEFE7" wp14:editId="07BB0C54">
                   <wp:extent cx="5222081" cy="498244"/>
@@ -3091,7 +3170,7 @@
                           <pic:cNvPicPr/>
                         </pic:nvPicPr>
                         <pic:blipFill>
-                          <a:blip r:embed="rId28">
+                          <a:blip r:embed="rId29">
                             <a:extLst>
                               <a:ext uri="{28A0092B-C50C-407E-A947-70E740481C1C}">
                                 <a14:useLocalDpi xmlns:a14="http://schemas.microsoft.com/office/drawing/2010/main" val="0"/>
@@ -3199,23 +3278,23 @@
                 <w:color w:val="000000"/>
                 <w:sz w:val="24"/>
               </w:rPr>
-              <w:t>-Relazione con quattordici entit</w:t>
-            </w:r>
-            <w:r>
-              <w:rPr>
-                <w:rFonts w:ascii="Times New Roman" w:hAnsi="Times New Roman"/>
-                <w:color w:val="000000"/>
-                <w:sz w:val="24"/>
-              </w:rPr>
-              <w:t>à</w:t>
-            </w:r>
-            <w:r>
-              <w:rPr>
-                <w:rFonts w:ascii="Times New Roman" w:hAnsi="Times New Roman"/>
-                <w:color w:val="000000"/>
-                <w:sz w:val="24"/>
-              </w:rPr>
-              <w:t xml:space="preserve"> e ventiquattro relazioni.</w:t>
+              <w:t xml:space="preserve">-Relazione con </w:t>
+            </w:r>
+            <w:r>
+              <w:rPr>
+                <w:rFonts w:ascii="Times New Roman" w:hAnsi="Times New Roman"/>
+                <w:color w:val="000000"/>
+                <w:sz w:val="24"/>
+              </w:rPr>
+              <w:t>sedici entità e ventisette relazioni</w:t>
+            </w:r>
+            <w:r>
+              <w:rPr>
+                <w:rFonts w:ascii="Times New Roman" w:hAnsi="Times New Roman"/>
+                <w:color w:val="000000"/>
+                <w:sz w:val="24"/>
+              </w:rPr>
+              <w:t>.</w:t>
             </w:r>
           </w:p>
           <w:p>
@@ -3337,13 +3416,34 @@
                 <w:color w:val="000000"/>
                 <w:sz w:val="24"/>
               </w:rPr>
-              <w:t xml:space="preserve"> stato raggiunto realizzando cinque viste e undici interrogazioni che estraggono, per ciascuna organizzazione, gli asset critici, i servizi erogati, le dipendenze dai fornitori terzi, i referenti e lo stato delle misure di sicurezza, con esportazione in formato CSV.</w:t>
+              <w:t xml:space="preserve"> stato raggiunto realizzando </w:t>
+            </w:r>
+            <w:r>
+              <w:rPr>
+                <w:rFonts w:ascii="Times New Roman" w:hAnsi="Times New Roman"/>
+                <w:color w:val="000000"/>
+                <w:sz w:val="24"/>
+              </w:rPr>
+              <w:t>nove viste e undici interrogazioni</w:t>
+            </w:r>
+            <w:r>
+              <w:rPr>
+                <w:rFonts w:ascii="Times New Roman" w:hAnsi="Times New Roman"/>
+                <w:color w:val="000000"/>
+                <w:sz w:val="24"/>
+              </w:rPr>
+              <w:t xml:space="preserve"> che estraggono, per ciascuna organizzazione, gli asset critici, i servizi erogati, le dipendenze dai fornitori terzi, i referenti e lo stato delle misure di sicurezza, con esportazione in formato CSV.</w:t>
             </w:r>
           </w:p>
           <w:p>
             <w:pPr>
               <w:spacing w:after="120"/>
               <w:jc w:val="both"/>
+              <w:rPr>
+                <w:rFonts w:ascii="Times New Roman" w:hAnsi="Times New Roman"/>
+                <w:color w:val="000000"/>
+                <w:sz w:val="24"/>
+              </w:rPr>
             </w:pPr>
             <w:r>
               <w:rPr>
@@ -3384,6 +3484,25 @@
                 <w:sz w:val="24"/>
               </w:rPr>
               <w:t>-Relazione, data dictionary completo e istruzioni di deploy e manutenzione. Tutti gli obiettivi risultano pertanto conseguiti, e il prodotto consente di popolare in modo coerente e ripetibile le porzioni strutturate del profilo richiesto dall’ACN.</w:t>
+            </w:r>
+          </w:p>
+          <w:p>
+            <w:pPr>
+              <w:spacing w:after="120"/>
+              <w:jc w:val="both"/>
+              <w:rPr>
+                <w:rFonts w:ascii="Times New Roman" w:hAnsi="Times New Roman"/>
+                <w:color w:val="000000"/>
+                <w:sz w:val="24"/>
+              </w:rPr>
+            </w:pPr>
+            <w:r>
+              <w:rPr>
+                <w:rFonts w:ascii="Times New Roman" w:hAnsi="Times New Roman"/>
+                <w:color w:val="000000"/>
+                <w:sz w:val="24"/>
+              </w:rPr>
+              <w:t>A tali obiettivi si aggiunge la rappresentazione dell’assessment secondo il Framework Nazionale: la base dati registra, per ciascuna Subcategory del Core, il livello target e il livello attuale di ogni organizzazione e ne calcola automaticamente il divario, restituendo una roadmap di intervento ordinata per priorità. Il prodotto non si limita così a fotografare la situazione esistente, ma supporta anche la pianificazione del percorso di adeguamento.</w:t>
             </w:r>
           </w:p>
           <w:p>
@@ -3516,6 +3635,7 @@
                 <w:lang w:val="it-IT"/>
                 <w14:ligatures w14:val="standardContextual"/>
               </w:rPr>
+              <w:lastRenderedPageBreak/>
               <w:drawing>
                 <wp:inline distT="0" distB="0" distL="0" distR="0" wp14:anchorId="37415849" wp14:editId="7538DF91">
                   <wp:extent cx="4379118" cy="374171"/>
@@ -3532,7 +3652,7 @@
                           <pic:cNvPicPr/>
                         </pic:nvPicPr>
                         <pic:blipFill>
-                          <a:blip r:embed="rId29">
+                          <a:blip r:embed="rId30">
                             <a:extLst>
                               <a:ext uri="{28A0092B-C50C-407E-A947-70E740481C1C}">
                                 <a14:useLocalDpi xmlns:a14="http://schemas.microsoft.com/office/drawing/2010/main" val="0"/>
@@ -3624,114 +3744,206 @@
                 <w:color w:val="000000"/>
                 <w:sz w:val="24"/>
               </w:rPr>
+              <w:t>La direttiva distingue i soggetti in due categorie: i soggetti essenziali e i soggetti importanti, individuati in base al settore di appartenenza e alla dimensione dell’organizzazione. I settori interessati comprendono, tra gli altri, l’energia, i trasporti, il settore bancario, le infrastrutture dei mercati finanziari, la sanit</w:t>
+            </w:r>
+            <w:r>
+              <w:rPr>
+                <w:rFonts w:ascii="Times New Roman" w:hAnsi="Times New Roman"/>
+                <w:color w:val="000000"/>
+                <w:sz w:val="24"/>
+              </w:rPr>
+              <w:t>à</w:t>
+            </w:r>
+            <w:r>
+              <w:rPr>
+                <w:rFonts w:ascii="Times New Roman" w:hAnsi="Times New Roman"/>
+                <w:color w:val="000000"/>
+                <w:sz w:val="24"/>
+              </w:rPr>
+              <w:t>, la fornitura di acqua potabile, le infrastrutture digitali e la gestione dei servizi ICT, ai quali si aggiungono, per i soggetti importanti, ulteriori ambiti quali i servizi postali, la gestione dei rifiuti, la produzione e la fabbricazione. Lo schema progettato riflette tale distinzione attraverso appositi attributi che classificano ciascuna organizzazione per settore e per categoria.</w:t>
+            </w:r>
+          </w:p>
+          <w:p>
+            <w:pPr>
+              <w:spacing w:after="120"/>
+              <w:jc w:val="both"/>
+            </w:pPr>
+            <w:r>
+              <w:rPr>
+                <w:rFonts w:ascii="Times New Roman" w:hAnsi="Times New Roman"/>
+                <w:color w:val="000000"/>
+                <w:sz w:val="24"/>
+              </w:rPr>
+              <w:t>Tra gli adempimenti previsti, l’ACN richiede la disponibilit</w:t>
+            </w:r>
+            <w:r>
+              <w:rPr>
+                <w:rFonts w:ascii="Times New Roman" w:hAnsi="Times New Roman"/>
+                <w:color w:val="000000"/>
+                <w:sz w:val="24"/>
+              </w:rPr>
+              <w:t>à</w:t>
+            </w:r>
+            <w:r>
+              <w:rPr>
+                <w:rFonts w:ascii="Times New Roman" w:hAnsi="Times New Roman"/>
+                <w:color w:val="000000"/>
+                <w:sz w:val="24"/>
+              </w:rPr>
+              <w:t xml:space="preserve"> di un profilo strutturato del soggetto, che comprende l’anagrafica dell’organizzazione e i relativi referenti, il perimetro dei servizi erogati (essenziali e digitali), l’inventario degli asset critici e importanti, le dipendenze dai fornitori terzi con riferimento alla sicurezza della catena di fornitura (articolo 21, paragrafo 2, lettera d) e lo stato di attuazione delle misure di sicurezza previste dall’articolo 21. Il profilo deve inoltre poter essere mantenuto aggiornato e versionato nel tempo.</w:t>
+            </w:r>
+          </w:p>
+          <w:p>
+            <w:pPr>
+              <w:spacing w:after="120"/>
+              <w:jc w:val="both"/>
+            </w:pPr>
+            <w:r>
+              <w:rPr>
+                <w:rFonts w:ascii="Times New Roman" w:hAnsi="Times New Roman"/>
+                <w:color w:val="000000"/>
+                <w:sz w:val="24"/>
+              </w:rPr>
+              <w:t>Dal punto di vista applicativo, le organizzazioni gestiscono frequentemente queste informazioni in documenti, fogli di calcolo e sistemi non integrati, con conseguenti incoerenze, duplicazioni e difficolt</w:t>
+            </w:r>
+            <w:r>
+              <w:rPr>
+                <w:rFonts w:ascii="Times New Roman" w:hAnsi="Times New Roman"/>
+                <w:color w:val="000000"/>
+                <w:sz w:val="24"/>
+              </w:rPr>
+              <w:t>à</w:t>
+            </w:r>
+            <w:r>
+              <w:rPr>
+                <w:rFonts w:ascii="Times New Roman" w:hAnsi="Times New Roman"/>
+                <w:color w:val="000000"/>
+                <w:sz w:val="24"/>
+              </w:rPr>
+              <w:t xml:space="preserve"> di aggiornamento e di esportazione. Ne derivano profili poco affidabili e onerosi da mantenere. L’elaborato affronta questo problema proponendo un registro centralizzato che modella in forma normalizzata gli asset, i servizi, le loro relazioni, i responsabili e i metadati necessari, e che consente di estrarre automaticamente le sezioni del profilo in formato strutturato, riducendo l’onere di compilazione e il rischio di errore.</w:t>
+            </w:r>
+          </w:p>
+          <w:p>
+            <w:pPr>
+              <w:spacing w:after="120"/>
+              <w:jc w:val="both"/>
+            </w:pPr>
+            <w:r>
+              <w:rPr>
+                <w:rFonts w:ascii="Times New Roman" w:hAnsi="Times New Roman"/>
+                <w:color w:val="000000"/>
+                <w:sz w:val="24"/>
+              </w:rPr>
+              <w:t>L’articolo 21 della direttiva individua un insieme minimo di misure di gestione del rischio che i soggetti sono tenuti ad adottare, tra cui le politiche di analisi e gestione del rischio, la gestione degli incidenti, la continuit</w:t>
+            </w:r>
+            <w:r>
+              <w:rPr>
+                <w:rFonts w:ascii="Times New Roman" w:hAnsi="Times New Roman"/>
+                <w:color w:val="000000"/>
+                <w:sz w:val="24"/>
+              </w:rPr>
+              <w:t>à</w:t>
+            </w:r>
+            <w:r>
+              <w:rPr>
+                <w:rFonts w:ascii="Times New Roman" w:hAnsi="Times New Roman"/>
+                <w:color w:val="000000"/>
+                <w:sz w:val="24"/>
+              </w:rPr>
+              <w:t xml:space="preserve"> operativa e la gestione dei backup, la sicurezza della catena di approvvigionamento, la sicurezza nell’acquisizione e nella manutenzione dei sistemi, le procedure di valutazione dell’efficacia delle misure, le pratiche di igiene informatica e formazione, l’uso della crittografia, la sicurezza delle risorse umane e il controllo degli accessi, nonch</w:t>
+            </w:r>
+            <w:r>
+              <w:rPr>
+                <w:rFonts w:ascii="Times New Roman" w:hAnsi="Times New Roman"/>
+                <w:color w:val="000000"/>
+                <w:sz w:val="24"/>
+              </w:rPr>
+              <w:t>è</w:t>
+            </w:r>
+            <w:r>
+              <w:rPr>
+                <w:rFonts w:ascii="Times New Roman" w:hAnsi="Times New Roman"/>
+                <w:color w:val="000000"/>
+                <w:sz w:val="24"/>
+              </w:rPr>
+              <w:t xml:space="preserve"> l’impiego, ove opportuno, di soluzioni di autenticazione a </w:t>
+            </w:r>
+            <w:r>
+              <w:rPr>
+                <w:rFonts w:ascii="Times New Roman" w:hAnsi="Times New Roman"/>
+                <w:color w:val="000000"/>
+                <w:sz w:val="24"/>
+              </w:rPr>
+              <w:t>più</w:t>
+            </w:r>
+            <w:r>
+              <w:rPr>
+                <w:rFonts w:ascii="Times New Roman" w:hAnsi="Times New Roman"/>
+                <w:color w:val="000000"/>
+                <w:sz w:val="24"/>
+              </w:rPr>
+              <w:t xml:space="preserve"> fattori. Lo schema progettato rende rappresentabili tali misure e il loro stato di attuazione, associandole agli asset o ai servizi cui si riferiscono.</w:t>
+            </w:r>
+          </w:p>
+          <w:p>
+            <w:pPr>
+              <w:spacing w:after="120"/>
+              <w:jc w:val="both"/>
+            </w:pPr>
+            <w:r>
+              <w:rPr>
+                <w:rFonts w:ascii="Times New Roman" w:hAnsi="Times New Roman"/>
+                <w:color w:val="000000"/>
+                <w:sz w:val="24"/>
+              </w:rPr>
+              <w:t>La direttiva introduce inoltre obblighi di natura procedurale, in particolare per quanto riguarda la notifica degli incidenti significativi all’autorit</w:t>
+            </w:r>
+            <w:r>
+              <w:rPr>
+                <w:rFonts w:ascii="Times New Roman" w:hAnsi="Times New Roman"/>
+                <w:color w:val="000000"/>
+                <w:sz w:val="24"/>
+              </w:rPr>
+              <w:t>à</w:t>
+            </w:r>
+            <w:r>
+              <w:rPr>
+                <w:rFonts w:ascii="Times New Roman" w:hAnsi="Times New Roman"/>
+                <w:color w:val="000000"/>
+                <w:sz w:val="24"/>
+              </w:rPr>
+              <w:t xml:space="preserve"> competente entro tempi definiti, e responsabilizza gli organi di gestione, chiamati ad approvare le misure e a vigilare sulla loro attuazione. Sebbene la gestione del flusso di notifica degli incidenti esuli dal perimetro del presente elaborato, che si concentra sul profilo del soggetto, lo schema predispone comunque le informazioni di base a supporto di tali adempimenti, quali l’individuazione dei referenti e la mappatura degli asset e dei servizi critici.</w:t>
+            </w:r>
+          </w:p>
+          <w:p>
+            <w:pPr>
+              <w:spacing w:after="120"/>
+              <w:jc w:val="both"/>
+            </w:pPr>
+            <w:r>
+              <w:rPr>
+                <w:rFonts w:ascii="Times New Roman" w:hAnsi="Times New Roman"/>
+                <w:color w:val="000000"/>
+                <w:sz w:val="24"/>
+              </w:rPr>
               <w:lastRenderedPageBreak/>
-              <w:t>La direttiva distingue i soggetti in due categorie: i soggetti essenziali e i soggetti importanti, individuati in base al settore di appartenenza e alla dimensione dell’organizzazione. I settori interessati comprendono, tra gli altri, l’energia, i trasporti, il settore bancario, le infrastrutture dei mercati finanziari, la sanit</w:t>
-            </w:r>
-            <w:r>
-              <w:rPr>
-                <w:rFonts w:ascii="Times New Roman" w:hAnsi="Times New Roman"/>
-                <w:color w:val="000000"/>
-                <w:sz w:val="24"/>
-              </w:rPr>
-              <w:t>à</w:t>
-            </w:r>
-            <w:r>
-              <w:rPr>
-                <w:rFonts w:ascii="Times New Roman" w:hAnsi="Times New Roman"/>
-                <w:color w:val="000000"/>
-                <w:sz w:val="24"/>
-              </w:rPr>
-              <w:t>, la fornitura di acqua potabile, le infrastrutture digitali e la gestione dei servizi ICT, ai quali si aggiungono, per i soggetti importanti, ulteriori ambiti quali i servizi postali, la gestione dei rifiuti, la produzione e la fabbricazione. Lo schema progettato riflette tale distinzione attraverso appositi attributi che classificano ciascuna organizzazione per settore e per categoria.</w:t>
-            </w:r>
-          </w:p>
-          <w:p>
-            <w:pPr>
-              <w:spacing w:after="120"/>
-              <w:jc w:val="both"/>
-            </w:pPr>
-            <w:r>
-              <w:rPr>
-                <w:rFonts w:ascii="Times New Roman" w:hAnsi="Times New Roman"/>
-                <w:color w:val="000000"/>
-                <w:sz w:val="24"/>
-              </w:rPr>
-              <w:t>Tra gli adempimenti previsti, l’ACN richiede la disponibilit</w:t>
-            </w:r>
-            <w:r>
-              <w:rPr>
-                <w:rFonts w:ascii="Times New Roman" w:hAnsi="Times New Roman"/>
-                <w:color w:val="000000"/>
-                <w:sz w:val="24"/>
-              </w:rPr>
-              <w:t>à</w:t>
-            </w:r>
-            <w:r>
-              <w:rPr>
-                <w:rFonts w:ascii="Times New Roman" w:hAnsi="Times New Roman"/>
-                <w:color w:val="000000"/>
-                <w:sz w:val="24"/>
-              </w:rPr>
-              <w:t xml:space="preserve"> di un profilo strutturato del soggetto, che comprende l’anagrafica dell’organizzazione e i relativi referenti, il perimetro dei servizi erogati (essenziali e digitali), l’inventario degli asset critici e importanti, le dipendenze dai fornitori terzi con riferimento alla sicurezza della catena di fornitura (articolo 21, paragrafo 2, lettera d) e lo stato di attuazione delle misure di sicurezza previste dall’articolo 21. Il profilo deve inoltre poter essere mantenuto aggiornato e versionato nel tempo.</w:t>
-            </w:r>
-          </w:p>
-          <w:p>
-            <w:pPr>
-              <w:spacing w:after="120"/>
-              <w:jc w:val="both"/>
-            </w:pPr>
-            <w:r>
-              <w:rPr>
-                <w:rFonts w:ascii="Times New Roman" w:hAnsi="Times New Roman"/>
-                <w:color w:val="000000"/>
-                <w:sz w:val="24"/>
-              </w:rPr>
-              <w:t>Dal punto di vista applicativo, le organizzazioni gestiscono frequentemente queste informazioni in documenti, fogli di calcolo e sistemi non integrati, con conseguenti incoerenze, duplicazioni e difficolt</w:t>
-            </w:r>
-            <w:r>
-              <w:rPr>
-                <w:rFonts w:ascii="Times New Roman" w:hAnsi="Times New Roman"/>
-                <w:color w:val="000000"/>
-                <w:sz w:val="24"/>
-              </w:rPr>
-              <w:t>à</w:t>
-            </w:r>
-            <w:r>
-              <w:rPr>
-                <w:rFonts w:ascii="Times New Roman" w:hAnsi="Times New Roman"/>
-                <w:color w:val="000000"/>
-                <w:sz w:val="24"/>
-              </w:rPr>
-              <w:t xml:space="preserve"> di aggiornamento e di esportazione. Ne derivano profili poco affidabili e onerosi da mantenere. L’elaborato affronta questo problema proponendo un registro centralizzato che modella in forma normalizzata gli asset, i servizi, le loro relazioni, i responsabili e i metadati necessari, e che consente di estrarre automaticamente le sezioni del profilo in formato strutturato, riducendo l’onere di compilazione e il rischio di errore.</w:t>
-            </w:r>
-          </w:p>
-          <w:p>
-            <w:pPr>
-              <w:spacing w:after="120"/>
-              <w:jc w:val="both"/>
-            </w:pPr>
-            <w:r>
-              <w:rPr>
-                <w:rFonts w:ascii="Times New Roman" w:hAnsi="Times New Roman"/>
-                <w:color w:val="000000"/>
-                <w:sz w:val="24"/>
-              </w:rPr>
-              <w:t>L’articolo 21 della direttiva individua un insieme minimo di misure di gestione del rischio che i soggetti sono tenuti ad adottare, tra cui le politiche di analisi e gestione del rischio, la gestione degli incidenti, la continuit</w:t>
-            </w:r>
-            <w:r>
-              <w:rPr>
-                <w:rFonts w:ascii="Times New Roman" w:hAnsi="Times New Roman"/>
-                <w:color w:val="000000"/>
-                <w:sz w:val="24"/>
-              </w:rPr>
-              <w:t>à</w:t>
-            </w:r>
-            <w:r>
-              <w:rPr>
-                <w:rFonts w:ascii="Times New Roman" w:hAnsi="Times New Roman"/>
-                <w:color w:val="000000"/>
-                <w:sz w:val="24"/>
-              </w:rPr>
-              <w:t xml:space="preserve"> operativa e la gestione dei backup, la sicurezza della catena di approvvigionamento, la sicurezza nell’acquisizione e nella manutenzione dei sistemi, le procedure di valutazione dell’efficacia delle misure, le pratiche di igiene informatica e formazione, l’uso della crittografia, la sicurezza delle risorse umane e il controllo degli accessi, nonch</w:t>
+              <w:t>In questo quadro, disporre di un profilo strutturato, aggiornato e auditabile non rappresenta un mero adempimento formale, ma una condizione abilitante per l’intero sistema di gestione della sicurezza: la conoscenza puntuale degli asset, delle loro dipendenze e delle responsabilit</w:t>
+            </w:r>
+            <w:r>
+              <w:rPr>
+                <w:rFonts w:ascii="Times New Roman" w:hAnsi="Times New Roman"/>
+                <w:color w:val="000000"/>
+                <w:sz w:val="24"/>
+              </w:rPr>
+              <w:t>à</w:t>
+            </w:r>
+            <w:r>
+              <w:rPr>
+                <w:rFonts w:ascii="Times New Roman" w:hAnsi="Times New Roman"/>
+                <w:color w:val="000000"/>
+                <w:sz w:val="24"/>
+              </w:rPr>
+              <w:t xml:space="preserve"> associate </w:t>
             </w:r>
             <w:r>
               <w:rPr>
@@ -3747,83 +3959,41 @@
                 <w:color w:val="000000"/>
                 <w:sz w:val="24"/>
               </w:rPr>
-              <w:t xml:space="preserve"> l’impiego, ove opportuno, di soluzioni di autenticazione a </w:t>
-            </w:r>
-            <w:r>
-              <w:rPr>
-                <w:rFonts w:ascii="Times New Roman" w:hAnsi="Times New Roman"/>
-                <w:color w:val="000000"/>
-                <w:sz w:val="24"/>
-              </w:rPr>
-              <w:t>più</w:t>
-            </w:r>
-            <w:r>
-              <w:rPr>
-                <w:rFonts w:ascii="Times New Roman" w:hAnsi="Times New Roman"/>
-                <w:color w:val="000000"/>
-                <w:sz w:val="24"/>
-              </w:rPr>
-              <w:t xml:space="preserve"> fattori. Lo schema progettato rende rappresentabili tali misure e il loro stato di attuazione, associandole agli asset o ai servizi cui si riferiscono.</w:t>
-            </w:r>
-          </w:p>
-          <w:p>
-            <w:pPr>
-              <w:spacing w:after="120"/>
-              <w:jc w:val="both"/>
-            </w:pPr>
-            <w:r>
-              <w:rPr>
-                <w:rFonts w:ascii="Times New Roman" w:hAnsi="Times New Roman"/>
-                <w:color w:val="000000"/>
-                <w:sz w:val="24"/>
-              </w:rPr>
-              <w:t>La direttiva introduce inoltre obblighi di natura procedurale, in particolare per quanto riguarda la notifica degli incidenti significativi all’autorit</w:t>
-            </w:r>
-            <w:r>
-              <w:rPr>
-                <w:rFonts w:ascii="Times New Roman" w:hAnsi="Times New Roman"/>
-                <w:color w:val="000000"/>
-                <w:sz w:val="24"/>
-              </w:rPr>
-              <w:t>à</w:t>
-            </w:r>
-            <w:r>
-              <w:rPr>
-                <w:rFonts w:ascii="Times New Roman" w:hAnsi="Times New Roman"/>
-                <w:color w:val="000000"/>
-                <w:sz w:val="24"/>
-              </w:rPr>
-              <w:t xml:space="preserve"> competente entro tempi definiti, e responsabilizza gli organi di gestione, chiamati ad approvare le misure e a vigilare sulla loro attuazione. Sebbene la gestione del flusso di notifica degli incidenti esuli dal perimetro del presente elaborato, che si concentra sul profilo del soggetto, lo schema predispone comunque le informazioni di base a supporto di tali adempimenti, quali l’individuazione dei referenti e la mappatura degli asset e dei servizi critici.</w:t>
-            </w:r>
-          </w:p>
-          <w:p>
-            <w:pPr>
-              <w:spacing w:after="120"/>
-              <w:jc w:val="both"/>
-            </w:pPr>
-            <w:r>
-              <w:rPr>
-                <w:rFonts w:ascii="Times New Roman" w:hAnsi="Times New Roman"/>
-                <w:color w:val="000000"/>
-                <w:sz w:val="24"/>
-              </w:rPr>
-              <w:t>In questo quadro, disporre di un profilo strutturato, aggiornato e auditabile non rappresenta un mero adempimento formale, ma una condizione abilitante per l’intero sistema di gestione della sicurezza: la conoscenza puntuale degli asset, delle loro dipendenze e delle responsabilit</w:t>
-            </w:r>
-            <w:r>
-              <w:rPr>
-                <w:rFonts w:ascii="Times New Roman" w:hAnsi="Times New Roman"/>
-                <w:color w:val="000000"/>
-                <w:sz w:val="24"/>
-              </w:rPr>
-              <w:t>à</w:t>
-            </w:r>
-            <w:r>
-              <w:rPr>
-                <w:rFonts w:ascii="Times New Roman" w:hAnsi="Times New Roman"/>
-                <w:color w:val="000000"/>
-                <w:sz w:val="24"/>
-              </w:rPr>
-              <w:t xml:space="preserve"> associate </w:t>
+              <w:t xml:space="preserve"> il presupposto di ogni analisi del rischio e di ogni risposta efficace agli incidenti.</w:t>
+            </w:r>
+          </w:p>
+          <w:p>
+            <w:pPr>
+              <w:jc w:val="both"/>
+              <w:rPr>
+                <w:rFonts w:ascii="Times New Roman" w:hAnsi="Times New Roman"/>
+                <w:color w:val="000000"/>
+                <w:sz w:val="24"/>
+              </w:rPr>
+            </w:pPr>
+            <w:r>
+              <w:rPr>
+                <w:rFonts w:ascii="Times New Roman" w:hAnsi="Times New Roman"/>
+                <w:color w:val="000000"/>
+                <w:sz w:val="24"/>
+              </w:rPr>
+              <w:t>Rispetto alla precedente disciplina, la direttiva NIS2 amplia in modo significativo l’ambito di applicazione, includendo nuovi settori e adottando, in linea generale, un criterio dimensionale per l’individuazione dei soggetti obbligati, cui si affiancano specifiche eccezioni per i soggetti la cui attivit</w:t>
+            </w:r>
+            <w:r>
+              <w:rPr>
+                <w:rFonts w:ascii="Times New Roman" w:hAnsi="Times New Roman"/>
+                <w:color w:val="000000"/>
+                <w:sz w:val="24"/>
+              </w:rPr>
+              <w:t>à</w:t>
+            </w:r>
+            <w:r>
+              <w:rPr>
+                <w:rFonts w:ascii="Times New Roman" w:hAnsi="Times New Roman"/>
+                <w:color w:val="000000"/>
+                <w:sz w:val="24"/>
+              </w:rPr>
+              <w:t xml:space="preserve"> </w:t>
             </w:r>
             <w:r>
               <w:rPr>
@@ -3839,7 +4009,57 @@
                 <w:color w:val="000000"/>
                 <w:sz w:val="24"/>
               </w:rPr>
-              <w:t xml:space="preserve"> il presupposto di ogni analisi del rischio e di ogni risposta efficace agli incidenti.</w:t>
+              <w:t xml:space="preserve"> ritenuta particolarmente rilevante. Ne deriva che un numero molto maggiore di organizzazioni, rispetto al passato, </w:t>
+            </w:r>
+            <w:r>
+              <w:rPr>
+                <w:rFonts w:ascii="Times New Roman" w:hAnsi="Times New Roman"/>
+                <w:color w:val="000000"/>
+                <w:sz w:val="24"/>
+              </w:rPr>
+              <w:t>è</w:t>
+            </w:r>
+            <w:r>
+              <w:rPr>
+                <w:rFonts w:ascii="Times New Roman" w:hAnsi="Times New Roman"/>
+                <w:color w:val="000000"/>
+                <w:sz w:val="24"/>
+              </w:rPr>
+              <w:t xml:space="preserve"> oggi chiamato a dotarsi di misure adeguate e a mantenere un profilo aggiornato: una circostanza che accresce l’utilit</w:t>
+            </w:r>
+            <w:r>
+              <w:rPr>
+                <w:rFonts w:ascii="Times New Roman" w:hAnsi="Times New Roman"/>
+                <w:color w:val="000000"/>
+                <w:sz w:val="24"/>
+              </w:rPr>
+              <w:t>à</w:t>
+            </w:r>
+            <w:r>
+              <w:rPr>
+                <w:rFonts w:ascii="Times New Roman" w:hAnsi="Times New Roman"/>
+                <w:color w:val="000000"/>
+                <w:sz w:val="24"/>
+              </w:rPr>
+              <w:t xml:space="preserve"> di strumenti in grado di sistematizzare e automatizzare la gestione delle relative informazioni.</w:t>
+            </w:r>
+          </w:p>
+          <w:p>
+            <w:pPr>
+              <w:jc w:val="both"/>
+              <w:rPr>
+                <w:rFonts w:ascii="Times New Roman" w:hAnsi="Times New Roman"/>
+                <w:color w:val="000000"/>
+                <w:sz w:val="24"/>
+              </w:rPr>
+            </w:pPr>
+            <w:r>
+              <w:rPr>
+                <w:rFonts w:ascii="Times New Roman" w:hAnsi="Times New Roman"/>
+                <w:color w:val="000000"/>
+                <w:sz w:val="24"/>
+              </w:rPr>
+              <w:t>Accanto alla direttiva NIS2, il quadro di riferimento nazionale comprende il Framework Nazionale per la Cybersecurity e la Data Protection, giunto all’edizione 2025, elaborato dal Centro di Ricerca di Cyber Intelligence and Information Security dell’Università Sapienza e dal Laboratorio Nazionale di Cybersecurity del CINI con il supporto dell’Agenzia per la Cybersicurezza Nazionale. Derivato dal Cybersecurity Framework del NIST, esso organizza le misure di sicurezza in un Core articolato in sei Funzioni — Governare, Identificare, Proteggere, Rilevare, Rispondere e Ripristinare — a loro volta suddivise in Categorie e Subcategory.</w:t>
             </w:r>
           </w:p>
           <w:p>
@@ -3858,80 +4078,7 @@
                 <w:color w:val="000000"/>
                 <w:sz w:val="24"/>
               </w:rPr>
-              <w:t>Rispetto alla precedente disciplina, la direttiva NIS2 amplia in modo significativo l’ambito di applicazione, includendo nuovi settori e adottando, in linea generale, un criterio dimensionale per l’individuazione dei soggetti obbligati, cui si affiancano specifiche eccezioni per i soggetti la cui attivit</w:t>
-            </w:r>
-            <w:r>
-              <w:rPr>
-                <w:rFonts w:ascii="Times New Roman" w:hAnsi="Times New Roman"/>
-                <w:color w:val="000000"/>
-                <w:sz w:val="24"/>
-              </w:rPr>
-              <w:t>à</w:t>
-            </w:r>
-            <w:r>
-              <w:rPr>
-                <w:rFonts w:ascii="Times New Roman" w:hAnsi="Times New Roman"/>
-                <w:color w:val="000000"/>
-                <w:sz w:val="24"/>
-              </w:rPr>
-              <w:t xml:space="preserve"> </w:t>
-            </w:r>
-            <w:r>
-              <w:rPr>
-                <w:rFonts w:ascii="Times New Roman" w:hAnsi="Times New Roman"/>
-                <w:color w:val="000000"/>
-                <w:sz w:val="24"/>
-              </w:rPr>
-              <w:t>è</w:t>
-            </w:r>
-            <w:r>
-              <w:rPr>
-                <w:rFonts w:ascii="Times New Roman" w:hAnsi="Times New Roman"/>
-                <w:color w:val="000000"/>
-                <w:sz w:val="24"/>
-              </w:rPr>
-              <w:t xml:space="preserve"> ritenuta particolarmente rilevante. Ne deriva che un numero molto maggiore di organizzazioni, rispetto al passato, </w:t>
-            </w:r>
-            <w:r>
-              <w:rPr>
-                <w:rFonts w:ascii="Times New Roman" w:hAnsi="Times New Roman"/>
-                <w:color w:val="000000"/>
-                <w:sz w:val="24"/>
-              </w:rPr>
-              <w:t>è</w:t>
-            </w:r>
-            <w:r>
-              <w:rPr>
-                <w:rFonts w:ascii="Times New Roman" w:hAnsi="Times New Roman"/>
-                <w:color w:val="000000"/>
-                <w:sz w:val="24"/>
-              </w:rPr>
-              <w:t xml:space="preserve"> oggi chiamato a dotarsi di misure adeguate e a mantenere un </w:t>
-            </w:r>
-            <w:r>
-              <w:rPr>
-                <w:rFonts w:ascii="Times New Roman" w:hAnsi="Times New Roman"/>
-                <w:color w:val="000000"/>
-                <w:sz w:val="24"/>
-              </w:rPr>
-              <w:lastRenderedPageBreak/>
-              <w:t>profilo aggiornato: una circostanza che accresce l’utilit</w:t>
-            </w:r>
-            <w:r>
-              <w:rPr>
-                <w:rFonts w:ascii="Times New Roman" w:hAnsi="Times New Roman"/>
-                <w:color w:val="000000"/>
-                <w:sz w:val="24"/>
-              </w:rPr>
-              <w:t>à</w:t>
-            </w:r>
-            <w:r>
-              <w:rPr>
-                <w:rFonts w:ascii="Times New Roman" w:hAnsi="Times New Roman"/>
-                <w:color w:val="000000"/>
-                <w:sz w:val="24"/>
-              </w:rPr>
-              <w:t xml:space="preserve"> di strumenti in grado di sistematizzare e automatizzare la gestione delle relative informazioni.</w:t>
+              <w:t>La metodologia di assessment associata al Framework prevede che l’organizzazione definisca un profilo target, che esprime il livello di sicurezza desiderato per ciascuna Subcategory, e rilevi un profilo attuale, che ne descrive lo stato effettivo. Il confronto fra i due profili individua gli scostamenti, ossia i gap, e consente di pianificare gli interventi secondo un ordine di priorità. Tale impostazione è complementare agli obblighi della NIS2: mentre la direttiva stabilisce che cosa il soggetto è tenuto a garantire, il Framework fornisce lo strumento con cui misurare quanto vi si sia effettivamente conformi.</w:t>
             </w:r>
           </w:p>
         </w:tc>
@@ -3980,7 +4127,7 @@
                           <pic:cNvPicPr/>
                         </pic:nvPicPr>
                         <pic:blipFill>
-                          <a:blip r:embed="rId30">
+                          <a:blip r:embed="rId31">
                             <a:extLst>
                               <a:ext uri="{28A0092B-C50C-407E-A947-70E740481C1C}">
                                 <a14:useLocalDpi xmlns:a14="http://schemas.microsoft.com/office/drawing/2010/main" val="0"/>
@@ -4026,7 +4173,23 @@
                 <w:color w:val="000000"/>
                 <w:sz w:val="24"/>
               </w:rPr>
-              <w:t>L’elaborato consiste in una base dati relazionale, implementata su PostgreSQL, composta da quattordici tabelle organizzate in quattro livelli logici. Questa suddivisione, oltre a rispecchiare la natura delle entit</w:t>
+              <w:t xml:space="preserve">L’elaborato consiste in una base dati relazionale, implementata su PostgreSQL, composta da </w:t>
+            </w:r>
+            <w:r>
+              <w:rPr>
+                <w:rFonts w:ascii="Times New Roman" w:hAnsi="Times New Roman"/>
+                <w:color w:val="000000"/>
+                <w:sz w:val="24"/>
+              </w:rPr>
+              <w:t>sedici tabelle</w:t>
+            </w:r>
+            <w:r>
+              <w:rPr>
+                <w:rFonts w:ascii="Times New Roman" w:hAnsi="Times New Roman"/>
+                <w:color w:val="000000"/>
+                <w:sz w:val="24"/>
+              </w:rPr>
+              <w:t xml:space="preserve"> organizzate in quattro livelli logici. Questa suddivisione, oltre a rispecchiare la natura delle entit</w:t>
             </w:r>
             <w:r>
               <w:rPr>
@@ -4182,7 +4345,23 @@
                 <w:color w:val="000000"/>
                 <w:sz w:val="24"/>
               </w:rPr>
-              <w:t xml:space="preserve"> tutte le informazioni risultano riconducibili al soggetto NIS2 di appartenenza. Lo schema comprende complessivamente ventiquattro relazioni di integrit</w:t>
+              <w:t xml:space="preserve"> tutte le informazioni risultano riconducibili al soggetto NIS2 di appartenenza. Lo schema comprende complessivamente </w:t>
+            </w:r>
+            <w:r>
+              <w:rPr>
+                <w:rFonts w:ascii="Times New Roman" w:hAnsi="Times New Roman"/>
+                <w:color w:val="000000"/>
+                <w:sz w:val="24"/>
+              </w:rPr>
+              <w:t xml:space="preserve">ventisette relazioni </w:t>
+            </w:r>
+            <w:r>
+              <w:rPr>
+                <w:rFonts w:ascii="Times New Roman" w:hAnsi="Times New Roman"/>
+                <w:color w:val="000000"/>
+                <w:sz w:val="24"/>
+              </w:rPr>
+              <w:t>di integrit</w:t>
             </w:r>
             <w:r>
               <w:rPr>
@@ -4308,7 +4487,16 @@
                 <w:color w:val="000000"/>
                 <w:sz w:val="24"/>
               </w:rPr>
-              <w:t xml:space="preserve"> principali modellano ciascuna un aspetto del profilo. La tabella asset rappresenta l’inventario delle risorse ICT, OT e informative, classificate per categoria (critico, importante o standard) e per stato operativo. La tabella servizio descrive i servizi erogati o gestiti, con i relativi obiettivi di continuit</w:t>
+              <w:t xml:space="preserve"> principali modellano ciascuna un aspetto del profilo. La tabella asset rappresenta l’inventario delle risorse ICT, OT e informative, classificate per categoria (critico, importante o </w:t>
+            </w:r>
+            <w:r>
+              <w:rPr>
+                <w:rFonts w:ascii="Times New Roman" w:hAnsi="Times New Roman"/>
+                <w:color w:val="000000"/>
+                <w:sz w:val="24"/>
+              </w:rPr>
+              <w:lastRenderedPageBreak/>
+              <w:t>standard) e per stato operativo. La tabella servizio descrive i servizi erogati o gestiti, con i relativi obiettivi di continuit</w:t>
             </w:r>
             <w:r>
               <w:rPr>
@@ -4590,40 +4778,352 @@
                 <w:color w:val="000000"/>
                 <w:sz w:val="24"/>
               </w:rPr>
+              <w:t>Sono state introdotte due denormalizzazioni consapevoli e documentate, motivate da esigenze di efficienza. La prima consiste nel mantenere l’identificatore dell’organizzazione anche in tabelle che vi sono gi</w:t>
+            </w:r>
+            <w:r>
+              <w:rPr>
+                <w:rFonts w:ascii="Times New Roman" w:hAnsi="Times New Roman"/>
+                <w:color w:val="000000"/>
+                <w:sz w:val="24"/>
+              </w:rPr>
+              <w:t>à</w:t>
+            </w:r>
+            <w:r>
+              <w:rPr>
+                <w:rFonts w:ascii="Times New Roman" w:hAnsi="Times New Roman"/>
+                <w:color w:val="000000"/>
+                <w:sz w:val="24"/>
+              </w:rPr>
+              <w:t xml:space="preserve"> collegate in modo indiretto, cosi’ da consentire interrogazioni di profilo per singola organizzazione senza join profondi. La seconda riguarda la conservazione di un campo di ultimo aggiornamento sulle tabelle principali, ricavabile in linea di principio dallo storico ma mantenuto per semplicit</w:t>
+            </w:r>
+            <w:r>
+              <w:rPr>
+                <w:rFonts w:ascii="Times New Roman" w:hAnsi="Times New Roman"/>
+                <w:color w:val="000000"/>
+                <w:sz w:val="24"/>
+              </w:rPr>
+              <w:t>à</w:t>
+            </w:r>
+            <w:r>
+              <w:rPr>
+                <w:rFonts w:ascii="Times New Roman" w:hAnsi="Times New Roman"/>
+                <w:color w:val="000000"/>
+                <w:sz w:val="24"/>
+              </w:rPr>
+              <w:t xml:space="preserve"> di accesso. In entrambi i casi la ridondanza </w:t>
+            </w:r>
+            <w:r>
+              <w:rPr>
+                <w:rFonts w:ascii="Times New Roman" w:hAnsi="Times New Roman"/>
+                <w:color w:val="000000"/>
+                <w:sz w:val="24"/>
+              </w:rPr>
+              <w:t>è</w:t>
+            </w:r>
+            <w:r>
+              <w:rPr>
+                <w:rFonts w:ascii="Times New Roman" w:hAnsi="Times New Roman"/>
+                <w:color w:val="000000"/>
+                <w:sz w:val="24"/>
+              </w:rPr>
+              <w:t xml:space="preserve"> controllata e non compromette la coerenza dei dati.</w:t>
+            </w:r>
+          </w:p>
+          <w:p>
+            <w:pPr>
+              <w:spacing w:after="120"/>
+              <w:jc w:val="both"/>
+            </w:pPr>
+            <w:r>
+              <w:rPr>
+                <w:rFonts w:ascii="Times New Roman" w:hAnsi="Times New Roman"/>
+                <w:color w:val="000000"/>
+                <w:sz w:val="24"/>
+              </w:rPr>
+              <w:t xml:space="preserve">Il requisito di versionamento e di storico </w:t>
+            </w:r>
+            <w:r>
+              <w:rPr>
+                <w:rFonts w:ascii="Times New Roman" w:hAnsi="Times New Roman"/>
+                <w:color w:val="000000"/>
+                <w:sz w:val="24"/>
+              </w:rPr>
+              <w:t>è</w:t>
+            </w:r>
+            <w:r>
+              <w:rPr>
+                <w:rFonts w:ascii="Times New Roman" w:hAnsi="Times New Roman"/>
+                <w:color w:val="000000"/>
+                <w:sz w:val="24"/>
+              </w:rPr>
+              <w:t xml:space="preserve"> soddisfatto da </w:t>
+            </w:r>
+            <w:r>
+              <w:rPr>
+                <w:rFonts w:ascii="Times New Roman" w:hAnsi="Times New Roman"/>
+                <w:color w:val="000000"/>
+                <w:sz w:val="24"/>
+              </w:rPr>
+              <w:t>più</w:t>
+            </w:r>
+            <w:r>
+              <w:rPr>
+                <w:rFonts w:ascii="Times New Roman" w:hAnsi="Times New Roman"/>
+                <w:color w:val="000000"/>
+                <w:sz w:val="24"/>
+              </w:rPr>
+              <w:t xml:space="preserve"> meccanismi complementari. Il primo </w:t>
+            </w:r>
+            <w:r>
+              <w:rPr>
+                <w:rFonts w:ascii="Times New Roman" w:hAnsi="Times New Roman"/>
+                <w:color w:val="000000"/>
+                <w:sz w:val="24"/>
+              </w:rPr>
+              <w:t>è</w:t>
+            </w:r>
+            <w:r>
+              <w:rPr>
+                <w:rFonts w:ascii="Times New Roman" w:hAnsi="Times New Roman"/>
+                <w:color w:val="000000"/>
+                <w:sz w:val="24"/>
+              </w:rPr>
+              <w:t xml:space="preserve"> un trigger di tipo BEFORE UPDATE sulla tabella asset che, ad ogni modifica, confronta i valori precedenti e nuovi mediante un operatore che gestisce correttamente anche i valori nulli e registra automaticamente, in una tabella di storico immutabile, ogni variazione di sette campi rilevanti: nome, categoria, stato, tipo di asset, sede, versione del software e indirizzo IP. Per ciascuna modifica vengono memorizzati il valore precedente, il valore nuovo, l’autore e la marca temporale. L’autore </w:t>
+            </w:r>
+            <w:r>
+              <w:rPr>
+                <w:rFonts w:ascii="Times New Roman" w:hAnsi="Times New Roman"/>
+                <w:color w:val="000000"/>
+                <w:sz w:val="24"/>
+              </w:rPr>
+              <w:t>è</w:t>
+            </w:r>
+            <w:r>
+              <w:rPr>
+                <w:rFonts w:ascii="Times New Roman" w:hAnsi="Times New Roman"/>
+                <w:color w:val="000000"/>
+                <w:sz w:val="24"/>
+              </w:rPr>
+              <w:t xml:space="preserve"> ricavato da una variabile di sessione che l’applicazione puo’ impostare, con ripiego sull’utente di database, rendendo il registro utilizzabile come traccia di conformit</w:t>
+            </w:r>
+            <w:r>
+              <w:rPr>
+                <w:rFonts w:ascii="Times New Roman" w:hAnsi="Times New Roman"/>
+                <w:color w:val="000000"/>
+                <w:sz w:val="24"/>
+              </w:rPr>
+              <w:t>à</w:t>
+            </w:r>
+            <w:r>
+              <w:rPr>
+                <w:rFonts w:ascii="Times New Roman" w:hAnsi="Times New Roman"/>
+                <w:color w:val="000000"/>
+                <w:sz w:val="24"/>
+              </w:rPr>
+              <w:t>. Un trigger analogo aggiorna automaticamente il campo di ultimo aggiornamento.</w:t>
+            </w:r>
+          </w:p>
+          <w:p>
+            <w:pPr>
+              <w:spacing w:after="120"/>
+              <w:jc w:val="both"/>
+            </w:pPr>
+            <w:r>
+              <w:rPr>
+                <w:rFonts w:ascii="Times New Roman" w:hAnsi="Times New Roman"/>
+                <w:color w:val="000000"/>
+                <w:sz w:val="24"/>
+              </w:rPr>
+              <w:t>Gli asset adottano inoltre una cancellazione logica: anzich</w:t>
+            </w:r>
+            <w:r>
+              <w:rPr>
+                <w:rFonts w:ascii="Times New Roman" w:hAnsi="Times New Roman"/>
+                <w:color w:val="000000"/>
+                <w:sz w:val="24"/>
+              </w:rPr>
+              <w:t>è</w:t>
+            </w:r>
+            <w:r>
+              <w:rPr>
+                <w:rFonts w:ascii="Times New Roman" w:hAnsi="Times New Roman"/>
+                <w:color w:val="000000"/>
+                <w:sz w:val="24"/>
+              </w:rPr>
+              <w:t xml:space="preserve"> essere rimossi fisicamente, vengono contrassegnati come eliminati mediante un apposito flag, cosicch</w:t>
+            </w:r>
+            <w:r>
+              <w:rPr>
+                <w:rFonts w:ascii="Times New Roman" w:hAnsi="Times New Roman"/>
+                <w:color w:val="000000"/>
+                <w:sz w:val="24"/>
+              </w:rPr>
+              <w:t>è</w:t>
+            </w:r>
+            <w:r>
+              <w:rPr>
+                <w:rFonts w:ascii="Times New Roman" w:hAnsi="Times New Roman"/>
+                <w:color w:val="000000"/>
+                <w:sz w:val="24"/>
+              </w:rPr>
+              <w:t xml:space="preserve"> le viste operative li escludono senza che la storicit</w:t>
+            </w:r>
+            <w:r>
+              <w:rPr>
+                <w:rFonts w:ascii="Times New Roman" w:hAnsi="Times New Roman"/>
+                <w:color w:val="000000"/>
+                <w:sz w:val="24"/>
+              </w:rPr>
+              <w:t>à</w:t>
+            </w:r>
+            <w:r>
+              <w:rPr>
+                <w:rFonts w:ascii="Times New Roman" w:hAnsi="Times New Roman"/>
+                <w:color w:val="000000"/>
+                <w:sz w:val="24"/>
+              </w:rPr>
+              <w:t xml:space="preserve"> del dato vada perduta. Il profilo ACN, a sua volta, </w:t>
+            </w:r>
+            <w:r>
+              <w:rPr>
+                <w:rFonts w:ascii="Times New Roman" w:hAnsi="Times New Roman"/>
+                <w:color w:val="000000"/>
+                <w:sz w:val="24"/>
+              </w:rPr>
+              <w:t>è</w:t>
+            </w:r>
+            <w:r>
+              <w:rPr>
+                <w:rFonts w:ascii="Times New Roman" w:hAnsi="Times New Roman"/>
+                <w:color w:val="000000"/>
+                <w:sz w:val="24"/>
+              </w:rPr>
+              <w:t xml:space="preserve"> versionato in una tabella dedicata, nella quale ogni riga rappresenta una versione del profilo con un ciclo di vita esplicito (bozza, inviato, approvato, da aggiornare); un vincolo di unicit</w:t>
+            </w:r>
+            <w:r>
+              <w:rPr>
+                <w:rFonts w:ascii="Times New Roman" w:hAnsi="Times New Roman"/>
+                <w:color w:val="000000"/>
+                <w:sz w:val="24"/>
+              </w:rPr>
+              <w:t>à</w:t>
+            </w:r>
+            <w:r>
+              <w:rPr>
+                <w:rFonts w:ascii="Times New Roman" w:hAnsi="Times New Roman"/>
+                <w:color w:val="000000"/>
+                <w:sz w:val="24"/>
+              </w:rPr>
+              <w:t xml:space="preserve"> sulla coppia organizzazione e numero di versione impedisce la presenza di versioni duplicate.</w:t>
+            </w:r>
+          </w:p>
+          <w:p>
+            <w:pPr>
+              <w:spacing w:after="120"/>
+              <w:jc w:val="both"/>
+            </w:pPr>
+            <w:r>
+              <w:rPr>
+                <w:rFonts w:ascii="Times New Roman" w:hAnsi="Times New Roman"/>
+                <w:color w:val="000000"/>
+                <w:sz w:val="24"/>
+              </w:rPr>
               <w:lastRenderedPageBreak/>
-              <w:t>Sono state introdotte due denormalizzazioni consapevoli e documentate, motivate da esigenze di efficienza. La prima consiste nel mantenere l’identificatore dell’organizzazione anche in tabelle che vi sono gi</w:t>
-            </w:r>
-            <w:r>
-              <w:rPr>
-                <w:rFonts w:ascii="Times New Roman" w:hAnsi="Times New Roman"/>
-                <w:color w:val="000000"/>
-                <w:sz w:val="24"/>
-              </w:rPr>
-              <w:t>à</w:t>
-            </w:r>
-            <w:r>
-              <w:rPr>
-                <w:rFonts w:ascii="Times New Roman" w:hAnsi="Times New Roman"/>
-                <w:color w:val="000000"/>
-                <w:sz w:val="24"/>
-              </w:rPr>
-              <w:t xml:space="preserve"> collegate in modo indiretto, cosi’ da consentire interrogazioni di profilo per singola organizzazione senza join profondi. La seconda riguarda la conservazione di un campo di ultimo aggiornamento sulle tabelle principali, ricavabile in linea di principio dallo storico ma mantenuto per semplicit</w:t>
-            </w:r>
-            <w:r>
-              <w:rPr>
-                <w:rFonts w:ascii="Times New Roman" w:hAnsi="Times New Roman"/>
-                <w:color w:val="000000"/>
-                <w:sz w:val="24"/>
-              </w:rPr>
-              <w:t>à</w:t>
-            </w:r>
-            <w:r>
-              <w:rPr>
-                <w:rFonts w:ascii="Times New Roman" w:hAnsi="Times New Roman"/>
-                <w:color w:val="000000"/>
-                <w:sz w:val="24"/>
-              </w:rPr>
-              <w:t xml:space="preserve"> di accesso. In entrambi i casi la ridondanza </w:t>
+              <w:t>Sul piano dell’integrit</w:t>
+            </w:r>
+            <w:r>
+              <w:rPr>
+                <w:rFonts w:ascii="Times New Roman" w:hAnsi="Times New Roman"/>
+                <w:color w:val="000000"/>
+                <w:sz w:val="24"/>
+              </w:rPr>
+              <w:t>à</w:t>
+            </w:r>
+            <w:r>
+              <w:rPr>
+                <w:rFonts w:ascii="Times New Roman" w:hAnsi="Times New Roman"/>
+                <w:color w:val="000000"/>
+                <w:sz w:val="24"/>
+              </w:rPr>
+              <w:t>, oltre ai vincoli di chiave e di dominio, sono stati definiti due indici univoci parziali che garantiscono l’esistenza di un solo proprietario attivo per ciascun asset e per ciascun servizio, prevenendo cosi’ righe duplicate nelle viste di profilo e ambiguit</w:t>
+            </w:r>
+            <w:r>
+              <w:rPr>
+                <w:rFonts w:ascii="Times New Roman" w:hAnsi="Times New Roman"/>
+                <w:color w:val="000000"/>
+                <w:sz w:val="24"/>
+              </w:rPr>
+              <w:t>à</w:t>
+            </w:r>
+            <w:r>
+              <w:rPr>
+                <w:rFonts w:ascii="Times New Roman" w:hAnsi="Times New Roman"/>
+                <w:color w:val="000000"/>
+                <w:sz w:val="24"/>
+              </w:rPr>
+              <w:t xml:space="preserve"> nell’attribuzione delle responsabilit</w:t>
+            </w:r>
+            <w:r>
+              <w:rPr>
+                <w:rFonts w:ascii="Times New Roman" w:hAnsi="Times New Roman"/>
+                <w:color w:val="000000"/>
+                <w:sz w:val="24"/>
+              </w:rPr>
+              <w:t>à</w:t>
+            </w:r>
+            <w:r>
+              <w:rPr>
+                <w:rFonts w:ascii="Times New Roman" w:hAnsi="Times New Roman"/>
+                <w:color w:val="000000"/>
+                <w:sz w:val="24"/>
+              </w:rPr>
+              <w:t xml:space="preserve">. Le prestazioni sono garantite da tre categorie di indici: indici sulle chiavi esterne, necessari per accelerare le operazioni di join; indici sulle colonne </w:t>
+            </w:r>
+            <w:r>
+              <w:rPr>
+                <w:rFonts w:ascii="Times New Roman" w:hAnsi="Times New Roman"/>
+                <w:color w:val="000000"/>
+                <w:sz w:val="24"/>
+              </w:rPr>
+              <w:t>più</w:t>
+            </w:r>
+            <w:r>
+              <w:rPr>
+                <w:rFonts w:ascii="Times New Roman" w:hAnsi="Times New Roman"/>
+                <w:color w:val="000000"/>
+                <w:sz w:val="24"/>
+              </w:rPr>
+              <w:t xml:space="preserve"> frequentemente utilizzate nei filtri, quali la categoria degli asset, la criticit</w:t>
+            </w:r>
+            <w:r>
+              <w:rPr>
+                <w:rFonts w:ascii="Times New Roman" w:hAnsi="Times New Roman"/>
+                <w:color w:val="000000"/>
+                <w:sz w:val="24"/>
+              </w:rPr>
+              <w:t>à</w:t>
+            </w:r>
+            <w:r>
+              <w:rPr>
+                <w:rFonts w:ascii="Times New Roman" w:hAnsi="Times New Roman"/>
+                <w:color w:val="000000"/>
+                <w:sz w:val="24"/>
+              </w:rPr>
+              <w:t xml:space="preserve"> dei servizi e la scadenza dei contratti; e indici parziali, definiti con una condizione, che riducono la dimensione delle strutture e velocizzano le interrogazioni selettive, ad esempio quelle limitate agli asset operativi o ai fornitori critici.</w:t>
+            </w:r>
+          </w:p>
+          <w:p>
+            <w:pPr>
+              <w:spacing w:after="120"/>
+              <w:jc w:val="both"/>
+            </w:pPr>
+            <w:r>
+              <w:rPr>
+                <w:rFonts w:ascii="Times New Roman" w:hAnsi="Times New Roman"/>
+                <w:color w:val="000000"/>
+                <w:sz w:val="24"/>
+              </w:rPr>
+              <w:t xml:space="preserve">Per l’estrazione del profilo sono state definite cinque viste, ciascuna corrispondente a una sezione del profilo ACN: gli asset critici con il relativo proprietario, le dipendenze attive dalla catena di fornitura con i livelli di servizio, i referenti ufficiali verso l’ACN, lo stato delle misure di sicurezza e un quadro riepilogativo aggregato. Quest’ultima vista </w:t>
             </w:r>
             <w:r>
               <w:rPr>
@@ -4639,21 +5139,58 @@
                 <w:color w:val="000000"/>
                 <w:sz w:val="24"/>
               </w:rPr>
-              <w:t xml:space="preserve"> controllata e non compromette la coerenza dei dati.</w:t>
+              <w:t xml:space="preserve"> stata implementata mediante sottoquery scalari indipendenti, in modo da evitare il prodotto cartesiano che si sarebbe generato aggregando </w:t>
+            </w:r>
+            <w:r>
+              <w:rPr>
+                <w:rFonts w:ascii="Times New Roman" w:hAnsi="Times New Roman"/>
+                <w:color w:val="000000"/>
+                <w:sz w:val="24"/>
+              </w:rPr>
+              <w:t>più</w:t>
+            </w:r>
+            <w:r>
+              <w:rPr>
+                <w:rFonts w:ascii="Times New Roman" w:hAnsi="Times New Roman"/>
+                <w:color w:val="000000"/>
+                <w:sz w:val="24"/>
+              </w:rPr>
+              <w:t xml:space="preserve"> join contemporaneamente. Alle viste si affiancano undici interrogazioni di esportazione che producono, per ciascuna organizzazione, altrettanti file in formato CSV, comprensivi di colonne calcolate quali la classe di disponibilit</w:t>
+            </w:r>
+            <w:r>
+              <w:rPr>
+                <w:rFonts w:ascii="Times New Roman" w:hAnsi="Times New Roman"/>
+                <w:color w:val="000000"/>
+                <w:sz w:val="24"/>
+              </w:rPr>
+              <w:t>à</w:t>
+            </w:r>
+            <w:r>
+              <w:rPr>
+                <w:rFonts w:ascii="Times New Roman" w:hAnsi="Times New Roman"/>
+                <w:color w:val="000000"/>
+                <w:sz w:val="24"/>
+              </w:rPr>
+              <w:t xml:space="preserve"> dei servizi, lo stato dei contratti, l’elenco dei servizi supportati da ciascun asset e specifiche analisi di carenza, come l’individuazione degli asset privi di proprietario o dei contratti in scadenza.</w:t>
             </w:r>
           </w:p>
           <w:p>
             <w:pPr>
               <w:spacing w:after="120"/>
               <w:jc w:val="both"/>
-            </w:pPr>
-            <w:r>
-              <w:rPr>
-                <w:rFonts w:ascii="Times New Roman" w:hAnsi="Times New Roman"/>
-                <w:color w:val="000000"/>
-                <w:sz w:val="24"/>
-              </w:rPr>
-              <w:t xml:space="preserve">Il requisito di versionamento e di storico </w:t>
+              <w:rPr>
+                <w:rFonts w:ascii="Times New Roman" w:hAnsi="Times New Roman"/>
+                <w:color w:val="000000"/>
+                <w:sz w:val="24"/>
+              </w:rPr>
+            </w:pPr>
+            <w:r>
+              <w:rPr>
+                <w:rFonts w:ascii="Times New Roman" w:hAnsi="Times New Roman"/>
+                <w:color w:val="000000"/>
+                <w:sz w:val="24"/>
+              </w:rPr>
+              <w:t xml:space="preserve">Il prodotto </w:t>
             </w:r>
             <w:r>
               <w:rPr>
@@ -4669,7 +5206,96 @@
                 <w:color w:val="000000"/>
                 <w:sz w:val="24"/>
               </w:rPr>
-              <w:t xml:space="preserve"> soddisfatto da </w:t>
+              <w:t xml:space="preserve"> corredato da un dataset di test rappresentativo, composto da cinque organizzazioni appartenenti a settori diversi (energia, infrastrutture digitali, sanit</w:t>
+            </w:r>
+            <w:r>
+              <w:rPr>
+                <w:rFonts w:ascii="Times New Roman" w:hAnsi="Times New Roman"/>
+                <w:color w:val="000000"/>
+                <w:sz w:val="24"/>
+              </w:rPr>
+              <w:t>à</w:t>
+            </w:r>
+            <w:r>
+              <w:rPr>
+                <w:rFonts w:ascii="Times New Roman" w:hAnsi="Times New Roman"/>
+                <w:color w:val="000000"/>
+                <w:sz w:val="24"/>
+              </w:rPr>
+              <w:t xml:space="preserve">, trasporti e bancario) e da circa </w:t>
+            </w:r>
+            <w:r>
+              <w:rPr>
+                <w:rFonts w:ascii="Times New Roman" w:hAnsi="Times New Roman"/>
+                <w:color w:val="000000"/>
+                <w:sz w:val="24"/>
+              </w:rPr>
+              <w:t>trecentoundici</w:t>
+            </w:r>
+            <w:r>
+              <w:rPr>
+                <w:rFonts w:ascii="Times New Roman" w:hAnsi="Times New Roman"/>
+                <w:color w:val="000000"/>
+                <w:sz w:val="24"/>
+              </w:rPr>
+              <w:t xml:space="preserve"> </w:t>
+            </w:r>
+            <w:r>
+              <w:rPr>
+                <w:rFonts w:ascii="Times New Roman" w:hAnsi="Times New Roman"/>
+                <w:color w:val="000000"/>
+                <w:sz w:val="24"/>
+              </w:rPr>
+              <w:t>record complessivi, distribuiti su tutte le tabelle. Il dataset consente di verificare le interrogazioni e la generazione dei file CSV senza dover accedere a sistemi reali, e include volutamente situazioni significative, come contratti gi</w:t>
+            </w:r>
+            <w:r>
+              <w:rPr>
+                <w:rFonts w:ascii="Times New Roman" w:hAnsi="Times New Roman"/>
+                <w:color w:val="000000"/>
+                <w:sz w:val="24"/>
+              </w:rPr>
+              <w:t>à</w:t>
+            </w:r>
+            <w:r>
+              <w:rPr>
+                <w:rFonts w:ascii="Times New Roman" w:hAnsi="Times New Roman"/>
+                <w:color w:val="000000"/>
+                <w:sz w:val="24"/>
+              </w:rPr>
+              <w:t xml:space="preserve"> scaduti e asset privi di responsabile, utili a mostrare il funzionamento delle analisi di carenza e degli avvisi. L’installazione avviene in tre passi: creazione del database, esecuzione dello script di struttura e caricamento dei dati di test, seguiti dall’eventuale esecuzione degli script di esportazione.</w:t>
+            </w:r>
+          </w:p>
+          <w:p>
+            <w:pPr>
+              <w:spacing w:after="120"/>
+              <w:jc w:val="both"/>
+              <w:rPr>
+                <w:rFonts w:ascii="Times New Roman" w:hAnsi="Times New Roman"/>
+                <w:color w:val="000000"/>
+                <w:sz w:val="24"/>
+              </w:rPr>
+            </w:pPr>
+            <w:r>
+              <w:rPr>
+                <w:rFonts w:ascii="Times New Roman" w:hAnsi="Times New Roman"/>
+                <w:color w:val="000000"/>
+                <w:sz w:val="24"/>
+              </w:rPr>
+              <w:t>Al modello si affianca la rappresentazione dell’assessment di sicurezza secondo il Framework Nazionale per la Cybersecurity e la Data Protection. A tale scopo il primo livello comprende una seconda tabella di riferimento, framework_subcategory, che descrive le Subcategory del Core, mentre il quarto livello accoglie la tabella assessment, che registra per ciascuna organizzazione il livello desiderato e quello effettivamente raggiunto per ogni Subcategory. Le due tabelle completano il quadro: quelle precedenti descrivono che cosa l’organizzazione possiede e come lo protegge, queste ultime misurano quanto tale protezione si avvicini all’obiettivo che l’organizzazione si è data.</w:t>
+            </w:r>
+          </w:p>
+          <w:p>
+            <w:pPr>
+              <w:spacing w:after="120"/>
+              <w:jc w:val="both"/>
+            </w:pPr>
+            <w:r>
+              <w:rPr>
+                <w:rFonts w:ascii="Times New Roman" w:hAnsi="Times New Roman"/>
+                <w:color w:val="000000"/>
+                <w:sz w:val="24"/>
+              </w:rPr>
+              <w:t xml:space="preserve">Si descrivono di seguito, in maggiore dettaglio, le principali tabelle dello schema e i loro attributi </w:t>
             </w:r>
             <w:r>
               <w:rPr>
@@ -4685,7 +5311,490 @@
                 <w:color w:val="000000"/>
                 <w:sz w:val="24"/>
               </w:rPr>
-              <w:t xml:space="preserve"> meccanismi complementari. Il primo </w:t>
+              <w:t xml:space="preserve"> significativi, cosi’ da chiarire il modo in cui il modello rappresenta le informazioni del profilo.</w:t>
+            </w:r>
+          </w:p>
+          <w:p>
+            <w:pPr>
+              <w:spacing w:after="120"/>
+              <w:jc w:val="both"/>
+            </w:pPr>
+            <w:r>
+              <w:rPr>
+                <w:rFonts w:ascii="Times New Roman" w:hAnsi="Times New Roman"/>
+                <w:color w:val="000000"/>
+                <w:sz w:val="24"/>
+              </w:rPr>
+              <w:t>La tabella organizzazione conserva la denominazione del soggetto, il codice fiscale, il settore e la categoria NIS2, la casella di posta elettronica certificata, il sito web e la data di registrazione presso l’ACN, oltre a un indicatore di stato attivo. Alcuni campi di servizio, quali gli istanti di creazione e di ultimo aggiornamento, ne consentono la tracciabilit</w:t>
+            </w:r>
+            <w:r>
+              <w:rPr>
+                <w:rFonts w:ascii="Times New Roman" w:hAnsi="Times New Roman"/>
+                <w:color w:val="000000"/>
+                <w:sz w:val="24"/>
+              </w:rPr>
+              <w:t>à</w:t>
+            </w:r>
+            <w:r>
+              <w:rPr>
+                <w:rFonts w:ascii="Times New Roman" w:hAnsi="Times New Roman"/>
+                <w:color w:val="000000"/>
+                <w:sz w:val="24"/>
+              </w:rPr>
+              <w:t xml:space="preserve"> temporale. La tabella sede descrive le sedi fisiche dell’organizzazione, con indirizzo, citt</w:t>
+            </w:r>
+            <w:r>
+              <w:rPr>
+                <w:rFonts w:ascii="Times New Roman" w:hAnsi="Times New Roman"/>
+                <w:color w:val="000000"/>
+                <w:sz w:val="24"/>
+              </w:rPr>
+              <w:t>à</w:t>
+            </w:r>
+            <w:r>
+              <w:rPr>
+                <w:rFonts w:ascii="Times New Roman" w:hAnsi="Times New Roman"/>
+                <w:color w:val="000000"/>
+                <w:sz w:val="24"/>
+              </w:rPr>
+              <w:t>, codice postale e paese, e un indicatore che individua la sede principale; a ciascuna sede possono essere associati gli asset in essa collocati.</w:t>
+            </w:r>
+          </w:p>
+          <w:p>
+            <w:pPr>
+              <w:spacing w:after="120"/>
+              <w:jc w:val="both"/>
+            </w:pPr>
+            <w:r>
+              <w:rPr>
+                <w:rFonts w:ascii="Times New Roman" w:hAnsi="Times New Roman"/>
+                <w:color w:val="000000"/>
+                <w:sz w:val="24"/>
+              </w:rPr>
+              <w:t>La tabella asset, centrale nel modello, conserva per ogni risorsa un codice di inventario univoco, il nome, la descrizione, la tipologia, la categoria di criticit</w:t>
+            </w:r>
+            <w:r>
+              <w:rPr>
+                <w:rFonts w:ascii="Times New Roman" w:hAnsi="Times New Roman"/>
+                <w:color w:val="000000"/>
+                <w:sz w:val="24"/>
+              </w:rPr>
+              <w:t>à</w:t>
+            </w:r>
+            <w:r>
+              <w:rPr>
+                <w:rFonts w:ascii="Times New Roman" w:hAnsi="Times New Roman"/>
+                <w:color w:val="000000"/>
+                <w:sz w:val="24"/>
+              </w:rPr>
+              <w:t xml:space="preserve">, lo stato operativo, l’eventuale indirizzo IP e la versione del software, oltre ai campi di audit e all’indicatore di cancellazione logica. La </w:t>
+            </w:r>
+            <w:r>
+              <w:rPr>
+                <w:rFonts w:ascii="Times New Roman" w:hAnsi="Times New Roman"/>
+                <w:color w:val="000000"/>
+                <w:sz w:val="24"/>
+              </w:rPr>
+              <w:lastRenderedPageBreak/>
+              <w:t>tabella servizio registra, per ciascun servizio, il nome, la descrizione, il tipo, la criticit</w:t>
+            </w:r>
+            <w:r>
+              <w:rPr>
+                <w:rFonts w:ascii="Times New Roman" w:hAnsi="Times New Roman"/>
+                <w:color w:val="000000"/>
+                <w:sz w:val="24"/>
+              </w:rPr>
+              <w:t>à</w:t>
+            </w:r>
+            <w:r>
+              <w:rPr>
+                <w:rFonts w:ascii="Times New Roman" w:hAnsi="Times New Roman"/>
+                <w:color w:val="000000"/>
+                <w:sz w:val="24"/>
+              </w:rPr>
+              <w:t>, lo stato e i parametri di continuit</w:t>
+            </w:r>
+            <w:r>
+              <w:rPr>
+                <w:rFonts w:ascii="Times New Roman" w:hAnsi="Times New Roman"/>
+                <w:color w:val="000000"/>
+                <w:sz w:val="24"/>
+              </w:rPr>
+              <w:t>à</w:t>
+            </w:r>
+            <w:r>
+              <w:rPr>
+                <w:rFonts w:ascii="Times New Roman" w:hAnsi="Times New Roman"/>
+                <w:color w:val="000000"/>
+                <w:sz w:val="24"/>
+              </w:rPr>
+              <w:t xml:space="preserve"> operativa, ossia il tempo massimo di ripristino e la massima perdita di dati tollerata, espressi in ore.</w:t>
+            </w:r>
+          </w:p>
+          <w:p>
+            <w:pPr>
+              <w:spacing w:after="120"/>
+              <w:jc w:val="both"/>
+            </w:pPr>
+            <w:r>
+              <w:rPr>
+                <w:rFonts w:ascii="Times New Roman" w:hAnsi="Times New Roman"/>
+                <w:color w:val="000000"/>
+                <w:sz w:val="24"/>
+              </w:rPr>
+              <w:t>La tabella fornitore raccoglie la ragione sociale, il codice identificativo, il paese, la tipologia e l’indicazione di criticit</w:t>
+            </w:r>
+            <w:r>
+              <w:rPr>
+                <w:rFonts w:ascii="Times New Roman" w:hAnsi="Times New Roman"/>
+                <w:color w:val="000000"/>
+                <w:sz w:val="24"/>
+              </w:rPr>
+              <w:t>à</w:t>
+            </w:r>
+            <w:r>
+              <w:rPr>
+                <w:rFonts w:ascii="Times New Roman" w:hAnsi="Times New Roman"/>
+                <w:color w:val="000000"/>
+                <w:sz w:val="24"/>
+              </w:rPr>
+              <w:t xml:space="preserve"> del fornitore. La tabella contratto ne formalizza i rapporti con l’organizzazione, riportando il numero, le date di inizio e di scadenza, l’oggetto, il livello di servizio garantito in termini di disponibilit</w:t>
+            </w:r>
+            <w:r>
+              <w:rPr>
+                <w:rFonts w:ascii="Times New Roman" w:hAnsi="Times New Roman"/>
+                <w:color w:val="000000"/>
+                <w:sz w:val="24"/>
+              </w:rPr>
+              <w:t>à</w:t>
+            </w:r>
+            <w:r>
+              <w:rPr>
+                <w:rFonts w:ascii="Times New Roman" w:hAnsi="Times New Roman"/>
+                <w:color w:val="000000"/>
+                <w:sz w:val="24"/>
+              </w:rPr>
+              <w:t xml:space="preserve"> percentuale, la presenza di clausole di sicurezza e il valore economico annuo. La tabella dipendenza collega un asset o un servizio a un fornitore, specificando la tipologia di dipendenza (licenza, hosting, manutenzione, connettivit</w:t>
+            </w:r>
+            <w:r>
+              <w:rPr>
+                <w:rFonts w:ascii="Times New Roman" w:hAnsi="Times New Roman"/>
+                <w:color w:val="000000"/>
+                <w:sz w:val="24"/>
+              </w:rPr>
+              <w:t>à</w:t>
+            </w:r>
+            <w:r>
+              <w:rPr>
+                <w:rFonts w:ascii="Times New Roman" w:hAnsi="Times New Roman"/>
+                <w:color w:val="000000"/>
+                <w:sz w:val="24"/>
+              </w:rPr>
+              <w:t>, servizi cloud e altre) e il livello di criticit</w:t>
+            </w:r>
+            <w:r>
+              <w:rPr>
+                <w:rFonts w:ascii="Times New Roman" w:hAnsi="Times New Roman"/>
+                <w:color w:val="000000"/>
+                <w:sz w:val="24"/>
+              </w:rPr>
+              <w:t>à</w:t>
+            </w:r>
+            <w:r>
+              <w:rPr>
+                <w:rFonts w:ascii="Times New Roman" w:hAnsi="Times New Roman"/>
+                <w:color w:val="000000"/>
+                <w:sz w:val="24"/>
+              </w:rPr>
+              <w:t>, e facendo eventualmente riferimento al contratto che la regola.</w:t>
+            </w:r>
+          </w:p>
+          <w:p>
+            <w:pPr>
+              <w:spacing w:after="120"/>
+              <w:jc w:val="both"/>
+            </w:pPr>
+            <w:r>
+              <w:rPr>
+                <w:rFonts w:ascii="Times New Roman" w:hAnsi="Times New Roman"/>
+                <w:color w:val="000000"/>
+                <w:sz w:val="24"/>
+              </w:rPr>
+              <w:t>La tabella persona descrive i referenti dell’organizzazione, con nome, cognome, contatti, ruolo organizzativo e l’indicazione del referente ufficiale verso l’ACN. La tabella responsabilit</w:t>
+            </w:r>
+            <w:r>
+              <w:rPr>
+                <w:rFonts w:ascii="Times New Roman" w:hAnsi="Times New Roman"/>
+                <w:color w:val="000000"/>
+                <w:sz w:val="24"/>
+              </w:rPr>
+              <w:t>à</w:t>
+            </w:r>
+            <w:r>
+              <w:rPr>
+                <w:rFonts w:ascii="Times New Roman" w:hAnsi="Times New Roman"/>
+                <w:color w:val="000000"/>
+                <w:sz w:val="24"/>
+              </w:rPr>
+              <w:t xml:space="preserve"> associa ciascuna persona a un asset o a un servizio con un ruolo specifico, quale proprietario, gestore o contatto tecnico, e con una validit</w:t>
+            </w:r>
+            <w:r>
+              <w:rPr>
+                <w:rFonts w:ascii="Times New Roman" w:hAnsi="Times New Roman"/>
+                <w:color w:val="000000"/>
+                <w:sz w:val="24"/>
+              </w:rPr>
+              <w:t>à</w:t>
+            </w:r>
+            <w:r>
+              <w:rPr>
+                <w:rFonts w:ascii="Times New Roman" w:hAnsi="Times New Roman"/>
+                <w:color w:val="000000"/>
+                <w:sz w:val="24"/>
+              </w:rPr>
+              <w:t xml:space="preserve"> temporale che consente di storicizzare gli avvicendamenti. La tabella asset_storico, alimentata dal trigger, conserva in modo immutabile la cronologia delle modifiche.</w:t>
+            </w:r>
+          </w:p>
+          <w:p>
+            <w:pPr>
+              <w:spacing w:after="120"/>
+              <w:jc w:val="both"/>
+              <w:rPr>
+                <w:rFonts w:ascii="Times New Roman" w:hAnsi="Times New Roman"/>
+                <w:color w:val="000000"/>
+                <w:sz w:val="24"/>
+              </w:rPr>
+            </w:pPr>
+            <w:r>
+              <w:rPr>
+                <w:rFonts w:ascii="Times New Roman" w:hAnsi="Times New Roman"/>
+                <w:color w:val="000000"/>
+                <w:sz w:val="24"/>
+              </w:rPr>
+              <w:t>La tabella misura_sicurezza traccia le misure adottate ai sensi dell’articolo 21, riportando il riferimento normativo puntuale, la categoria, il nome, lo stato di attuazione e le date di implementazione e di verifica. Le categorie previste rispecchiano gli ambiti indicati dalla direttiva: la governance e la gestione del rischio, la gestione degli incidenti, la continuit</w:t>
+            </w:r>
+            <w:r>
+              <w:rPr>
+                <w:rFonts w:ascii="Times New Roman" w:hAnsi="Times New Roman"/>
+                <w:color w:val="000000"/>
+                <w:sz w:val="24"/>
+              </w:rPr>
+              <w:t>à</w:t>
+            </w:r>
+            <w:r>
+              <w:rPr>
+                <w:rFonts w:ascii="Times New Roman" w:hAnsi="Times New Roman"/>
+                <w:color w:val="000000"/>
+                <w:sz w:val="24"/>
+              </w:rPr>
+              <w:t xml:space="preserve"> operativa, la sicurezza della catena di fornitura, la crittografia, il controllo degli accessi e la gestione delle vulnerabilit</w:t>
+            </w:r>
+            <w:r>
+              <w:rPr>
+                <w:rFonts w:ascii="Times New Roman" w:hAnsi="Times New Roman"/>
+                <w:color w:val="000000"/>
+                <w:sz w:val="24"/>
+              </w:rPr>
+              <w:t>à</w:t>
+            </w:r>
+            <w:r>
+              <w:rPr>
+                <w:rFonts w:ascii="Times New Roman" w:hAnsi="Times New Roman"/>
+                <w:color w:val="000000"/>
+                <w:sz w:val="24"/>
+              </w:rPr>
+              <w:t>. La tabella profilo_acn, infine, conserva le versioni del profilo compilato, con il riferimento alla persona che le ha redatte, il numero di versione, lo stato e la data di compilazione.</w:t>
+            </w:r>
+          </w:p>
+          <w:p>
+            <w:pPr>
+              <w:spacing w:after="120"/>
+              <w:jc w:val="both"/>
+              <w:rPr>
+                <w:rFonts w:ascii="Times New Roman" w:hAnsi="Times New Roman"/>
+                <w:color w:val="000000"/>
+                <w:sz w:val="24"/>
+              </w:rPr>
+            </w:pPr>
+            <w:r>
+              <w:rPr>
+                <w:rFonts w:ascii="Times New Roman" w:hAnsi="Times New Roman"/>
+                <w:color w:val="000000"/>
+                <w:sz w:val="24"/>
+              </w:rPr>
+              <w:t>La tabella framework_subcategory costituisce il riferimento alle Subcategory del Core: per ciascuna conserva il codice identificativo, ad esempio ID.AM-01, la Funzione e la Categoria di appartenenza e la descrizione ufficiale tratta dall’edizione 2025 del Framework. A essa fa riferimento anche la tabella misura_sicurezza, attraverso il campo subcategory_cod, così da rendere esplicito quale requisito del Framework ciascuna misura concretamente soddisfa.</w:t>
+            </w:r>
+          </w:p>
+          <w:p>
+            <w:pPr>
+              <w:spacing w:after="120"/>
+              <w:jc w:val="both"/>
+              <w:rPr>
+                <w:rFonts w:ascii="Times New Roman" w:hAnsi="Times New Roman"/>
+                <w:color w:val="000000"/>
+                <w:sz w:val="24"/>
+              </w:rPr>
+            </w:pPr>
+            <w:r>
+              <w:rPr>
+                <w:rFonts w:ascii="Times New Roman" w:hAnsi="Times New Roman"/>
+                <w:color w:val="000000"/>
+                <w:sz w:val="24"/>
+              </w:rPr>
+              <w:t>La tabella assessment associa a ogni organizzazione e a ogni Subcategory due valori espressi su una scala da zero a quattro, nella quale zero indica l’assenza di presidio e quattro un presidio ottimizzato: il livello target, che definisce l’obiettivo, e il livello attuale, rilevato in sede di valutazione. Completano la registrazione la priorità attribuita alla Subcategory, il livello di maturità e la data della rilevazione. Un vincolo di unicità sulla coppia organizzazione e Subcategory garantisce che per ciascuna combinazione esista una sola valutazione corrente.</w:t>
+            </w:r>
+          </w:p>
+          <w:p>
+            <w:pPr>
+              <w:spacing w:after="120"/>
+              <w:jc w:val="both"/>
+              <w:rPr>
+                <w:rFonts w:ascii="Times New Roman" w:hAnsi="Times New Roman"/>
+                <w:color w:val="000000"/>
+                <w:sz w:val="24"/>
+              </w:rPr>
+            </w:pPr>
+            <w:r>
+              <w:rPr>
+                <w:rFonts w:ascii="Times New Roman" w:hAnsi="Times New Roman"/>
+                <w:color w:val="000000"/>
+                <w:sz w:val="24"/>
+              </w:rPr>
+              <w:t>Il confronto fra i due profili è esposto da quattro viste dedicate. Le viste v_profilo_target e v_profilo_attuale restituiscono rispettivamente lo stato desiderato e quello rilevato; la vista v_gap_analysis calcola, per ciascuna Subcategory, la differenza fra i due livelli e la qualifica come raggiunta o da colmare, ordinando i risultati per priorità e ampiezza dello scostamento, in modo da costituire una vera e propria roadmap; la vista v_gap_dashboard, infine, sintetizza per ciascuna organizzazione le Subcategory raggiunte, quelle ancora da colmare e la percentuale complessiva di completamento del profilo.</w:t>
+            </w:r>
+          </w:p>
+          <w:p>
+            <w:pPr>
+              <w:spacing w:after="120"/>
+              <w:jc w:val="both"/>
+              <w:rPr>
+                <w:rFonts w:ascii="Times New Roman" w:hAnsi="Times New Roman"/>
+                <w:color w:val="000000"/>
+                <w:sz w:val="24"/>
+              </w:rPr>
+            </w:pPr>
+            <w:r>
+              <w:rPr>
+                <w:rFonts w:ascii="Times New Roman" w:hAnsi="Times New Roman"/>
+                <w:color w:val="000000"/>
+                <w:sz w:val="24"/>
+              </w:rPr>
+              <w:t xml:space="preserve">Applicata al dataset di prova, la misurazione restituisce valori coerenti con la maturità delle diverse organizzazioni: il soggetto del settore bancario raggiunge circa il novantuno per cento del proprio profilo target e quello sanitario l’ottantaquattro per cento, mentre l’operatore del settore dei </w:t>
+            </w:r>
+            <w:r>
+              <w:rPr>
+                <w:rFonts w:ascii="Times New Roman" w:hAnsi="Times New Roman"/>
+                <w:color w:val="000000"/>
+                <w:sz w:val="24"/>
+              </w:rPr>
+              <w:lastRenderedPageBreak/>
+              <w:t>trasporti si ferma intorno al ventidue per cento, con una roadmap di intervento sensibilmente più ampia.</w:t>
+            </w:r>
+          </w:p>
+          <w:p>
+            <w:pPr>
+              <w:spacing w:after="120"/>
+              <w:jc w:val="both"/>
+            </w:pPr>
+            <w:r>
+              <w:rPr>
+                <w:rFonts w:ascii="Times New Roman" w:hAnsi="Times New Roman"/>
+                <w:color w:val="000000"/>
+                <w:sz w:val="24"/>
+              </w:rPr>
+              <w:t>Le undici interrogazioni di esportazione producono altrettante viste tabellari del profilo, pensate per essere salvate in file distinti e riutilizzabili. Nel dettaglio, esse generano l’anagrafica del soggetto con il referente ACN; l’elenco completo dei referenti; l’inventario degli asset critici e importanti con il proprietario e i servizi supportati; il perimetro dei servizi erogati con la classe di disponibilit</w:t>
+            </w:r>
+            <w:r>
+              <w:rPr>
+                <w:rFonts w:ascii="Times New Roman" w:hAnsi="Times New Roman"/>
+                <w:color w:val="000000"/>
+                <w:sz w:val="24"/>
+              </w:rPr>
+              <w:t>à</w:t>
+            </w:r>
+            <w:r>
+              <w:rPr>
+                <w:rFonts w:ascii="Times New Roman" w:hAnsi="Times New Roman"/>
+                <w:color w:val="000000"/>
+                <w:sz w:val="24"/>
+              </w:rPr>
+              <w:t>; le dipendenze dalla catena di fornitura con lo stato dei contratti; lo stato delle misure di sicurezza; un quadro riepilogativo dei contatori chiave; l’avviso sui contratti scaduti o in scadenza; l’analisi degli asset privi di proprietario; l’analisi delle misure non ancora attuate; e lo storico delle modifiche agli asset. A queste si aggiunge una vista di confronto sintetico fra tutte le organizzazioni registrate, utile a una lettura d’insieme.</w:t>
+            </w:r>
+          </w:p>
+          <w:p>
+            <w:pPr>
+              <w:spacing w:after="120"/>
+              <w:jc w:val="both"/>
+            </w:pPr>
+            <w:r>
+              <w:rPr>
+                <w:rFonts w:ascii="Times New Roman" w:hAnsi="Times New Roman"/>
+                <w:color w:val="000000"/>
+                <w:sz w:val="24"/>
+              </w:rPr>
+              <w:t>Alcune di queste interrogazioni non si limitano a estrarre i dati, ma li elaborano per produrre informazioni derivate: la classe di disponibilit</w:t>
+            </w:r>
+            <w:r>
+              <w:rPr>
+                <w:rFonts w:ascii="Times New Roman" w:hAnsi="Times New Roman"/>
+                <w:color w:val="000000"/>
+                <w:sz w:val="24"/>
+              </w:rPr>
+              <w:t>à</w:t>
+            </w:r>
+            <w:r>
+              <w:rPr>
+                <w:rFonts w:ascii="Times New Roman" w:hAnsi="Times New Roman"/>
+                <w:color w:val="000000"/>
+                <w:sz w:val="24"/>
+              </w:rPr>
+              <w:t xml:space="preserve"> di un servizio viene calcolata a partire dal tempo di ripristino, lo stato di un contratto (valido, in scadenza o scaduto) viene determinato confrontando la data di scadenza con la data corrente, e gli avvisi segnalano con una priorit</w:t>
+            </w:r>
+            <w:r>
+              <w:rPr>
+                <w:rFonts w:ascii="Times New Roman" w:hAnsi="Times New Roman"/>
+                <w:color w:val="000000"/>
+                <w:sz w:val="24"/>
+              </w:rPr>
+              <w:t>à</w:t>
+            </w:r>
+            <w:r>
+              <w:rPr>
+                <w:rFonts w:ascii="Times New Roman" w:hAnsi="Times New Roman"/>
+                <w:color w:val="000000"/>
+                <w:sz w:val="24"/>
+              </w:rPr>
+              <w:t xml:space="preserve"> graduata le situazioni che richiedono attenzione. In questo modo la base dati assume anche una funzione di supporto alle decisioni, evidenziando le carenze prima che si traducano in criticit</w:t>
+            </w:r>
+            <w:r>
+              <w:rPr>
+                <w:rFonts w:ascii="Times New Roman" w:hAnsi="Times New Roman"/>
+                <w:color w:val="000000"/>
+                <w:sz w:val="24"/>
+              </w:rPr>
+              <w:t>à</w:t>
+            </w:r>
+            <w:r>
+              <w:rPr>
+                <w:rFonts w:ascii="Times New Roman" w:hAnsi="Times New Roman"/>
+                <w:color w:val="000000"/>
+                <w:sz w:val="24"/>
+              </w:rPr>
+              <w:t>.</w:t>
+            </w:r>
+          </w:p>
+          <w:p>
+            <w:pPr>
+              <w:spacing w:after="120"/>
+              <w:jc w:val="both"/>
+            </w:pPr>
+            <w:r>
+              <w:rPr>
+                <w:rFonts w:ascii="Times New Roman" w:hAnsi="Times New Roman"/>
+                <w:color w:val="000000"/>
+                <w:sz w:val="24"/>
+              </w:rPr>
+              <w:t>La correttezza dello schema puo’ essere verificata mediante interrogazioni di controllo che confrontano il numero di oggetti creati e di record inseriti con i valori attesi, nonch</w:t>
             </w:r>
             <w:r>
               <w:rPr>
@@ -4701,7 +5810,7 @@
                 <w:color w:val="000000"/>
                 <w:sz w:val="24"/>
               </w:rPr>
-              <w:t xml:space="preserve"> un trigger di tipo BEFORE UPDATE sulla tabella asset che, ad ogni modifica, confronta i valori precedenti e nuovi mediante un operatore che gestisce correttamente anche i valori nulli e registra automaticamente, in una tabella di storico immutabile, ogni variazione di sette campi rilevanti: nome, categoria, stato, tipo di asset, sede, versione del software e indirizzo IP. Per ciascuna modifica vengono memorizzati il valore precedente, il valore nuovo, l’autore e la marca temporale. L’autore </w:t>
+              <w:t xml:space="preserve"> attraverso l’ispezione delle viste, che restituiscono immediatamente le porzioni del profilo pronte all’uso. Tale verifica </w:t>
             </w:r>
             <w:r>
               <w:rPr>
@@ -4717,23 +5826,7 @@
                 <w:color w:val="000000"/>
                 <w:sz w:val="24"/>
               </w:rPr>
-              <w:t xml:space="preserve"> ricavato da una variabile di sessione che l’applicazione puo’ impostare, con ripiego sull’utente di database, rendendo il registro utilizzabile come traccia di conformit</w:t>
-            </w:r>
-            <w:r>
-              <w:rPr>
-                <w:rFonts w:ascii="Times New Roman" w:hAnsi="Times New Roman"/>
-                <w:color w:val="000000"/>
-                <w:sz w:val="24"/>
-              </w:rPr>
-              <w:t>à</w:t>
-            </w:r>
-            <w:r>
-              <w:rPr>
-                <w:rFonts w:ascii="Times New Roman" w:hAnsi="Times New Roman"/>
-                <w:color w:val="000000"/>
-                <w:sz w:val="24"/>
-              </w:rPr>
-              <w:t>. Un trigger analogo aggiorna automaticamente il campo di ultimo aggiornamento.</w:t>
+              <w:t xml:space="preserve"> stata condotta sistematicamente durante lo sviluppo, assicurando che ogni modifica allo schema mantenesse la coerenza complessiva del sistema.</w:t>
             </w:r>
           </w:p>
           <w:p>
@@ -4747,7 +5840,85 @@
                 <w:color w:val="000000"/>
                 <w:sz w:val="24"/>
               </w:rPr>
-              <w:t>Gli asset adottano inoltre una cancellazione logica: anzich</w:t>
+              <w:t>Il diagramma Entit</w:t>
+            </w:r>
+            <w:r>
+              <w:rPr>
+                <w:rFonts w:ascii="Times New Roman" w:hAnsi="Times New Roman"/>
+                <w:color w:val="000000"/>
+                <w:sz w:val="24"/>
+              </w:rPr>
+              <w:t>à</w:t>
+            </w:r>
+            <w:r>
+              <w:rPr>
+                <w:rFonts w:ascii="Times New Roman" w:hAnsi="Times New Roman"/>
+                <w:color w:val="000000"/>
+                <w:sz w:val="24"/>
+              </w:rPr>
+              <w:t>-Relazione evidenzia con chiarezza la struttura delle dipendenze tra le tabelle. Dall’organizzazione dipendono direttamente le sedi, gli asset, i servizi, le persone, i contratti, le dipendenze, le misure di sicurezza e i profili. Gli asset, a loro volta, sono collegati al tipo che li classifica, alla sede che li ospita, allo storico delle modifiche, alle associazioni con i servizi, alle dipendenze, alle responsabilit</w:t>
+            </w:r>
+            <w:r>
+              <w:rPr>
+                <w:rFonts w:ascii="Times New Roman" w:hAnsi="Times New Roman"/>
+                <w:color w:val="000000"/>
+                <w:sz w:val="24"/>
+              </w:rPr>
+              <w:t>à</w:t>
+            </w:r>
+            <w:r>
+              <w:rPr>
+                <w:rFonts w:ascii="Times New Roman" w:hAnsi="Times New Roman"/>
+                <w:color w:val="000000"/>
+                <w:sz w:val="24"/>
+              </w:rPr>
+              <w:t xml:space="preserve"> e alle misure. I servizi sono collegati alle medesime tabelle associative, mentre i fornitori sono collegati ai contratti e alle dipendenze, e le persone alle responsabilit</w:t>
+            </w:r>
+            <w:r>
+              <w:rPr>
+                <w:rFonts w:ascii="Times New Roman" w:hAnsi="Times New Roman"/>
+                <w:color w:val="000000"/>
+                <w:sz w:val="24"/>
+              </w:rPr>
+              <w:t>à</w:t>
+            </w:r>
+            <w:r>
+              <w:rPr>
+                <w:rFonts w:ascii="Times New Roman" w:hAnsi="Times New Roman"/>
+                <w:color w:val="000000"/>
+                <w:sz w:val="24"/>
+              </w:rPr>
+              <w:t xml:space="preserve"> e ai profili. Le cardinalit</w:t>
+            </w:r>
+            <w:r>
+              <w:rPr>
+                <w:rFonts w:ascii="Times New Roman" w:hAnsi="Times New Roman"/>
+                <w:color w:val="000000"/>
+                <w:sz w:val="24"/>
+              </w:rPr>
+              <w:t>à</w:t>
+            </w:r>
+            <w:r>
+              <w:rPr>
+                <w:rFonts w:ascii="Times New Roman" w:hAnsi="Times New Roman"/>
+                <w:color w:val="000000"/>
+                <w:sz w:val="24"/>
+              </w:rPr>
+              <w:t>, tutte del tipo uno-a-molti, sono rese esplicite nel diagramma e trovano riscontro nelle chiavi esterne dello schema.</w:t>
+            </w:r>
+          </w:p>
+          <w:p>
+            <w:pPr>
+              <w:spacing w:after="120"/>
+              <w:jc w:val="both"/>
+            </w:pPr>
+            <w:r>
+              <w:rPr>
+                <w:rFonts w:ascii="Times New Roman" w:hAnsi="Times New Roman"/>
+                <w:color w:val="000000"/>
+                <w:sz w:val="24"/>
+              </w:rPr>
+              <w:t xml:space="preserve">Dal punto di vista dell’installazione, il sistema </w:t>
             </w:r>
             <w:r>
               <w:rPr>
@@ -4763,7 +5934,7 @@
                 <w:color w:val="000000"/>
                 <w:sz w:val="24"/>
               </w:rPr>
-              <w:t xml:space="preserve"> essere rimossi fisicamente, vengono contrassegnati come eliminati mediante un apposito flag, cosicch</w:t>
+              <w:t xml:space="preserve"> concepito per essere messo in esercizio in modo semplice e ripetibile. Dopo aver creato un database dedicato, si esegue lo script di struttura, che definisce tabelle, vincoli, indici, funzioni, trigger e viste e popola la sola tabella di riferimento delle tipologie di asset; si carica quindi lo script dei dati di test, che riempie le restanti tabelle e riallinea i contatori automatici degli identificatori. A questo punto il sistema </w:t>
             </w:r>
             <w:r>
               <w:rPr>
@@ -4779,23 +5950,21 @@
                 <w:color w:val="000000"/>
                 <w:sz w:val="24"/>
               </w:rPr>
-              <w:t xml:space="preserve"> le viste operative li escludono senza che la storicit</w:t>
-            </w:r>
-            <w:r>
-              <w:rPr>
-                <w:rFonts w:ascii="Times New Roman" w:hAnsi="Times New Roman"/>
-                <w:color w:val="000000"/>
-                <w:sz w:val="24"/>
-              </w:rPr>
-              <w:t>à</w:t>
-            </w:r>
-            <w:r>
-              <w:rPr>
-                <w:rFonts w:ascii="Times New Roman" w:hAnsi="Times New Roman"/>
-                <w:color w:val="000000"/>
-                <w:sz w:val="24"/>
-              </w:rPr>
-              <w:t xml:space="preserve"> del dato vada perduta. Il profilo ACN, a sua volta, </w:t>
+              <w:t xml:space="preserve"> pronto e le viste restituiscono immediatamente le porzioni del profilo. La separazione tra lo script di struttura e quello dei dati consente di ricreare l’ambiente da zero e di sostituire agevolmente il dataset di prova con dati reali.</w:t>
+            </w:r>
+          </w:p>
+          <w:p>
+            <w:pPr>
+              <w:spacing w:after="120"/>
+              <w:jc w:val="both"/>
+            </w:pPr>
+            <w:r>
+              <w:rPr>
+                <w:rFonts w:ascii="Times New Roman" w:hAnsi="Times New Roman"/>
+                <w:color w:val="000000"/>
+                <w:sz w:val="24"/>
+              </w:rPr>
+              <w:t xml:space="preserve">La strategia di indicizzazione </w:t>
             </w:r>
             <w:r>
               <w:rPr>
@@ -4811,23 +5980,39 @@
                 <w:color w:val="000000"/>
                 <w:sz w:val="24"/>
               </w:rPr>
-              <w:t xml:space="preserve"> versionato in una tabella dedicata, nella quale ogni riga rappresenta una versione del profilo con un ciclo di vita esplicito (bozza, inviato, approvato, da aggiornare); un vincolo di unicit</w:t>
-            </w:r>
-            <w:r>
-              <w:rPr>
-                <w:rFonts w:ascii="Times New Roman" w:hAnsi="Times New Roman"/>
-                <w:color w:val="000000"/>
-                <w:sz w:val="24"/>
-              </w:rPr>
-              <w:t>à</w:t>
-            </w:r>
-            <w:r>
-              <w:rPr>
-                <w:rFonts w:ascii="Times New Roman" w:hAnsi="Times New Roman"/>
-                <w:color w:val="000000"/>
-                <w:sz w:val="24"/>
-              </w:rPr>
-              <w:t xml:space="preserve"> sulla coppia organizzazione e numero di versione impedisce la presenza di versioni duplicate.</w:t>
+              <w:t xml:space="preserve"> stata calibrata sulle interrogazioni effettivamente utilizzate. </w:t>
+            </w:r>
+            <w:r>
+              <w:rPr>
+                <w:rFonts w:ascii="Times New Roman" w:hAnsi="Times New Roman"/>
+                <w:color w:val="000000"/>
+                <w:sz w:val="24"/>
+              </w:rPr>
+              <w:t>Poiché</w:t>
+            </w:r>
+            <w:r>
+              <w:rPr>
+                <w:rFonts w:ascii="Times New Roman" w:hAnsi="Times New Roman"/>
+                <w:color w:val="000000"/>
+                <w:sz w:val="24"/>
+              </w:rPr>
+              <w:t xml:space="preserve"> il sistema di gestione non crea automaticamente indici sulle chiavi esterne, questi sono stati aggiunti esplicitamente per tutte le colonne coinvolte nei join; gli indici sulle colonne di filtro accelerano le ricerche </w:t>
+            </w:r>
+            <w:r>
+              <w:rPr>
+                <w:rFonts w:ascii="Times New Roman" w:hAnsi="Times New Roman"/>
+                <w:color w:val="000000"/>
+                <w:sz w:val="24"/>
+              </w:rPr>
+              <w:t>più</w:t>
+            </w:r>
+            <w:r>
+              <w:rPr>
+                <w:rFonts w:ascii="Times New Roman" w:hAnsi="Times New Roman"/>
+                <w:color w:val="000000"/>
+                <w:sz w:val="24"/>
+              </w:rPr>
+              <w:t xml:space="preserve"> ricorrenti, come quelle per categoria di asset o per scadenza dei contratti; gli indici parziali, infine, si applicano soltanto a un sottoinsieme di righe, riducendo lo spazio occupato e il tempo di ricerca, come nel caso dell’indice sui soli asset operativi o su quello dei soli fornitori critici.</w:t>
             </w:r>
           </w:p>
           <w:p>
@@ -4841,87 +6026,8 @@
                 <w:color w:val="000000"/>
                 <w:sz w:val="24"/>
               </w:rPr>
-              <w:t>Sul piano dell’integrit</w:t>
-            </w:r>
-            <w:r>
-              <w:rPr>
-                <w:rFonts w:ascii="Times New Roman" w:hAnsi="Times New Roman"/>
-                <w:color w:val="000000"/>
-                <w:sz w:val="24"/>
-              </w:rPr>
-              <w:t>à</w:t>
-            </w:r>
-            <w:r>
-              <w:rPr>
-                <w:rFonts w:ascii="Times New Roman" w:hAnsi="Times New Roman"/>
-                <w:color w:val="000000"/>
-                <w:sz w:val="24"/>
-              </w:rPr>
-              <w:t>, oltre ai vincoli di chiave e di dominio, sono stati definiti due indici univoci parziali che garantiscono l’esistenza di un solo proprietario attivo per ciascun asset e per ciascun servizio, prevenendo cosi’ righe duplicate nelle viste di profilo e ambiguit</w:t>
-            </w:r>
-            <w:r>
-              <w:rPr>
-                <w:rFonts w:ascii="Times New Roman" w:hAnsi="Times New Roman"/>
-                <w:color w:val="000000"/>
-                <w:sz w:val="24"/>
-              </w:rPr>
-              <w:t>à</w:t>
-            </w:r>
-            <w:r>
-              <w:rPr>
-                <w:rFonts w:ascii="Times New Roman" w:hAnsi="Times New Roman"/>
-                <w:color w:val="000000"/>
-                <w:sz w:val="24"/>
-              </w:rPr>
-              <w:t xml:space="preserve"> nell’attribuzione delle responsabilit</w:t>
-            </w:r>
-            <w:r>
-              <w:rPr>
-                <w:rFonts w:ascii="Times New Roman" w:hAnsi="Times New Roman"/>
-                <w:color w:val="000000"/>
-                <w:sz w:val="24"/>
-              </w:rPr>
-              <w:t>à</w:t>
-            </w:r>
-            <w:r>
-              <w:rPr>
-                <w:rFonts w:ascii="Times New Roman" w:hAnsi="Times New Roman"/>
-                <w:color w:val="000000"/>
-                <w:sz w:val="24"/>
-              </w:rPr>
-              <w:t xml:space="preserve">. Le prestazioni sono garantite da tre categorie di indici: indici sulle chiavi esterne, necessari per accelerare le operazioni di join; indici sulle colonne </w:t>
-            </w:r>
-            <w:r>
-              <w:rPr>
-                <w:rFonts w:ascii="Times New Roman" w:hAnsi="Times New Roman"/>
-                <w:color w:val="000000"/>
-                <w:sz w:val="24"/>
-              </w:rPr>
-              <w:t>più</w:t>
-            </w:r>
-            <w:r>
-              <w:rPr>
-                <w:rFonts w:ascii="Times New Roman" w:hAnsi="Times New Roman"/>
-                <w:color w:val="000000"/>
-                <w:sz w:val="24"/>
-              </w:rPr>
-              <w:t xml:space="preserve"> frequentemente utilizzate nei filtri, quali la categoria degli asset, la criticit</w:t>
-            </w:r>
-            <w:r>
-              <w:rPr>
-                <w:rFonts w:ascii="Times New Roman" w:hAnsi="Times New Roman"/>
-                <w:color w:val="000000"/>
-                <w:sz w:val="24"/>
-              </w:rPr>
-              <w:t>à</w:t>
-            </w:r>
-            <w:r>
-              <w:rPr>
-                <w:rFonts w:ascii="Times New Roman" w:hAnsi="Times New Roman"/>
-                <w:color w:val="000000"/>
-                <w:sz w:val="24"/>
-              </w:rPr>
-              <w:t xml:space="preserve"> dei servizi e la scadenza dei contratti; e indici parziali, definiti con una condizione, che riducono la dimensione delle strutture e velocizzano le interrogazioni selettive, ad esempio quelle limitate agli asset operativi o ai fornitori critici.</w:t>
+              <w:lastRenderedPageBreak/>
+              <w:t>Il rispetto della terza forma normale ha comportato scelte precise anche nella disposizione dei dati. Le informazioni geografiche, ad esempio, risiedono nella tabella delle sedi e non vengono ripetute negli asset, che vi fanno semplicemente riferimento; analogamente, i dati anagrafici dei fornitori non compaiono nelle dipendenze, ma sono raggiunti tramite la chiave esterna. Questo garantisce che un’eventuale variazione di un dato, come il cambio di ragione sociale di un fornitore, debba essere effettuata in un unico punto, con evidente beneficio per la coerenza complessiva della base dati.</w:t>
             </w:r>
           </w:p>
           <w:p>
@@ -4935,804 +6041,7 @@
                 <w:color w:val="000000"/>
                 <w:sz w:val="24"/>
               </w:rPr>
-              <w:t xml:space="preserve">Per l’estrazione del profilo sono state definite cinque viste, ciascuna corrispondente a una sezione del profilo ACN: gli asset critici con il relativo proprietario, le dipendenze attive dalla catena di fornitura con i livelli di servizio, i referenti ufficiali verso l’ACN, lo stato delle misure di sicurezza e un quadro riepilogativo aggregato. Quest’ultima vista </w:t>
-            </w:r>
-            <w:r>
-              <w:rPr>
-                <w:rFonts w:ascii="Times New Roman" w:hAnsi="Times New Roman"/>
-                <w:color w:val="000000"/>
-                <w:sz w:val="24"/>
-              </w:rPr>
-              <w:t>è</w:t>
-            </w:r>
-            <w:r>
-              <w:rPr>
-                <w:rFonts w:ascii="Times New Roman" w:hAnsi="Times New Roman"/>
-                <w:color w:val="000000"/>
-                <w:sz w:val="24"/>
-              </w:rPr>
-              <w:t xml:space="preserve"> stata implementata mediante sottoquery scalari indipendenti, in modo da evitare il prodotto cartesiano che si sarebbe generato aggregando </w:t>
-            </w:r>
-            <w:r>
-              <w:rPr>
-                <w:rFonts w:ascii="Times New Roman" w:hAnsi="Times New Roman"/>
-                <w:color w:val="000000"/>
-                <w:sz w:val="24"/>
-              </w:rPr>
-              <w:t>più</w:t>
-            </w:r>
-            <w:r>
-              <w:rPr>
-                <w:rFonts w:ascii="Times New Roman" w:hAnsi="Times New Roman"/>
-                <w:color w:val="000000"/>
-                <w:sz w:val="24"/>
-              </w:rPr>
-              <w:t xml:space="preserve"> join contemporaneamente. Alle viste si affiancano undici interrogazioni di esportazione che producono, per ciascuna organizzazione, altrettanti file in formato CSV, comprensivi di colonne calcolate quali la classe di disponibilit</w:t>
-            </w:r>
-            <w:r>
-              <w:rPr>
-                <w:rFonts w:ascii="Times New Roman" w:hAnsi="Times New Roman"/>
-                <w:color w:val="000000"/>
-                <w:sz w:val="24"/>
-              </w:rPr>
-              <w:t>à</w:t>
-            </w:r>
-            <w:r>
-              <w:rPr>
-                <w:rFonts w:ascii="Times New Roman" w:hAnsi="Times New Roman"/>
-                <w:color w:val="000000"/>
-                <w:sz w:val="24"/>
-              </w:rPr>
-              <w:t xml:space="preserve"> dei servizi, lo stato dei contratti, l’elenco dei servizi supportati da ciascun asset e specifiche analisi di carenza, come l’individuazione degli asset privi di proprietario o dei contratti in scadenza.</w:t>
-            </w:r>
-          </w:p>
-          <w:p>
-            <w:pPr>
-              <w:spacing w:after="120"/>
-              <w:jc w:val="both"/>
-            </w:pPr>
-            <w:r>
-              <w:rPr>
-                <w:rFonts w:ascii="Times New Roman" w:hAnsi="Times New Roman"/>
-                <w:color w:val="000000"/>
-                <w:sz w:val="24"/>
-              </w:rPr>
-              <w:t xml:space="preserve">Il prodotto </w:t>
-            </w:r>
-            <w:r>
-              <w:rPr>
-                <w:rFonts w:ascii="Times New Roman" w:hAnsi="Times New Roman"/>
-                <w:color w:val="000000"/>
-                <w:sz w:val="24"/>
-              </w:rPr>
-              <w:t>è</w:t>
-            </w:r>
-            <w:r>
-              <w:rPr>
-                <w:rFonts w:ascii="Times New Roman" w:hAnsi="Times New Roman"/>
-                <w:color w:val="000000"/>
-                <w:sz w:val="24"/>
-              </w:rPr>
-              <w:t xml:space="preserve"> corredato da un dataset di test rappresentativo, composto da cinque organizzazioni appartenenti a settori diversi (energia, infrastrutture digitali, sanit</w:t>
-            </w:r>
-            <w:r>
-              <w:rPr>
-                <w:rFonts w:ascii="Times New Roman" w:hAnsi="Times New Roman"/>
-                <w:color w:val="000000"/>
-                <w:sz w:val="24"/>
-              </w:rPr>
-              <w:t>à</w:t>
-            </w:r>
-            <w:r>
-              <w:rPr>
-                <w:rFonts w:ascii="Times New Roman" w:hAnsi="Times New Roman"/>
-                <w:color w:val="000000"/>
-                <w:sz w:val="24"/>
-              </w:rPr>
-              <w:t>, trasporti e bancario) e da circa duecentonove record complessivi, distribuiti su tutte le tabelle. Il dataset consente di verificare le interrogazioni e la generazione dei file CSV senza dover accedere a sistemi reali, e include volutamente situazioni significative, come contratti gi</w:t>
-            </w:r>
-            <w:r>
-              <w:rPr>
-                <w:rFonts w:ascii="Times New Roman" w:hAnsi="Times New Roman"/>
-                <w:color w:val="000000"/>
-                <w:sz w:val="24"/>
-              </w:rPr>
-              <w:t>à</w:t>
-            </w:r>
-            <w:r>
-              <w:rPr>
-                <w:rFonts w:ascii="Times New Roman" w:hAnsi="Times New Roman"/>
-                <w:color w:val="000000"/>
-                <w:sz w:val="24"/>
-              </w:rPr>
-              <w:t xml:space="preserve"> scaduti e asset privi di responsabile, utili a </w:t>
-            </w:r>
-            <w:r>
-              <w:rPr>
-                <w:rFonts w:ascii="Times New Roman" w:hAnsi="Times New Roman"/>
-                <w:color w:val="000000"/>
-                <w:sz w:val="24"/>
-              </w:rPr>
-              <w:lastRenderedPageBreak/>
-              <w:t>mostrare il funzionamento delle analisi di carenza e degli avvisi. L’installazione avviene in tre passi: creazione del database, esecuzione dello script di struttura e caricamento dei dati di test, seguiti dall’eventuale esecuzione degli script di esportazione.</w:t>
-            </w:r>
-          </w:p>
-          <w:p>
-            <w:pPr>
-              <w:spacing w:after="120"/>
-              <w:jc w:val="both"/>
-            </w:pPr>
-            <w:r>
-              <w:rPr>
-                <w:rFonts w:ascii="Times New Roman" w:hAnsi="Times New Roman"/>
-                <w:color w:val="000000"/>
-                <w:sz w:val="24"/>
-              </w:rPr>
-              <w:t xml:space="preserve">Si descrivono di seguito, in maggiore dettaglio, le principali tabelle dello schema e i loro attributi </w:t>
-            </w:r>
-            <w:r>
-              <w:rPr>
-                <w:rFonts w:ascii="Times New Roman" w:hAnsi="Times New Roman"/>
-                <w:color w:val="000000"/>
-                <w:sz w:val="24"/>
-              </w:rPr>
-              <w:t>più</w:t>
-            </w:r>
-            <w:r>
-              <w:rPr>
-                <w:rFonts w:ascii="Times New Roman" w:hAnsi="Times New Roman"/>
-                <w:color w:val="000000"/>
-                <w:sz w:val="24"/>
-              </w:rPr>
-              <w:t xml:space="preserve"> significativi, cosi’ da chiarire il modo in cui il modello rappresenta le informazioni del profilo.</w:t>
-            </w:r>
-          </w:p>
-          <w:p>
-            <w:pPr>
-              <w:spacing w:after="120"/>
-              <w:jc w:val="both"/>
-            </w:pPr>
-            <w:r>
-              <w:rPr>
-                <w:rFonts w:ascii="Times New Roman" w:hAnsi="Times New Roman"/>
-                <w:color w:val="000000"/>
-                <w:sz w:val="24"/>
-              </w:rPr>
-              <w:t>La tabella organizzazione conserva la denominazione del soggetto, il codice fiscale, il settore e la categoria NIS2, la casella di posta elettronica certificata, il sito web e la data di registrazione presso l’ACN, oltre a un indicatore di stato attivo. Alcuni campi di servizio, quali gli istanti di creazione e di ultimo aggiornamento, ne consentono la tracciabilit</w:t>
-            </w:r>
-            <w:r>
-              <w:rPr>
-                <w:rFonts w:ascii="Times New Roman" w:hAnsi="Times New Roman"/>
-                <w:color w:val="000000"/>
-                <w:sz w:val="24"/>
-              </w:rPr>
-              <w:t>à</w:t>
-            </w:r>
-            <w:r>
-              <w:rPr>
-                <w:rFonts w:ascii="Times New Roman" w:hAnsi="Times New Roman"/>
-                <w:color w:val="000000"/>
-                <w:sz w:val="24"/>
-              </w:rPr>
-              <w:t xml:space="preserve"> temporale. La tabella sede descrive le sedi fisiche dell’organizzazione, con indirizzo, citt</w:t>
-            </w:r>
-            <w:r>
-              <w:rPr>
-                <w:rFonts w:ascii="Times New Roman" w:hAnsi="Times New Roman"/>
-                <w:color w:val="000000"/>
-                <w:sz w:val="24"/>
-              </w:rPr>
-              <w:t>à</w:t>
-            </w:r>
-            <w:r>
-              <w:rPr>
-                <w:rFonts w:ascii="Times New Roman" w:hAnsi="Times New Roman"/>
-                <w:color w:val="000000"/>
-                <w:sz w:val="24"/>
-              </w:rPr>
-              <w:t>, codice postale e paese, e un indicatore che individua la sede principale; a ciascuna sede possono essere associati gli asset in essa collocati.</w:t>
-            </w:r>
-          </w:p>
-          <w:p>
-            <w:pPr>
-              <w:spacing w:after="120"/>
-              <w:jc w:val="both"/>
-            </w:pPr>
-            <w:r>
-              <w:rPr>
-                <w:rFonts w:ascii="Times New Roman" w:hAnsi="Times New Roman"/>
-                <w:color w:val="000000"/>
-                <w:sz w:val="24"/>
-              </w:rPr>
-              <w:t>La tabella asset, centrale nel modello, conserva per ogni risorsa un codice di inventario univoco, il nome, la descrizione, la tipologia, la categoria di criticit</w:t>
-            </w:r>
-            <w:r>
-              <w:rPr>
-                <w:rFonts w:ascii="Times New Roman" w:hAnsi="Times New Roman"/>
-                <w:color w:val="000000"/>
-                <w:sz w:val="24"/>
-              </w:rPr>
-              <w:t>à</w:t>
-            </w:r>
-            <w:r>
-              <w:rPr>
-                <w:rFonts w:ascii="Times New Roman" w:hAnsi="Times New Roman"/>
-                <w:color w:val="000000"/>
-                <w:sz w:val="24"/>
-              </w:rPr>
-              <w:t>, lo stato operativo, l’eventuale indirizzo IP e la versione del software, oltre ai campi di audit e all’indicatore di cancellazione logica. La tabella servizio registra, per ciascun servizio, il nome, la descrizione, il tipo, la criticit</w:t>
-            </w:r>
-            <w:r>
-              <w:rPr>
-                <w:rFonts w:ascii="Times New Roman" w:hAnsi="Times New Roman"/>
-                <w:color w:val="000000"/>
-                <w:sz w:val="24"/>
-              </w:rPr>
-              <w:t>à</w:t>
-            </w:r>
-            <w:r>
-              <w:rPr>
-                <w:rFonts w:ascii="Times New Roman" w:hAnsi="Times New Roman"/>
-                <w:color w:val="000000"/>
-                <w:sz w:val="24"/>
-              </w:rPr>
-              <w:t>, lo stato e i parametri di continuit</w:t>
-            </w:r>
-            <w:r>
-              <w:rPr>
-                <w:rFonts w:ascii="Times New Roman" w:hAnsi="Times New Roman"/>
-                <w:color w:val="000000"/>
-                <w:sz w:val="24"/>
-              </w:rPr>
-              <w:t>à</w:t>
-            </w:r>
-            <w:r>
-              <w:rPr>
-                <w:rFonts w:ascii="Times New Roman" w:hAnsi="Times New Roman"/>
-                <w:color w:val="000000"/>
-                <w:sz w:val="24"/>
-              </w:rPr>
-              <w:t xml:space="preserve"> operativa, ossia il tempo massimo di ripristino e la massima perdita di dati tollerata, espressi in ore.</w:t>
-            </w:r>
-          </w:p>
-          <w:p>
-            <w:pPr>
-              <w:spacing w:after="120"/>
-              <w:jc w:val="both"/>
-            </w:pPr>
-            <w:r>
-              <w:rPr>
-                <w:rFonts w:ascii="Times New Roman" w:hAnsi="Times New Roman"/>
-                <w:color w:val="000000"/>
-                <w:sz w:val="24"/>
-              </w:rPr>
-              <w:t>La tabella fornitore raccoglie la ragione sociale, il codice identificativo, il paese, la tipologia e l’indicazione di criticit</w:t>
-            </w:r>
-            <w:r>
-              <w:rPr>
-                <w:rFonts w:ascii="Times New Roman" w:hAnsi="Times New Roman"/>
-                <w:color w:val="000000"/>
-                <w:sz w:val="24"/>
-              </w:rPr>
-              <w:t>à</w:t>
-            </w:r>
-            <w:r>
-              <w:rPr>
-                <w:rFonts w:ascii="Times New Roman" w:hAnsi="Times New Roman"/>
-                <w:color w:val="000000"/>
-                <w:sz w:val="24"/>
-              </w:rPr>
-              <w:t xml:space="preserve"> del fornitore. La tabella contratto ne formalizza i rapporti con l’organizzazione, riportando il numero, le date di inizio e di scadenza, l’oggetto, il livello di servizio garantito in termini di disponibilit</w:t>
-            </w:r>
-            <w:r>
-              <w:rPr>
-                <w:rFonts w:ascii="Times New Roman" w:hAnsi="Times New Roman"/>
-                <w:color w:val="000000"/>
-                <w:sz w:val="24"/>
-              </w:rPr>
-              <w:t>à</w:t>
-            </w:r>
-            <w:r>
-              <w:rPr>
-                <w:rFonts w:ascii="Times New Roman" w:hAnsi="Times New Roman"/>
-                <w:color w:val="000000"/>
-                <w:sz w:val="24"/>
-              </w:rPr>
-              <w:t xml:space="preserve"> percentuale, la presenza di clausole di sicurezza e il valore economico annuo. La tabella dipendenza collega un asset o un servizio a un fornitore, specificando la tipologia di dipendenza (licenza, hosting, manutenzione, connettivit</w:t>
-            </w:r>
-            <w:r>
-              <w:rPr>
-                <w:rFonts w:ascii="Times New Roman" w:hAnsi="Times New Roman"/>
-                <w:color w:val="000000"/>
-                <w:sz w:val="24"/>
-              </w:rPr>
-              <w:t>à</w:t>
-            </w:r>
-            <w:r>
-              <w:rPr>
-                <w:rFonts w:ascii="Times New Roman" w:hAnsi="Times New Roman"/>
-                <w:color w:val="000000"/>
-                <w:sz w:val="24"/>
-              </w:rPr>
-              <w:t>, servizi cloud e altre) e il livello di criticit</w:t>
-            </w:r>
-            <w:r>
-              <w:rPr>
-                <w:rFonts w:ascii="Times New Roman" w:hAnsi="Times New Roman"/>
-                <w:color w:val="000000"/>
-                <w:sz w:val="24"/>
-              </w:rPr>
-              <w:t>à</w:t>
-            </w:r>
-            <w:r>
-              <w:rPr>
-                <w:rFonts w:ascii="Times New Roman" w:hAnsi="Times New Roman"/>
-                <w:color w:val="000000"/>
-                <w:sz w:val="24"/>
-              </w:rPr>
-              <w:t>, e facendo eventualmente riferimento al contratto che la regola.</w:t>
-            </w:r>
-          </w:p>
-          <w:p>
-            <w:pPr>
-              <w:spacing w:after="120"/>
-              <w:jc w:val="both"/>
-            </w:pPr>
-            <w:r>
-              <w:rPr>
-                <w:rFonts w:ascii="Times New Roman" w:hAnsi="Times New Roman"/>
-                <w:color w:val="000000"/>
-                <w:sz w:val="24"/>
-              </w:rPr>
-              <w:t>La tabella persona descrive i referenti dell’organizzazione, con nome, cognome, contatti, ruolo organizzativo e l’indicazione del referente ufficiale verso l’ACN. La tabella responsabilit</w:t>
-            </w:r>
-            <w:r>
-              <w:rPr>
-                <w:rFonts w:ascii="Times New Roman" w:hAnsi="Times New Roman"/>
-                <w:color w:val="000000"/>
-                <w:sz w:val="24"/>
-              </w:rPr>
-              <w:t>à</w:t>
-            </w:r>
-            <w:r>
-              <w:rPr>
-                <w:rFonts w:ascii="Times New Roman" w:hAnsi="Times New Roman"/>
-                <w:color w:val="000000"/>
-                <w:sz w:val="24"/>
-              </w:rPr>
-              <w:t xml:space="preserve"> associa ciascuna persona a un asset o a un servizio con un ruolo specifico, quale proprietario, gestore o contatto tecnico, e con una validit</w:t>
-            </w:r>
-            <w:r>
-              <w:rPr>
-                <w:rFonts w:ascii="Times New Roman" w:hAnsi="Times New Roman"/>
-                <w:color w:val="000000"/>
-                <w:sz w:val="24"/>
-              </w:rPr>
-              <w:t>à</w:t>
-            </w:r>
-            <w:r>
-              <w:rPr>
-                <w:rFonts w:ascii="Times New Roman" w:hAnsi="Times New Roman"/>
-                <w:color w:val="000000"/>
-                <w:sz w:val="24"/>
-              </w:rPr>
-              <w:t xml:space="preserve"> temporale che consente di storicizzare gli avvicendamenti. La tabella asset_storico, alimentata dal trigger, conserva in modo immutabile la cronologia delle modifiche.</w:t>
-            </w:r>
-          </w:p>
-          <w:p>
-            <w:pPr>
-              <w:spacing w:after="120"/>
-              <w:jc w:val="both"/>
-            </w:pPr>
-            <w:r>
-              <w:rPr>
-                <w:rFonts w:ascii="Times New Roman" w:hAnsi="Times New Roman"/>
-                <w:color w:val="000000"/>
-                <w:sz w:val="24"/>
-              </w:rPr>
-              <w:t>La tabella misura_sicurezza traccia le misure adottate ai sensi dell’articolo 21, riportando il riferimento normativo puntuale, la categoria, il nome, lo stato di attuazione e le date di implementazione e di verifica. Le categorie previste rispecchiano gli ambiti indicati dalla direttiva: la governance e la gestione del rischio, la gestione degli incidenti, la continuit</w:t>
-            </w:r>
-            <w:r>
-              <w:rPr>
-                <w:rFonts w:ascii="Times New Roman" w:hAnsi="Times New Roman"/>
-                <w:color w:val="000000"/>
-                <w:sz w:val="24"/>
-              </w:rPr>
-              <w:t>à</w:t>
-            </w:r>
-            <w:r>
-              <w:rPr>
-                <w:rFonts w:ascii="Times New Roman" w:hAnsi="Times New Roman"/>
-                <w:color w:val="000000"/>
-                <w:sz w:val="24"/>
-              </w:rPr>
-              <w:t xml:space="preserve"> operativa, la sicurezza della catena di fornitura, la crittografia, il controllo degli accessi e la gestione delle vulnerabilit</w:t>
-            </w:r>
-            <w:r>
-              <w:rPr>
-                <w:rFonts w:ascii="Times New Roman" w:hAnsi="Times New Roman"/>
-                <w:color w:val="000000"/>
-                <w:sz w:val="24"/>
-              </w:rPr>
-              <w:t>à</w:t>
-            </w:r>
-            <w:r>
-              <w:rPr>
-                <w:rFonts w:ascii="Times New Roman" w:hAnsi="Times New Roman"/>
-                <w:color w:val="000000"/>
-                <w:sz w:val="24"/>
-              </w:rPr>
-              <w:t>. La tabella profilo_acn, infine, conserva le versioni del profilo compilato, con il riferimento alla persona che le ha redatte, il numero di versione, lo stato e la data di compilazione.</w:t>
-            </w:r>
-          </w:p>
-          <w:p>
-            <w:pPr>
-              <w:spacing w:after="120"/>
-              <w:jc w:val="both"/>
-            </w:pPr>
-            <w:r>
-              <w:rPr>
-                <w:rFonts w:ascii="Times New Roman" w:hAnsi="Times New Roman"/>
-                <w:color w:val="000000"/>
-                <w:sz w:val="24"/>
-              </w:rPr>
-              <w:t>Le undici interrogazioni di esportazione producono altrettante viste tabellari del profilo, pensate per essere salvate in file distinti e riutilizzabili. Nel dettaglio, esse generano l’anagrafica del soggetto con il referente ACN; l’elenco completo dei referenti; l’inventario degli asset critici e importanti con il proprietario e i servizi supportati; il perimetro dei servizi erogati con la classe di disponibilit</w:t>
-            </w:r>
-            <w:r>
-              <w:rPr>
-                <w:rFonts w:ascii="Times New Roman" w:hAnsi="Times New Roman"/>
-                <w:color w:val="000000"/>
-                <w:sz w:val="24"/>
-              </w:rPr>
-              <w:t>à</w:t>
-            </w:r>
-            <w:r>
-              <w:rPr>
-                <w:rFonts w:ascii="Times New Roman" w:hAnsi="Times New Roman"/>
-                <w:color w:val="000000"/>
-                <w:sz w:val="24"/>
-              </w:rPr>
-              <w:t xml:space="preserve">; le dipendenze dalla catena di fornitura con lo stato dei contratti; lo stato delle misure di sicurezza; un quadro riepilogativo dei contatori chiave; l’avviso sui contratti scaduti o in scadenza; l’analisi degli asset privi di proprietario; l’analisi delle misure non ancora attuate; e lo </w:t>
-            </w:r>
-            <w:r>
-              <w:rPr>
-                <w:rFonts w:ascii="Times New Roman" w:hAnsi="Times New Roman"/>
-                <w:color w:val="000000"/>
-                <w:sz w:val="24"/>
-              </w:rPr>
-              <w:lastRenderedPageBreak/>
-              <w:t>storico delle modifiche agli asset. A queste si aggiunge una vista di confronto sintetico fra tutte le organizzazioni registrate, utile a una lettura d’insieme.</w:t>
-            </w:r>
-          </w:p>
-          <w:p>
-            <w:pPr>
-              <w:spacing w:after="120"/>
-              <w:jc w:val="both"/>
-            </w:pPr>
-            <w:r>
-              <w:rPr>
-                <w:rFonts w:ascii="Times New Roman" w:hAnsi="Times New Roman"/>
-                <w:color w:val="000000"/>
-                <w:sz w:val="24"/>
-              </w:rPr>
-              <w:t>Alcune di queste interrogazioni non si limitano a estrarre i dati, ma li elaborano per produrre informazioni derivate: la classe di disponibilit</w:t>
-            </w:r>
-            <w:r>
-              <w:rPr>
-                <w:rFonts w:ascii="Times New Roman" w:hAnsi="Times New Roman"/>
-                <w:color w:val="000000"/>
-                <w:sz w:val="24"/>
-              </w:rPr>
-              <w:t>à</w:t>
-            </w:r>
-            <w:r>
-              <w:rPr>
-                <w:rFonts w:ascii="Times New Roman" w:hAnsi="Times New Roman"/>
-                <w:color w:val="000000"/>
-                <w:sz w:val="24"/>
-              </w:rPr>
-              <w:t xml:space="preserve"> di un servizio viene calcolata a partire dal tempo di ripristino, lo stato di un contratto (valido, in scadenza o scaduto) viene determinato confrontando la data di scadenza con la data corrente, e gli avvisi segnalano con una priorit</w:t>
-            </w:r>
-            <w:r>
-              <w:rPr>
-                <w:rFonts w:ascii="Times New Roman" w:hAnsi="Times New Roman"/>
-                <w:color w:val="000000"/>
-                <w:sz w:val="24"/>
-              </w:rPr>
-              <w:t>à</w:t>
-            </w:r>
-            <w:r>
-              <w:rPr>
-                <w:rFonts w:ascii="Times New Roman" w:hAnsi="Times New Roman"/>
-                <w:color w:val="000000"/>
-                <w:sz w:val="24"/>
-              </w:rPr>
-              <w:t xml:space="preserve"> graduata le situazioni che richiedono attenzione. In questo modo la base dati assume anche una funzione di supporto alle decisioni, evidenziando le carenze prima che si traducano in criticit</w:t>
-            </w:r>
-            <w:r>
-              <w:rPr>
-                <w:rFonts w:ascii="Times New Roman" w:hAnsi="Times New Roman"/>
-                <w:color w:val="000000"/>
-                <w:sz w:val="24"/>
-              </w:rPr>
-              <w:t>à</w:t>
-            </w:r>
-            <w:r>
-              <w:rPr>
-                <w:rFonts w:ascii="Times New Roman" w:hAnsi="Times New Roman"/>
-                <w:color w:val="000000"/>
-                <w:sz w:val="24"/>
-              </w:rPr>
-              <w:t>.</w:t>
-            </w:r>
-          </w:p>
-          <w:p>
-            <w:pPr>
-              <w:spacing w:after="120"/>
-              <w:jc w:val="both"/>
-            </w:pPr>
-            <w:r>
-              <w:rPr>
-                <w:rFonts w:ascii="Times New Roman" w:hAnsi="Times New Roman"/>
-                <w:color w:val="000000"/>
-                <w:sz w:val="24"/>
-              </w:rPr>
-              <w:t>La correttezza dello schema puo’ essere verificata mediante interrogazioni di controllo che confrontano il numero di oggetti creati e di record inseriti con i valori attesi, nonch</w:t>
-            </w:r>
-            <w:r>
-              <w:rPr>
-                <w:rFonts w:ascii="Times New Roman" w:hAnsi="Times New Roman"/>
-                <w:color w:val="000000"/>
-                <w:sz w:val="24"/>
-              </w:rPr>
-              <w:t>è</w:t>
-            </w:r>
-            <w:r>
-              <w:rPr>
-                <w:rFonts w:ascii="Times New Roman" w:hAnsi="Times New Roman"/>
-                <w:color w:val="000000"/>
-                <w:sz w:val="24"/>
-              </w:rPr>
-              <w:t xml:space="preserve"> attraverso l’ispezione delle viste, che restituiscono immediatamente le porzioni del profilo pronte all’uso. Tale verifica </w:t>
-            </w:r>
-            <w:r>
-              <w:rPr>
-                <w:rFonts w:ascii="Times New Roman" w:hAnsi="Times New Roman"/>
-                <w:color w:val="000000"/>
-                <w:sz w:val="24"/>
-              </w:rPr>
-              <w:t>è</w:t>
-            </w:r>
-            <w:r>
-              <w:rPr>
-                <w:rFonts w:ascii="Times New Roman" w:hAnsi="Times New Roman"/>
-                <w:color w:val="000000"/>
-                <w:sz w:val="24"/>
-              </w:rPr>
-              <w:t xml:space="preserve"> stata condotta sistematicamente durante lo sviluppo, assicurando che ogni modifica allo schema mantenesse la coerenza complessiva del sistema.</w:t>
-            </w:r>
-          </w:p>
-          <w:p>
-            <w:pPr>
-              <w:spacing w:after="120"/>
-              <w:jc w:val="both"/>
-            </w:pPr>
-            <w:r>
-              <w:rPr>
-                <w:rFonts w:ascii="Times New Roman" w:hAnsi="Times New Roman"/>
-                <w:color w:val="000000"/>
-                <w:sz w:val="24"/>
-              </w:rPr>
-              <w:t>Il diagramma Entit</w:t>
-            </w:r>
-            <w:r>
-              <w:rPr>
-                <w:rFonts w:ascii="Times New Roman" w:hAnsi="Times New Roman"/>
-                <w:color w:val="000000"/>
-                <w:sz w:val="24"/>
-              </w:rPr>
-              <w:t>à</w:t>
-            </w:r>
-            <w:r>
-              <w:rPr>
-                <w:rFonts w:ascii="Times New Roman" w:hAnsi="Times New Roman"/>
-                <w:color w:val="000000"/>
-                <w:sz w:val="24"/>
-              </w:rPr>
-              <w:t>-Relazione evidenzia con chiarezza la struttura delle dipendenze tra le tabelle. Dall’organizzazione dipendono direttamente le sedi, gli asset, i servizi, le persone, i contratti, le dipendenze, le misure di sicurezza e i profili. Gli asset, a loro volta, sono collegati al tipo che li classifica, alla sede che li ospita, allo storico delle modifiche, alle associazioni con i servizi, alle dipendenze, alle responsabilit</w:t>
-            </w:r>
-            <w:r>
-              <w:rPr>
-                <w:rFonts w:ascii="Times New Roman" w:hAnsi="Times New Roman"/>
-                <w:color w:val="000000"/>
-                <w:sz w:val="24"/>
-              </w:rPr>
-              <w:t>à</w:t>
-            </w:r>
-            <w:r>
-              <w:rPr>
-                <w:rFonts w:ascii="Times New Roman" w:hAnsi="Times New Roman"/>
-                <w:color w:val="000000"/>
-                <w:sz w:val="24"/>
-              </w:rPr>
-              <w:t xml:space="preserve"> e alle misure. I servizi sono collegati alle medesime tabelle associative, mentre i fornitori sono collegati ai contratti e alle dipendenze, e le persone alle responsabilit</w:t>
-            </w:r>
-            <w:r>
-              <w:rPr>
-                <w:rFonts w:ascii="Times New Roman" w:hAnsi="Times New Roman"/>
-                <w:color w:val="000000"/>
-                <w:sz w:val="24"/>
-              </w:rPr>
-              <w:t>à</w:t>
-            </w:r>
-            <w:r>
-              <w:rPr>
-                <w:rFonts w:ascii="Times New Roman" w:hAnsi="Times New Roman"/>
-                <w:color w:val="000000"/>
-                <w:sz w:val="24"/>
-              </w:rPr>
-              <w:t xml:space="preserve"> e ai profili. Le cardinalit</w:t>
-            </w:r>
-            <w:r>
-              <w:rPr>
-                <w:rFonts w:ascii="Times New Roman" w:hAnsi="Times New Roman"/>
-                <w:color w:val="000000"/>
-                <w:sz w:val="24"/>
-              </w:rPr>
-              <w:t>à</w:t>
-            </w:r>
-            <w:r>
-              <w:rPr>
-                <w:rFonts w:ascii="Times New Roman" w:hAnsi="Times New Roman"/>
-                <w:color w:val="000000"/>
-                <w:sz w:val="24"/>
-              </w:rPr>
-              <w:t>, tutte del tipo uno-a-molti, sono rese esplicite nel diagramma e trovano riscontro nelle chiavi esterne dello schema.</w:t>
-            </w:r>
-          </w:p>
-          <w:p>
-            <w:pPr>
-              <w:spacing w:after="120"/>
-              <w:jc w:val="both"/>
-            </w:pPr>
-            <w:r>
-              <w:rPr>
-                <w:rFonts w:ascii="Times New Roman" w:hAnsi="Times New Roman"/>
-                <w:color w:val="000000"/>
-                <w:sz w:val="24"/>
-              </w:rPr>
-              <w:t xml:space="preserve">Dal punto di vista dell’installazione, il sistema </w:t>
-            </w:r>
-            <w:r>
-              <w:rPr>
-                <w:rFonts w:ascii="Times New Roman" w:hAnsi="Times New Roman"/>
-                <w:color w:val="000000"/>
-                <w:sz w:val="24"/>
-              </w:rPr>
-              <w:t>è</w:t>
-            </w:r>
-            <w:r>
-              <w:rPr>
-                <w:rFonts w:ascii="Times New Roman" w:hAnsi="Times New Roman"/>
-                <w:color w:val="000000"/>
-                <w:sz w:val="24"/>
-              </w:rPr>
-              <w:t xml:space="preserve"> concepito per essere messo in esercizio in modo semplice e ripetibile. Dopo aver creato un database dedicato, si esegue lo script di struttura, che definisce tabelle, vincoli, indici, funzioni, trigger e viste e popola la sola tabella di riferimento delle tipologie di asset; si carica quindi lo script dei dati di test, che riempie le restanti tabelle e riallinea i contatori automatici degli identificatori. A questo punto il sistema </w:t>
-            </w:r>
-            <w:r>
-              <w:rPr>
-                <w:rFonts w:ascii="Times New Roman" w:hAnsi="Times New Roman"/>
-                <w:color w:val="000000"/>
-                <w:sz w:val="24"/>
-              </w:rPr>
-              <w:t>è</w:t>
-            </w:r>
-            <w:r>
-              <w:rPr>
-                <w:rFonts w:ascii="Times New Roman" w:hAnsi="Times New Roman"/>
-                <w:color w:val="000000"/>
-                <w:sz w:val="24"/>
-              </w:rPr>
-              <w:t xml:space="preserve"> pronto e le viste restituiscono immediatamente le porzioni del profilo. La separazione tra lo script di struttura e quello dei dati consente di ricreare l’ambiente da zero e di sostituire agevolmente il dataset di prova con dati reali.</w:t>
-            </w:r>
-          </w:p>
-          <w:p>
-            <w:pPr>
-              <w:spacing w:after="120"/>
-              <w:jc w:val="both"/>
-            </w:pPr>
-            <w:r>
-              <w:rPr>
-                <w:rFonts w:ascii="Times New Roman" w:hAnsi="Times New Roman"/>
-                <w:color w:val="000000"/>
-                <w:sz w:val="24"/>
-              </w:rPr>
-              <w:t xml:space="preserve">La strategia di indicizzazione </w:t>
-            </w:r>
-            <w:r>
-              <w:rPr>
-                <w:rFonts w:ascii="Times New Roman" w:hAnsi="Times New Roman"/>
-                <w:color w:val="000000"/>
-                <w:sz w:val="24"/>
-              </w:rPr>
-              <w:t>è</w:t>
-            </w:r>
-            <w:r>
-              <w:rPr>
-                <w:rFonts w:ascii="Times New Roman" w:hAnsi="Times New Roman"/>
-                <w:color w:val="000000"/>
-                <w:sz w:val="24"/>
-              </w:rPr>
-              <w:t xml:space="preserve"> stata calibrata sulle interrogazioni effettivamente utilizzate. </w:t>
-            </w:r>
-            <w:r>
-              <w:rPr>
-                <w:rFonts w:ascii="Times New Roman" w:hAnsi="Times New Roman"/>
-                <w:color w:val="000000"/>
-                <w:sz w:val="24"/>
-              </w:rPr>
-              <w:t>Poiché</w:t>
-            </w:r>
-            <w:r>
-              <w:rPr>
-                <w:rFonts w:ascii="Times New Roman" w:hAnsi="Times New Roman"/>
-                <w:color w:val="000000"/>
-                <w:sz w:val="24"/>
-              </w:rPr>
-              <w:t xml:space="preserve"> il sistema di gestione non crea automaticamente indici sulle chiavi esterne, questi sono stati aggiunti esplicitamente per tutte le colonne coinvolte nei join; gli indici sulle colonne di filtro accelerano le ricerche </w:t>
-            </w:r>
-            <w:r>
-              <w:rPr>
-                <w:rFonts w:ascii="Times New Roman" w:hAnsi="Times New Roman"/>
-                <w:color w:val="000000"/>
-                <w:sz w:val="24"/>
-              </w:rPr>
-              <w:t>più</w:t>
-            </w:r>
-            <w:r>
-              <w:rPr>
-                <w:rFonts w:ascii="Times New Roman" w:hAnsi="Times New Roman"/>
-                <w:color w:val="000000"/>
-                <w:sz w:val="24"/>
-              </w:rPr>
-              <w:t xml:space="preserve"> ricorrenti, come quelle per categoria di asset o per scadenza dei contratti; gli indici parziali, infine, si applicano soltanto a un sottoinsieme di righe, riducendo lo spazio occupato e il tempo di ricerca, come nel caso dell’indice sui soli asset operativi o su quello dei soli fornitori critici.</w:t>
-            </w:r>
-          </w:p>
-          <w:p>
-            <w:pPr>
-              <w:spacing w:after="120"/>
-              <w:jc w:val="both"/>
-            </w:pPr>
-            <w:r>
-              <w:rPr>
-                <w:rFonts w:ascii="Times New Roman" w:hAnsi="Times New Roman"/>
-                <w:color w:val="000000"/>
-                <w:sz w:val="24"/>
-              </w:rPr>
-              <w:t>Il rispetto della terza forma normale ha comportato scelte precise anche nella disposizione dei dati. Le informazioni geografiche, ad esempio, risiedono nella tabella delle sedi e non vengono ripetute negli asset, che vi fanno semplicemente riferimento; analogamente, i dati anagrafici dei fornitori non compaiono nelle dipendenze, ma sono raggiunti tramite la chiave esterna. Questo garantisce che un’eventuale variazione di un dato, come il cambio di ragione sociale di un fornitore, debba essere effettuata in un unico punto, con evidente beneficio per la coerenza complessiva della base dati.</w:t>
-            </w:r>
-          </w:p>
-          <w:p>
-            <w:pPr>
-              <w:spacing w:after="120"/>
-              <w:jc w:val="both"/>
-            </w:pPr>
-            <w:r>
-              <w:rPr>
-                <w:rFonts w:ascii="Times New Roman" w:hAnsi="Times New Roman"/>
-                <w:color w:val="000000"/>
-                <w:sz w:val="24"/>
-              </w:rPr>
-              <w:t xml:space="preserve">A titolo di esempio, se un asset inizialmente classificato come importante viene rivalutato come critico a seguito di un’analisi del rischio, il trigger registra automaticamente la variazione della categoria, conservando il valore precedente, quello nuovo, l’autore e il momento della modifica, </w:t>
-            </w:r>
-            <w:r>
-              <w:rPr>
-                <w:rFonts w:ascii="Times New Roman" w:hAnsi="Times New Roman"/>
-                <w:color w:val="000000"/>
-                <w:sz w:val="24"/>
-              </w:rPr>
-              <w:lastRenderedPageBreak/>
-              <w:t>insieme all’eventuale motivazione fornita dall’applicazione. La medesima logica si applica al cambio di stato di un asset, ad esempio quando viene posto in manutenzione, o all’aggiornamento della versione del software installato. Il registro cosi’ costituito consente di ricostruire in ogni momento la storia di ciascun asset, requisito prezioso sia per finalit</w:t>
+              <w:t>A titolo di esempio, se un asset inizialmente classificato come importante viene rivalutato come critico a seguito di un’analisi del rischio, il trigger registra automaticamente la variazione della categoria, conservando il valore precedente, quello nuovo, l’autore e il momento della modifica, insieme all’eventuale motivazione fornita dall’applicazione. La medesima logica si applica al cambio di stato di un asset, ad esempio quando viene posto in manutenzione, o all’aggiornamento della versione del software installato. Il registro cosi’ costituito consente di ricostruire in ogni momento la storia di ciascun asset, requisito prezioso sia per finalit</w:t>
             </w:r>
             <w:r>
               <w:rPr>
@@ -6136,13 +6445,47 @@
             <w:pPr>
               <w:spacing w:after="120"/>
               <w:jc w:val="both"/>
-            </w:pPr>
-            <w:r>
-              <w:rPr>
-                <w:rFonts w:ascii="Times New Roman" w:hAnsi="Times New Roman"/>
-                <w:color w:val="000000"/>
-                <w:sz w:val="24"/>
-              </w:rPr>
+              <w:rPr>
+                <w:rFonts w:ascii="Times New Roman" w:hAnsi="Times New Roman"/>
+                <w:color w:val="000000"/>
+                <w:sz w:val="24"/>
+              </w:rPr>
+            </w:pPr>
+          </w:p>
+          <w:p>
+            <w:pPr>
+              <w:spacing w:after="120"/>
+              <w:jc w:val="both"/>
+              <w:rPr>
+                <w:rFonts w:ascii="Times New Roman" w:hAnsi="Times New Roman"/>
+                <w:color w:val="000000"/>
+                <w:sz w:val="24"/>
+              </w:rPr>
+            </w:pPr>
+          </w:p>
+          <w:p>
+            <w:pPr>
+              <w:spacing w:after="120"/>
+              <w:jc w:val="both"/>
+              <w:rPr>
+                <w:rFonts w:ascii="Times New Roman" w:hAnsi="Times New Roman"/>
+                <w:color w:val="000000"/>
+                <w:sz w:val="24"/>
+              </w:rPr>
+            </w:pPr>
+          </w:p>
+          <w:p>
+            <w:pPr>
+              <w:spacing w:after="120"/>
+              <w:jc w:val="both"/>
+            </w:pPr>
+            <w:r>
+              <w:rPr>
+                <w:rFonts w:ascii="Times New Roman" w:hAnsi="Times New Roman"/>
+                <w:color w:val="000000"/>
+                <w:sz w:val="24"/>
+              </w:rPr>
+              <w:lastRenderedPageBreak/>
               <w:t xml:space="preserve">Il meccanismo di storicizzazione </w:t>
             </w:r>
             <w:r>
@@ -6347,14 +6690,6 @@
                 <w:sz w:val="18"/>
               </w:rPr>
               <w:br/>
-            </w:r>
-            <w:r>
-              <w:rPr>
-                <w:rFonts w:ascii="Courier New" w:hAnsi="Courier New"/>
-                <w:color w:val="1F3864"/>
-                <w:sz w:val="18"/>
-              </w:rPr>
-              <w:lastRenderedPageBreak/>
               <w:t>END;</w:t>
             </w:r>
             <w:r>
@@ -6554,6 +6889,11 @@
             <w:pPr>
               <w:spacing w:before="40" w:after="160"/>
               <w:ind w:left="280"/>
+              <w:rPr>
+                <w:rFonts w:ascii="Courier New" w:hAnsi="Courier New"/>
+                <w:color w:val="1F3864"/>
+                <w:sz w:val="18"/>
+              </w:rPr>
             </w:pPr>
             <w:r>
               <w:rPr>
@@ -6655,6 +6995,286 @@
           </w:p>
           <w:p>
             <w:pPr>
+              <w:spacing w:after="160"/>
+              <w:ind w:left="280"/>
+              <w:rPr>
+                <w:rFonts w:ascii="Times New Roman" w:hAnsi="Times New Roman"/>
+                <w:color w:val="000000"/>
+                <w:sz w:val="24"/>
+              </w:rPr>
+            </w:pPr>
+          </w:p>
+          <w:p>
+            <w:pPr>
+              <w:spacing w:after="160"/>
+              <w:ind w:left="280"/>
+              <w:rPr>
+                <w:rFonts w:ascii="Times New Roman" w:hAnsi="Times New Roman"/>
+                <w:color w:val="000000"/>
+                <w:sz w:val="24"/>
+              </w:rPr>
+            </w:pPr>
+          </w:p>
+          <w:p>
+            <w:pPr>
+              <w:spacing w:after="160"/>
+              <w:ind w:left="280"/>
+              <w:rPr>
+                <w:rFonts w:ascii="Times New Roman" w:hAnsi="Times New Roman"/>
+                <w:color w:val="000000"/>
+                <w:sz w:val="24"/>
+              </w:rPr>
+            </w:pPr>
+          </w:p>
+          <w:p>
+            <w:pPr>
+              <w:spacing w:after="160"/>
+              <w:ind w:left="280"/>
+              <w:rPr>
+                <w:rFonts w:ascii="Times New Roman" w:hAnsi="Times New Roman"/>
+                <w:color w:val="000000"/>
+                <w:sz w:val="24"/>
+              </w:rPr>
+            </w:pPr>
+          </w:p>
+          <w:p>
+            <w:pPr>
+              <w:spacing w:after="160"/>
+              <w:ind w:left="280"/>
+              <w:rPr>
+                <w:rFonts w:ascii="Times New Roman" w:hAnsi="Times New Roman"/>
+                <w:color w:val="000000"/>
+                <w:sz w:val="24"/>
+              </w:rPr>
+            </w:pPr>
+            <w:r>
+              <w:rPr>
+                <w:rFonts w:ascii="Times New Roman" w:hAnsi="Times New Roman"/>
+                <w:color w:val="000000"/>
+                <w:sz w:val="24"/>
+              </w:rPr>
+              <w:lastRenderedPageBreak/>
+              <w:t>Un ultimo esempio riguarda il calcolo del divario fra profilo target e profilo attuale, che costituisce il nucleo della vista di gap analysis:</w:t>
+            </w:r>
+          </w:p>
+          <w:p>
+            <w:pPr>
+              <w:ind w:left="280"/>
+              <w:rPr>
+                <w:rFonts w:ascii="Courier New" w:hAnsi="Courier New"/>
+                <w:color w:val="1F3864"/>
+                <w:sz w:val="18"/>
+              </w:rPr>
+            </w:pPr>
+            <w:r>
+              <w:rPr>
+                <w:rFonts w:ascii="Courier New" w:hAnsi="Courier New"/>
+                <w:color w:val="1F3864"/>
+                <w:sz w:val="18"/>
+              </w:rPr>
+              <w:t>SELECT o.nome AS organizzazione, a.subcategory_cod,</w:t>
+            </w:r>
+          </w:p>
+          <w:p>
+            <w:pPr>
+              <w:ind w:left="280"/>
+              <w:rPr>
+                <w:rFonts w:ascii="Courier New" w:hAnsi="Courier New"/>
+                <w:color w:val="1F3864"/>
+                <w:sz w:val="18"/>
+              </w:rPr>
+            </w:pPr>
+            <w:r>
+              <w:rPr>
+                <w:rFonts w:ascii="Courier New" w:hAnsi="Courier New"/>
+                <w:color w:val="1F3864"/>
+                <w:sz w:val="18"/>
+              </w:rPr>
+              <w:t xml:space="preserve">       a.priorita, a.livello_target, a.livello_attuale,</w:t>
+            </w:r>
+          </w:p>
+          <w:p>
+            <w:pPr>
+              <w:ind w:left="280"/>
+              <w:rPr>
+                <w:rFonts w:ascii="Courier New" w:hAnsi="Courier New"/>
+                <w:color w:val="1F3864"/>
+                <w:sz w:val="18"/>
+              </w:rPr>
+            </w:pPr>
+            <w:r>
+              <w:rPr>
+                <w:rFonts w:ascii="Courier New" w:hAnsi="Courier New"/>
+                <w:color w:val="1F3864"/>
+                <w:sz w:val="18"/>
+              </w:rPr>
+              <w:t xml:space="preserve">       (a.livello_target - a.livello_attuale) AS gap,</w:t>
+            </w:r>
+          </w:p>
+          <w:p>
+            <w:pPr>
+              <w:ind w:left="280"/>
+              <w:rPr>
+                <w:rFonts w:ascii="Courier New" w:hAnsi="Courier New"/>
+                <w:color w:val="1F3864"/>
+                <w:sz w:val="18"/>
+              </w:rPr>
+            </w:pPr>
+            <w:r>
+              <w:rPr>
+                <w:rFonts w:ascii="Courier New" w:hAnsi="Courier New"/>
+                <w:color w:val="1F3864"/>
+                <w:sz w:val="18"/>
+              </w:rPr>
+              <w:t xml:space="preserve">       CASE WHEN </w:t>
+            </w:r>
+            <w:proofErr w:type="gramStart"/>
+            <w:r>
+              <w:rPr>
+                <w:rFonts w:ascii="Courier New" w:hAnsi="Courier New"/>
+                <w:color w:val="1F3864"/>
+                <w:sz w:val="18"/>
+              </w:rPr>
+              <w:t>a.livello</w:t>
+            </w:r>
+            <w:proofErr w:type="gramEnd"/>
+            <w:r>
+              <w:rPr>
+                <w:rFonts w:ascii="Courier New" w:hAnsi="Courier New"/>
+                <w:color w:val="1F3864"/>
+                <w:sz w:val="18"/>
+              </w:rPr>
+              <w:t xml:space="preserve">_attuale &gt;= </w:t>
+            </w:r>
+            <w:proofErr w:type="gramStart"/>
+            <w:r>
+              <w:rPr>
+                <w:rFonts w:ascii="Courier New" w:hAnsi="Courier New"/>
+                <w:color w:val="1F3864"/>
+                <w:sz w:val="18"/>
+              </w:rPr>
+              <w:t>a.livello</w:t>
+            </w:r>
+            <w:proofErr w:type="gramEnd"/>
+            <w:r>
+              <w:rPr>
+                <w:rFonts w:ascii="Courier New" w:hAnsi="Courier New"/>
+                <w:color w:val="1F3864"/>
+                <w:sz w:val="18"/>
+              </w:rPr>
+              <w:t>_target THEN 'Raggiunto'</w:t>
+            </w:r>
+          </w:p>
+          <w:p>
+            <w:pPr>
+              <w:ind w:left="280"/>
+              <w:rPr>
+                <w:rFonts w:ascii="Courier New" w:hAnsi="Courier New"/>
+                <w:color w:val="1F3864"/>
+                <w:sz w:val="18"/>
+              </w:rPr>
+            </w:pPr>
+            <w:r>
+              <w:rPr>
+                <w:rFonts w:ascii="Courier New" w:hAnsi="Courier New"/>
+                <w:color w:val="1F3864"/>
+                <w:sz w:val="18"/>
+              </w:rPr>
+              <w:t xml:space="preserve">            ELSE 'Da colmare' END AS stato</w:t>
+            </w:r>
+          </w:p>
+          <w:p>
+            <w:pPr>
+              <w:ind w:left="280"/>
+              <w:rPr>
+                <w:rFonts w:ascii="Courier New" w:hAnsi="Courier New"/>
+                <w:color w:val="1F3864"/>
+                <w:sz w:val="18"/>
+              </w:rPr>
+            </w:pPr>
+            <w:r>
+              <w:rPr>
+                <w:rFonts w:ascii="Courier New" w:hAnsi="Courier New"/>
+                <w:color w:val="1F3864"/>
+                <w:sz w:val="18"/>
+              </w:rPr>
+              <w:t>FROM assessment a</w:t>
+            </w:r>
+          </w:p>
+          <w:p>
+            <w:pPr>
+              <w:ind w:left="280"/>
+              <w:rPr>
+                <w:rFonts w:ascii="Courier New" w:hAnsi="Courier New"/>
+                <w:color w:val="1F3864"/>
+                <w:sz w:val="18"/>
+              </w:rPr>
+            </w:pPr>
+            <w:r>
+              <w:rPr>
+                <w:rFonts w:ascii="Courier New" w:hAnsi="Courier New"/>
+                <w:color w:val="1F3864"/>
+                <w:sz w:val="18"/>
+              </w:rPr>
+              <w:t>JOIN organizzazione o ON o.id = a.organizzazione_id</w:t>
+            </w:r>
+          </w:p>
+          <w:p>
+            <w:pPr>
+              <w:ind w:left="280"/>
+              <w:rPr>
+                <w:rFonts w:ascii="Courier New" w:hAnsi="Courier New"/>
+                <w:color w:val="1F3864"/>
+                <w:sz w:val="18"/>
+              </w:rPr>
+            </w:pPr>
+            <w:r>
+              <w:rPr>
+                <w:rFonts w:ascii="Courier New" w:hAnsi="Courier New"/>
+                <w:color w:val="1F3864"/>
+                <w:sz w:val="18"/>
+              </w:rPr>
+              <w:t xml:space="preserve">ORDER BY CASE </w:t>
+            </w:r>
+            <w:proofErr w:type="gramStart"/>
+            <w:r>
+              <w:rPr>
+                <w:rFonts w:ascii="Courier New" w:hAnsi="Courier New"/>
+                <w:color w:val="1F3864"/>
+                <w:sz w:val="18"/>
+              </w:rPr>
+              <w:t>a.priorita</w:t>
+            </w:r>
+            <w:proofErr w:type="gramEnd"/>
+            <w:r>
+              <w:rPr>
+                <w:rFonts w:ascii="Courier New" w:hAnsi="Courier New"/>
+                <w:color w:val="1F3864"/>
+                <w:sz w:val="18"/>
+              </w:rPr>
+              <w:t xml:space="preserve"> WHEN 'alta' THEN 1 WHEN 'media' THEN 2 ELSE 3 END,</w:t>
+            </w:r>
+          </w:p>
+          <w:p>
+            <w:pPr>
+              <w:ind w:left="280"/>
+              <w:rPr>
+                <w:rFonts w:ascii="Courier New" w:hAnsi="Courier New"/>
+                <w:color w:val="1F3864"/>
+                <w:sz w:val="18"/>
+              </w:rPr>
+            </w:pPr>
+            <w:r>
+              <w:rPr>
+                <w:rFonts w:ascii="Courier New" w:hAnsi="Courier New"/>
+                <w:color w:val="1F3864"/>
+                <w:sz w:val="18"/>
+              </w:rPr>
+              <w:t xml:space="preserve">         (a.livello_target - a.livello_attuale) DESC;</w:t>
+            </w:r>
+          </w:p>
+          <w:p>
+            <w:pPr>
               <w:spacing w:after="120"/>
               <w:jc w:val="both"/>
             </w:pPr>
@@ -6852,8 +7472,152 @@
                 <w:color w:val="000000"/>
                 <w:sz w:val="24"/>
               </w:rPr>
-              <w:t xml:space="preserve"> o su tabelle distinte: la soluzione adottata privilegia la compattezza e la chiarezza dello schema. Analogamente, la cancellazione </w:t>
-            </w:r>
+              <w:t xml:space="preserve"> o su tabelle distinte: la soluzione adottata privilegia la compattezza e la chiarezza dello schema. Analogamente, la cancellazione logica degli asset antepone la conservazione della storicit</w:t>
+            </w:r>
+            <w:r>
+              <w:rPr>
+                <w:rFonts w:ascii="Times New Roman" w:hAnsi="Times New Roman"/>
+                <w:color w:val="000000"/>
+                <w:sz w:val="24"/>
+              </w:rPr>
+              <w:t>à</w:t>
+            </w:r>
+            <w:r>
+              <w:rPr>
+                <w:rFonts w:ascii="Times New Roman" w:hAnsi="Times New Roman"/>
+                <w:color w:val="000000"/>
+                <w:sz w:val="24"/>
+              </w:rPr>
+              <w:t xml:space="preserve"> alla minimizzazione dello spazio occupato. In tutti i casi, la ridondanza introdotta </w:t>
+            </w:r>
+            <w:r>
+              <w:rPr>
+                <w:rFonts w:ascii="Times New Roman" w:hAnsi="Times New Roman"/>
+                <w:color w:val="000000"/>
+                <w:sz w:val="24"/>
+              </w:rPr>
+              <w:t>è</w:t>
+            </w:r>
+            <w:r>
+              <w:rPr>
+                <w:rFonts w:ascii="Times New Roman" w:hAnsi="Times New Roman"/>
+                <w:color w:val="000000"/>
+                <w:sz w:val="24"/>
+              </w:rPr>
+              <w:t xml:space="preserve"> controllata e non compromette la coerenza complessiva dei dati.</w:t>
+            </w:r>
+          </w:p>
+          <w:p>
+            <w:pPr>
+              <w:spacing w:after="120"/>
+              <w:jc w:val="both"/>
+            </w:pPr>
+            <w:r>
+              <w:rPr>
+                <w:rFonts w:ascii="Times New Roman" w:hAnsi="Times New Roman"/>
+                <w:color w:val="000000"/>
+                <w:sz w:val="24"/>
+              </w:rPr>
+              <w:t>A completamento della documentazione sono state definite alcune linee guida per il popolamento e la manutenzione dei dati. In fase di inserimento si raccomanda di rispettare l’ordine di caricamento imposto dalle dipendenze referenziali, popolando dapprima le entit</w:t>
+            </w:r>
+            <w:r>
+              <w:rPr>
+                <w:rFonts w:ascii="Times New Roman" w:hAnsi="Times New Roman"/>
+                <w:color w:val="000000"/>
+                <w:sz w:val="24"/>
+              </w:rPr>
+              <w:t>à</w:t>
+            </w:r>
+            <w:r>
+              <w:rPr>
+                <w:rFonts w:ascii="Times New Roman" w:hAnsi="Times New Roman"/>
+                <w:color w:val="000000"/>
+                <w:sz w:val="24"/>
+              </w:rPr>
+              <w:t xml:space="preserve"> principali e successivamente le tabelle associative; di valorizzare sempre i campi che classificano gli asset e i servizi per criticit</w:t>
+            </w:r>
+            <w:r>
+              <w:rPr>
+                <w:rFonts w:ascii="Times New Roman" w:hAnsi="Times New Roman"/>
+                <w:color w:val="000000"/>
+                <w:sz w:val="24"/>
+              </w:rPr>
+              <w:t>à</w:t>
+            </w:r>
+            <w:r>
+              <w:rPr>
+                <w:rFonts w:ascii="Times New Roman" w:hAnsi="Times New Roman"/>
+                <w:color w:val="000000"/>
+                <w:sz w:val="24"/>
+              </w:rPr>
+              <w:t>, essenziali ai fini delle estrazioni; e di impostare la variabile di sessione che identifica l’autore delle modifiche, cosi’ da alimentare correttamente il registro di audit. In fase di manutenzione, la cancellazione logica va preferita a quella fisica, le associazioni terminate vanno chiuse valorizzandone la data di fine anzich</w:t>
+            </w:r>
+            <w:r>
+              <w:rPr>
+                <w:rFonts w:ascii="Times New Roman" w:hAnsi="Times New Roman"/>
+                <w:color w:val="000000"/>
+                <w:sz w:val="24"/>
+              </w:rPr>
+              <w:t>è</w:t>
+            </w:r>
+            <w:r>
+              <w:rPr>
+                <w:rFonts w:ascii="Times New Roman" w:hAnsi="Times New Roman"/>
+                <w:color w:val="000000"/>
+                <w:sz w:val="24"/>
+              </w:rPr>
+              <w:t xml:space="preserve"> eliminandole, e ogni nuova versione del profilo va tracciata nell’apposita tabella.</w:t>
+            </w:r>
+          </w:p>
+          <w:p>
+            <w:pPr>
+              <w:spacing w:after="120"/>
+              <w:jc w:val="both"/>
+              <w:rPr>
+                <w:rFonts w:ascii="Times New Roman" w:hAnsi="Times New Roman"/>
+                <w:color w:val="000000"/>
+                <w:sz w:val="24"/>
+              </w:rPr>
+            </w:pPr>
+          </w:p>
+          <w:p>
+            <w:pPr>
+              <w:spacing w:after="120"/>
+              <w:jc w:val="both"/>
+              <w:rPr>
+                <w:rFonts w:ascii="Times New Roman" w:hAnsi="Times New Roman"/>
+                <w:color w:val="000000"/>
+                <w:sz w:val="24"/>
+              </w:rPr>
+            </w:pPr>
+          </w:p>
+          <w:p>
+            <w:pPr>
+              <w:spacing w:after="120"/>
+              <w:jc w:val="both"/>
+              <w:rPr>
+                <w:rFonts w:ascii="Times New Roman" w:hAnsi="Times New Roman"/>
+                <w:color w:val="000000"/>
+                <w:sz w:val="24"/>
+              </w:rPr>
+            </w:pPr>
+          </w:p>
+          <w:p>
+            <w:pPr>
+              <w:spacing w:after="120"/>
+              <w:jc w:val="both"/>
+              <w:rPr>
+                <w:rFonts w:ascii="Times New Roman" w:hAnsi="Times New Roman"/>
+                <w:color w:val="000000"/>
+                <w:sz w:val="24"/>
+              </w:rPr>
+            </w:pPr>
+          </w:p>
+          <w:p>
+            <w:pPr>
+              <w:spacing w:after="120"/>
+              <w:jc w:val="both"/>
+            </w:pPr>
             <w:r>
               <w:rPr>
                 <w:rFonts w:ascii="Times New Roman" w:hAnsi="Times New Roman"/>
@@ -6861,114 +7625,6 @@
                 <w:sz w:val="24"/>
               </w:rPr>
               <w:lastRenderedPageBreak/>
-              <w:t>logica degli asset antepone la conservazione della storicit</w:t>
-            </w:r>
-            <w:r>
-              <w:rPr>
-                <w:rFonts w:ascii="Times New Roman" w:hAnsi="Times New Roman"/>
-                <w:color w:val="000000"/>
-                <w:sz w:val="24"/>
-              </w:rPr>
-              <w:t>à</w:t>
-            </w:r>
-            <w:r>
-              <w:rPr>
-                <w:rFonts w:ascii="Times New Roman" w:hAnsi="Times New Roman"/>
-                <w:color w:val="000000"/>
-                <w:sz w:val="24"/>
-              </w:rPr>
-              <w:t xml:space="preserve"> alla minimizzazione dello spazio occupato. In tutti i casi, la ridondanza introdotta </w:t>
-            </w:r>
-            <w:r>
-              <w:rPr>
-                <w:rFonts w:ascii="Times New Roman" w:hAnsi="Times New Roman"/>
-                <w:color w:val="000000"/>
-                <w:sz w:val="24"/>
-              </w:rPr>
-              <w:t>è</w:t>
-            </w:r>
-            <w:r>
-              <w:rPr>
-                <w:rFonts w:ascii="Times New Roman" w:hAnsi="Times New Roman"/>
-                <w:color w:val="000000"/>
-                <w:sz w:val="24"/>
-              </w:rPr>
-              <w:t xml:space="preserve"> controllata e non compromette la coerenza complessiva dei dati.</w:t>
-            </w:r>
-          </w:p>
-          <w:p>
-            <w:pPr>
-              <w:spacing w:after="120"/>
-              <w:jc w:val="both"/>
-            </w:pPr>
-            <w:r>
-              <w:rPr>
-                <w:rFonts w:ascii="Times New Roman" w:hAnsi="Times New Roman"/>
-                <w:color w:val="000000"/>
-                <w:sz w:val="24"/>
-              </w:rPr>
-              <w:t>A completamento della documentazione sono state definite alcune linee guida per il popolamento e la manutenzione dei dati. In fase di inserimento si raccomanda di rispettare l’ordine di caricamento imposto dalle dipendenze referenziali, popolando dapprima le entit</w:t>
-            </w:r>
-            <w:r>
-              <w:rPr>
-                <w:rFonts w:ascii="Times New Roman" w:hAnsi="Times New Roman"/>
-                <w:color w:val="000000"/>
-                <w:sz w:val="24"/>
-              </w:rPr>
-              <w:t>à</w:t>
-            </w:r>
-            <w:r>
-              <w:rPr>
-                <w:rFonts w:ascii="Times New Roman" w:hAnsi="Times New Roman"/>
-                <w:color w:val="000000"/>
-                <w:sz w:val="24"/>
-              </w:rPr>
-              <w:t xml:space="preserve"> principali e successivamente le tabelle associative; di valorizzare sempre i campi che classificano gli asset e i servizi per criticit</w:t>
-            </w:r>
-            <w:r>
-              <w:rPr>
-                <w:rFonts w:ascii="Times New Roman" w:hAnsi="Times New Roman"/>
-                <w:color w:val="000000"/>
-                <w:sz w:val="24"/>
-              </w:rPr>
-              <w:t>à</w:t>
-            </w:r>
-            <w:r>
-              <w:rPr>
-                <w:rFonts w:ascii="Times New Roman" w:hAnsi="Times New Roman"/>
-                <w:color w:val="000000"/>
-                <w:sz w:val="24"/>
-              </w:rPr>
-              <w:t>, essenziali ai fini delle estrazioni; e di impostare la variabile di sessione che identifica l’autore delle modifiche, cosi’ da alimentare correttamente il registro di audit. In fase di manutenzione, la cancellazione logica va preferita a quella fisica, le associazioni terminate vanno chiuse valorizzandone la data di fine anzich</w:t>
-            </w:r>
-            <w:r>
-              <w:rPr>
-                <w:rFonts w:ascii="Times New Roman" w:hAnsi="Times New Roman"/>
-                <w:color w:val="000000"/>
-                <w:sz w:val="24"/>
-              </w:rPr>
-              <w:t>è</w:t>
-            </w:r>
-            <w:r>
-              <w:rPr>
-                <w:rFonts w:ascii="Times New Roman" w:hAnsi="Times New Roman"/>
-                <w:color w:val="000000"/>
-                <w:sz w:val="24"/>
-              </w:rPr>
-              <w:t xml:space="preserve"> eliminandole, e ogni nuova versione del profilo va tracciata nell’apposita tabella.</w:t>
-            </w:r>
-          </w:p>
-          <w:p>
-            <w:pPr>
-              <w:spacing w:after="120"/>
-              <w:jc w:val="both"/>
-            </w:pPr>
-            <w:r>
-              <w:rPr>
-                <w:rFonts w:ascii="Times New Roman" w:hAnsi="Times New Roman"/>
-                <w:color w:val="000000"/>
-                <w:sz w:val="24"/>
-              </w:rPr>
               <w:t>L’elaborato comprende le</w:t>
             </w:r>
             <w:r>
@@ -7055,15 +7711,15 @@
                 <w:rFonts w:ascii="Courier New" w:hAnsi="Courier New"/>
                 <w:color w:val="1F3864"/>
                 <w:sz w:val="18"/>
-                <w:lang w:val="en-US"/>
-              </w:rPr>
-            </w:pPr>
-            <w:r>
-              <w:rPr>
-                <w:rFonts w:ascii="Courier New" w:hAnsi="Courier New"/>
-                <w:color w:val="1F3864"/>
-                <w:sz w:val="18"/>
-                <w:lang w:val="en-US"/>
+                <w:lang w:val="it-IT"/>
+              </w:rPr>
+            </w:pPr>
+            <w:r>
+              <w:rPr>
+                <w:rFonts w:ascii="Courier New" w:hAnsi="Courier New"/>
+                <w:color w:val="1F3864"/>
+                <w:sz w:val="18"/>
+                <w:lang w:val="it-IT"/>
               </w:rPr>
               <w:t>&amp; "C:\Program Files\PostgreSQL\18\bin\createdb.exe" -U postgres nis2db</w:t>
             </w:r>
@@ -7076,15 +7732,15 @@
                 <w:rFonts w:ascii="Courier New" w:hAnsi="Courier New"/>
                 <w:color w:val="1F3864"/>
                 <w:sz w:val="18"/>
-                <w:lang w:val="en-US"/>
-              </w:rPr>
-            </w:pPr>
-            <w:r>
-              <w:rPr>
-                <w:rFonts w:ascii="Courier New" w:hAnsi="Courier New"/>
-                <w:color w:val="1F3864"/>
-                <w:sz w:val="18"/>
-                <w:lang w:val="en-US"/>
+                <w:lang w:val="it-IT"/>
+              </w:rPr>
+            </w:pPr>
+            <w:r>
+              <w:rPr>
+                <w:rFonts w:ascii="Courier New" w:hAnsi="Courier New"/>
+                <w:color w:val="1F3864"/>
+                <w:sz w:val="18"/>
+                <w:lang w:val="it-IT"/>
               </w:rPr>
               <w:t>Creazione schema dati db:</w:t>
             </w:r>
@@ -7187,26 +7843,17 @@
                 <w:rFonts w:ascii="Courier New" w:hAnsi="Courier New"/>
                 <w:color w:val="1F3864"/>
                 <w:sz w:val="18"/>
+                <w:lang w:val="it-IT"/>
+              </w:rPr>
+              <w:t xml:space="preserve">  </w:t>
+            </w:r>
+            <w:r>
+              <w:rPr>
+                <w:rFonts w:ascii="Courier New" w:hAnsi="Courier New"/>
+                <w:color w:val="1F3864"/>
+                <w:sz w:val="18"/>
                 <w:lang w:val="en-US"/>
               </w:rPr>
-              <w:t xml:space="preserve"> </w:t>
-            </w:r>
-            <w:r>
-              <w:rPr>
-                <w:rFonts w:ascii="Courier New" w:hAnsi="Courier New"/>
-                <w:color w:val="1F3864"/>
-                <w:sz w:val="18"/>
-                <w:lang w:val="en-US"/>
-              </w:rPr>
-              <w:t xml:space="preserve"> </w:t>
-            </w:r>
-            <w:r>
-              <w:rPr>
-                <w:rFonts w:ascii="Courier New" w:hAnsi="Courier New"/>
-                <w:color w:val="1F3864"/>
-                <w:sz w:val="18"/>
-                <w:lang w:val="en-US"/>
-              </w:rPr>
               <w:t>&amp; "C:\Program Files\PostgreSQL\18\bin\psql.exe" -U postgres -d nis2db -f ..\sql\nis2_export_csv.sql</w:t>
             </w:r>
           </w:p>
@@ -7361,70 +8008,110 @@
                 <w:color w:val="000000"/>
                 <w:sz w:val="24"/>
               </w:rPr>
+              <w:t xml:space="preserve">La verifica del prodotto </w:t>
+            </w:r>
+            <w:r>
+              <w:rPr>
+                <w:rFonts w:ascii="Times New Roman" w:hAnsi="Times New Roman"/>
+                <w:color w:val="000000"/>
+                <w:sz w:val="24"/>
+              </w:rPr>
+              <w:t>è</w:t>
+            </w:r>
+            <w:r>
+              <w:rPr>
+                <w:rFonts w:ascii="Times New Roman" w:hAnsi="Times New Roman"/>
+                <w:color w:val="000000"/>
+                <w:sz w:val="24"/>
+              </w:rPr>
+              <w:t xml:space="preserve"> affidata a un dataset simulato e a un insieme di controlli, che consentono di collaudare le interrogazioni e la generazione dei file senza accedere a sistemi reali, come espressamente richiesto dalla traccia. Il dataset comprende cinque organizzazioni e circa </w:t>
+            </w:r>
+            <w:r>
+              <w:rPr>
+                <w:rFonts w:ascii="Times New Roman" w:hAnsi="Times New Roman"/>
+                <w:color w:val="000000"/>
+                <w:sz w:val="24"/>
+              </w:rPr>
+              <w:t xml:space="preserve">trecentoundici </w:t>
+            </w:r>
+            <w:r>
+              <w:rPr>
+                <w:rFonts w:ascii="Times New Roman" w:hAnsi="Times New Roman"/>
+                <w:color w:val="000000"/>
+                <w:sz w:val="24"/>
+              </w:rPr>
+              <w:t>record complessivi, distribuiti su tutte le tabelle secondo conteggi noti e verificabili.</w:t>
+            </w:r>
+          </w:p>
+          <w:p>
+            <w:pPr>
+              <w:spacing w:after="120"/>
+              <w:jc w:val="both"/>
+            </w:pPr>
+            <w:r>
+              <w:rPr>
+                <w:rFonts w:ascii="Times New Roman" w:hAnsi="Times New Roman"/>
+                <w:color w:val="000000"/>
+                <w:sz w:val="24"/>
+              </w:rPr>
+              <w:t xml:space="preserve">La correttezza dell’installazione puo’ essere accertata confrontando il numero degli oggetti creati con quello previsto: lo schema definisce </w:t>
+            </w:r>
+            <w:r>
+              <w:rPr>
+                <w:rFonts w:ascii="Times New Roman" w:hAnsi="Times New Roman"/>
+                <w:color w:val="000000"/>
+                <w:sz w:val="24"/>
+              </w:rPr>
+              <w:t>sedici tabelle, nove viste</w:t>
+            </w:r>
+            <w:r>
+              <w:rPr>
+                <w:rFonts w:ascii="Times New Roman" w:hAnsi="Times New Roman"/>
+                <w:color w:val="000000"/>
+                <w:sz w:val="24"/>
+              </w:rPr>
+              <w:t xml:space="preserve">, due funzioni e sei trigger, oltre a un ampio insieme di indici. Analogamente, il numero dei record inseriti in ciascuna tabella </w:t>
+            </w:r>
+            <w:r>
+              <w:rPr>
+                <w:rFonts w:ascii="Times New Roman" w:hAnsi="Times New Roman"/>
+                <w:color w:val="000000"/>
+                <w:sz w:val="24"/>
+              </w:rPr>
+              <w:t>è</w:t>
+            </w:r>
+            <w:r>
+              <w:rPr>
+                <w:rFonts w:ascii="Times New Roman" w:hAnsi="Times New Roman"/>
+                <w:color w:val="000000"/>
+                <w:sz w:val="24"/>
+              </w:rPr>
+              <w:t xml:space="preserve"> confrontabile con i valori attesi, ad esempio ventinove asset, quindici servizi, venti dipendenze e venticinque misure di sicurezza. L’esecuzione delle viste restituisce immediatamente le porzioni del profilo, offrendo un ulteriore riscontro della coerenza dei dati. Il dataset include volutamente casi limite, quali contratti gi</w:t>
+            </w:r>
+            <w:r>
+              <w:rPr>
+                <w:rFonts w:ascii="Times New Roman" w:hAnsi="Times New Roman"/>
+                <w:color w:val="000000"/>
+                <w:sz w:val="24"/>
+              </w:rPr>
+              <w:t>à</w:t>
+            </w:r>
+            <w:r>
+              <w:rPr>
+                <w:rFonts w:ascii="Times New Roman" w:hAnsi="Times New Roman"/>
+                <w:color w:val="000000"/>
+                <w:sz w:val="24"/>
+              </w:rPr>
+              <w:t xml:space="preserve"> scaduti e asset privi di responsabile, che consentono di verificare il </w:t>
+            </w:r>
+            <w:r>
+              <w:rPr>
+                <w:rFonts w:ascii="Times New Roman" w:hAnsi="Times New Roman"/>
+                <w:color w:val="000000"/>
+                <w:sz w:val="24"/>
+              </w:rPr>
               <w:lastRenderedPageBreak/>
-              <w:t xml:space="preserve">La verifica del prodotto </w:t>
-            </w:r>
-            <w:r>
-              <w:rPr>
-                <w:rFonts w:ascii="Times New Roman" w:hAnsi="Times New Roman"/>
-                <w:color w:val="000000"/>
-                <w:sz w:val="24"/>
-              </w:rPr>
-              <w:t>è</w:t>
-            </w:r>
-            <w:r>
-              <w:rPr>
-                <w:rFonts w:ascii="Times New Roman" w:hAnsi="Times New Roman"/>
-                <w:color w:val="000000"/>
-                <w:sz w:val="24"/>
-              </w:rPr>
-              <w:t xml:space="preserve"> affidata a un dataset simulato e a un insieme di controlli, che consentono di collaudare le interrogazioni e la generazione dei file senza accedere a sistemi reali, come espressamente richiesto dalla traccia. Il dataset comprende cinque organizzazioni e circa duecentonove record complessivi, distribuiti su tutte le tabelle secondo conteggi noti e verificabili.</w:t>
-            </w:r>
-          </w:p>
-          <w:p>
-            <w:pPr>
-              <w:spacing w:after="120"/>
-              <w:jc w:val="both"/>
-            </w:pPr>
-            <w:r>
-              <w:rPr>
-                <w:rFonts w:ascii="Times New Roman" w:hAnsi="Times New Roman"/>
-                <w:color w:val="000000"/>
-                <w:sz w:val="24"/>
-              </w:rPr>
-              <w:t xml:space="preserve">La correttezza dell’installazione puo’ essere accertata confrontando il numero degli oggetti creati con quello previsto: lo schema definisce quattordici tabelle, cinque viste, due funzioni e sei trigger, oltre a un ampio insieme di indici. Analogamente, il numero dei record inseriti in ciascuna tabella </w:t>
-            </w:r>
-            <w:r>
-              <w:rPr>
-                <w:rFonts w:ascii="Times New Roman" w:hAnsi="Times New Roman"/>
-                <w:color w:val="000000"/>
-                <w:sz w:val="24"/>
-              </w:rPr>
-              <w:t>è</w:t>
-            </w:r>
-            <w:r>
-              <w:rPr>
-                <w:rFonts w:ascii="Times New Roman" w:hAnsi="Times New Roman"/>
-                <w:color w:val="000000"/>
-                <w:sz w:val="24"/>
-              </w:rPr>
-              <w:t xml:space="preserve"> confrontabile con i valori attesi, ad esempio ventinove asset, quindici servizi, venti dipendenze e venticinque misure di sicurezza. L’esecuzione delle cinque viste restituisce immediatamente le porzioni del profilo, offrendo un ulteriore riscontro della coerenza dei dati. Il dataset include volutamente casi limite, quali contratti gi</w:t>
-            </w:r>
-            <w:r>
-              <w:rPr>
-                <w:rFonts w:ascii="Times New Roman" w:hAnsi="Times New Roman"/>
-                <w:color w:val="000000"/>
-                <w:sz w:val="24"/>
-              </w:rPr>
-              <w:t>à</w:t>
-            </w:r>
-            <w:r>
-              <w:rPr>
-                <w:rFonts w:ascii="Times New Roman" w:hAnsi="Times New Roman"/>
-                <w:color w:val="000000"/>
-                <w:sz w:val="24"/>
-              </w:rPr>
-              <w:t xml:space="preserve"> scaduti e asset privi di responsabile, che consentono di verificare il corretto funzionamento delle analisi di carenza e degli avvisi: in tal modo il collaudo non si limita al caso nominale, ma copre anche le situazioni che il sistema </w:t>
+              <w:t xml:space="preserve">corretto funzionamento delle analisi di carenza e degli avvisi: in tal modo il collaudo non si limita al caso nominale, ma copre anche le situazioni che il sistema </w:t>
             </w:r>
             <w:r>
               <w:rPr>
@@ -7618,7 +8305,7 @@
                           <pic:cNvPicPr/>
                         </pic:nvPicPr>
                         <pic:blipFill>
-                          <a:blip r:embed="rId31">
+                          <a:blip r:embed="rId32">
                             <a:extLst>
                               <a:ext uri="{28A0092B-C50C-407E-A947-70E740481C1C}">
                                 <a14:useLocalDpi xmlns:a14="http://schemas.microsoft.com/office/drawing/2010/main" val="0"/>
@@ -7657,6 +8344,11 @@
             <w:pPr>
               <w:spacing w:after="120"/>
               <w:jc w:val="both"/>
+              <w:rPr>
+                <w:rFonts w:ascii="Times New Roman" w:hAnsi="Times New Roman"/>
+                <w:color w:val="000000"/>
+                <w:sz w:val="24"/>
+              </w:rPr>
             </w:pPr>
             <w:r>
               <w:rPr>
@@ -7735,6 +8427,11 @@
             <w:pPr>
               <w:spacing w:after="120"/>
               <w:jc w:val="both"/>
+              <w:rPr>
+                <w:rFonts w:ascii="Times New Roman" w:hAnsi="Times New Roman"/>
+                <w:color w:val="000000"/>
+                <w:sz w:val="24"/>
+              </w:rPr>
             </w:pPr>
             <w:r>
               <w:rPr>
@@ -7774,7 +8471,93 @@
                 <w:color w:val="000000"/>
                 <w:sz w:val="24"/>
               </w:rPr>
-              <w:t xml:space="preserve"> organizzative associate ad asset e servizi; per monitorare lo stato di attuazione delle misure di sicurezza previste dall’articolo 21; e, infine, per estrarre </w:t>
+              <w:t xml:space="preserve"> organizzative associate ad asset e servizi; per monitorare lo stato di attuazione delle misure di sicurezza previste dall’articolo 21; e, infine, per estrarre automaticamente le sezioni del profilo ACN in formato strutturato, pronte per essere trasmesse o integrate in altri sistemi.</w:t>
+            </w:r>
+          </w:p>
+          <w:p>
+            <w:pPr>
+              <w:spacing w:after="120"/>
+              <w:jc w:val="both"/>
+              <w:rPr>
+                <w:rFonts w:ascii="Times New Roman" w:hAnsi="Times New Roman"/>
+                <w:color w:val="000000"/>
+                <w:sz w:val="24"/>
+              </w:rPr>
+            </w:pPr>
+            <w:r>
+              <w:rPr>
+                <w:rFonts w:ascii="Times New Roman" w:hAnsi="Times New Roman"/>
+                <w:color w:val="000000"/>
+                <w:sz w:val="24"/>
+              </w:rPr>
+              <w:t>I vantaggi derivanti dall’applicazione sono molteplici. La normalizzazione garantisce la coerenza e la non ridondanza dei dati; l’audit trail e il versionamento ne assicurano l’aggiornabilit</w:t>
+            </w:r>
+            <w:r>
+              <w:rPr>
+                <w:rFonts w:ascii="Times New Roman" w:hAnsi="Times New Roman"/>
+                <w:color w:val="000000"/>
+                <w:sz w:val="24"/>
+              </w:rPr>
+              <w:t>à</w:t>
+            </w:r>
+            <w:r>
+              <w:rPr>
+                <w:rFonts w:ascii="Times New Roman" w:hAnsi="Times New Roman"/>
+                <w:color w:val="000000"/>
+                <w:sz w:val="24"/>
+              </w:rPr>
+              <w:t xml:space="preserve"> e la tracciabilit</w:t>
+            </w:r>
+            <w:r>
+              <w:rPr>
+                <w:rFonts w:ascii="Times New Roman" w:hAnsi="Times New Roman"/>
+                <w:color w:val="000000"/>
+                <w:sz w:val="24"/>
+              </w:rPr>
+              <w:t>à</w:t>
+            </w:r>
+            <w:r>
+              <w:rPr>
+                <w:rFonts w:ascii="Times New Roman" w:hAnsi="Times New Roman"/>
+                <w:color w:val="000000"/>
+                <w:sz w:val="24"/>
+              </w:rPr>
+              <w:t xml:space="preserve"> nel tempo; l’automazione delle estrazioni riduce gli errori manuali e rende le operazioni ripetibili; le analisi di carenza e gli avvisi consentono di individuare tempestivamente situazioni critiche, quali asset privi di responsabile o contratti in scadenza, trasformando la base dati da semplice archivio a strumento di supporto alle decisioni. Il prodotto puo’ inoltre costituire il livello dati su cui innestare un applicativo gestionale o integrazioni con sistemi preesistenti.</w:t>
+            </w:r>
+          </w:p>
+          <w:p>
+            <w:pPr>
+              <w:spacing w:after="120"/>
+              <w:jc w:val="both"/>
+              <w:rPr>
+                <w:rFonts w:ascii="Times New Roman" w:hAnsi="Times New Roman"/>
+                <w:color w:val="000000"/>
+                <w:sz w:val="24"/>
+              </w:rPr>
+            </w:pPr>
+            <w:r>
+              <w:rPr>
+                <w:rFonts w:ascii="Times New Roman" w:hAnsi="Times New Roman"/>
+                <w:color w:val="000000"/>
+                <w:sz w:val="24"/>
+              </w:rPr>
+              <w:t>A titolo esemplificativo, un operatore del settore energetico puo’ impiegare la base dati per censire i sistemi di supervisione e controllo e le loro dipendenze dai fornitori di manutenzione e di connettivit</w:t>
+            </w:r>
+            <w:r>
+              <w:rPr>
+                <w:rFonts w:ascii="Times New Roman" w:hAnsi="Times New Roman"/>
+                <w:color w:val="000000"/>
+                <w:sz w:val="24"/>
+              </w:rPr>
+              <w:t>à</w:t>
+            </w:r>
+            <w:r>
+              <w:rPr>
+                <w:rFonts w:ascii="Times New Roman" w:hAnsi="Times New Roman"/>
+                <w:color w:val="000000"/>
+                <w:sz w:val="24"/>
+              </w:rPr>
+              <w:t xml:space="preserve">; una struttura sanitaria puo’ tracciare i sistemi informativi ospedalieri e i dispositivi </w:t>
             </w:r>
             <w:r>
               <w:rPr>
@@ -7783,105 +8566,34 @@
                 <w:sz w:val="24"/>
               </w:rPr>
               <w:lastRenderedPageBreak/>
-              <w:t>automaticamente le sezioni del profilo ACN in formato strutturato, pronte per essere trasmesse o integrate in altri sistemi.</w:t>
+              <w:t>medici connessi, con i relativi responsabili; un istituto bancario puo’ mappare i sistemi di pagamento e le dipendenze dai circuiti interbancari. In tutti questi casi il modello resta invariato, cambiando soltanto i dati, il che testimonia la generalit</w:t>
+            </w:r>
+            <w:r>
+              <w:rPr>
+                <w:rFonts w:ascii="Times New Roman" w:hAnsi="Times New Roman"/>
+                <w:color w:val="000000"/>
+                <w:sz w:val="24"/>
+              </w:rPr>
+              <w:t>à</w:t>
+            </w:r>
+            <w:r>
+              <w:rPr>
+                <w:rFonts w:ascii="Times New Roman" w:hAnsi="Times New Roman"/>
+                <w:color w:val="000000"/>
+                <w:sz w:val="24"/>
+              </w:rPr>
+              <w:t xml:space="preserve"> della soluzione.</w:t>
             </w:r>
           </w:p>
           <w:p>
             <w:pPr>
               <w:spacing w:after="120"/>
               <w:jc w:val="both"/>
-            </w:pPr>
-            <w:r>
-              <w:rPr>
-                <w:rFonts w:ascii="Times New Roman" w:hAnsi="Times New Roman"/>
-                <w:color w:val="000000"/>
-                <w:sz w:val="24"/>
-              </w:rPr>
-              <w:t>I vantaggi derivanti dall’applicazione sono molteplici. La normalizzazione garantisce la coerenza e la non ridondanza dei dati; l’audit trail e il versionamento ne assicurano l’aggiornabilit</w:t>
-            </w:r>
-            <w:r>
-              <w:rPr>
-                <w:rFonts w:ascii="Times New Roman" w:hAnsi="Times New Roman"/>
-                <w:color w:val="000000"/>
-                <w:sz w:val="24"/>
-              </w:rPr>
-              <w:t>à</w:t>
-            </w:r>
-            <w:r>
-              <w:rPr>
-                <w:rFonts w:ascii="Times New Roman" w:hAnsi="Times New Roman"/>
-                <w:color w:val="000000"/>
-                <w:sz w:val="24"/>
-              </w:rPr>
-              <w:t xml:space="preserve"> e la tracciabilit</w:t>
-            </w:r>
-            <w:r>
-              <w:rPr>
-                <w:rFonts w:ascii="Times New Roman" w:hAnsi="Times New Roman"/>
-                <w:color w:val="000000"/>
-                <w:sz w:val="24"/>
-              </w:rPr>
-              <w:t>à</w:t>
-            </w:r>
-            <w:r>
-              <w:rPr>
-                <w:rFonts w:ascii="Times New Roman" w:hAnsi="Times New Roman"/>
-                <w:color w:val="000000"/>
-                <w:sz w:val="24"/>
-              </w:rPr>
-              <w:t xml:space="preserve"> nel tempo; l’automazione delle estrazioni riduce gli errori manuali e rende le operazioni ripetibili; le analisi di carenza e gli avvisi consentono di individuare tempestivamente situazioni critiche, quali asset privi di responsabile o contratti in scadenza, trasformando la base dati da semplice archivio a strumento di supporto alle decisioni. Il prodotto puo’ inoltre costituire il livello dati su cui innestare un applicativo gestionale o integrazioni con sistemi preesistenti.</w:t>
-            </w:r>
-          </w:p>
-          <w:p>
-            <w:pPr>
-              <w:spacing w:after="120"/>
-              <w:jc w:val="both"/>
-            </w:pPr>
-            <w:r>
-              <w:rPr>
-                <w:rFonts w:ascii="Times New Roman" w:hAnsi="Times New Roman"/>
-                <w:color w:val="000000"/>
-                <w:sz w:val="24"/>
-              </w:rPr>
-              <w:t>A titolo esemplificativo, un operatore del settore energetico puo’ impiegare la base dati per censire i sistemi di supervisione e controllo e le loro dipendenze dai fornitori di manutenzione e di connettivit</w:t>
-            </w:r>
-            <w:r>
-              <w:rPr>
-                <w:rFonts w:ascii="Times New Roman" w:hAnsi="Times New Roman"/>
-                <w:color w:val="000000"/>
-                <w:sz w:val="24"/>
-              </w:rPr>
-              <w:t>à</w:t>
-            </w:r>
-            <w:r>
-              <w:rPr>
-                <w:rFonts w:ascii="Times New Roman" w:hAnsi="Times New Roman"/>
-                <w:color w:val="000000"/>
-                <w:sz w:val="24"/>
-              </w:rPr>
-              <w:t>; una struttura sanitaria puo’ tracciare i sistemi informativi ospedalieri e i dispositivi medici connessi, con i relativi responsabili; un istituto bancario puo’ mappare i sistemi di pagamento e le dipendenze dai circuiti interbancari. In tutti questi casi il modello resta invariato, cambiando soltanto i dati, il che testimonia la generalit</w:t>
-            </w:r>
-            <w:r>
-              <w:rPr>
-                <w:rFonts w:ascii="Times New Roman" w:hAnsi="Times New Roman"/>
-                <w:color w:val="000000"/>
-                <w:sz w:val="24"/>
-              </w:rPr>
-              <w:t>à</w:t>
-            </w:r>
-            <w:r>
-              <w:rPr>
-                <w:rFonts w:ascii="Times New Roman" w:hAnsi="Times New Roman"/>
-                <w:color w:val="000000"/>
-                <w:sz w:val="24"/>
-              </w:rPr>
-              <w:t xml:space="preserve"> della soluzione.</w:t>
-            </w:r>
-          </w:p>
-          <w:p>
-            <w:pPr>
-              <w:spacing w:after="120"/>
-              <w:jc w:val="both"/>
+              <w:rPr>
+                <w:rFonts w:ascii="Times New Roman" w:hAnsi="Times New Roman"/>
+                <w:color w:val="000000"/>
+                <w:sz w:val="24"/>
+              </w:rPr>
             </w:pPr>
             <w:r>
               <w:rPr>
@@ -7928,10 +8640,9 @@
             <w:pPr>
               <w:jc w:val="both"/>
               <w:rPr>
-                <w:rFonts w:ascii="Times New Roman" w:hAnsi="Times New Roman" w:cs="Times New Roman"/>
-                <w:sz w:val="28"/>
-                <w:szCs w:val="28"/>
-                <w:lang w:val="it-IT"/>
+                <w:rFonts w:ascii="Times New Roman" w:hAnsi="Times New Roman"/>
+                <w:color w:val="000000"/>
+                <w:sz w:val="24"/>
               </w:rPr>
             </w:pPr>
             <w:r>
@@ -7973,6 +8684,24 @@
                 <w:sz w:val="24"/>
               </w:rPr>
               <w:t xml:space="preserve"> e dimostrare con evidenze concrete lo stato di attuazione delle misure di sicurezza.</w:t>
+            </w:r>
+          </w:p>
+          <w:p>
+            <w:pPr>
+              <w:jc w:val="both"/>
+              <w:rPr>
+                <w:rFonts w:ascii="Times New Roman" w:hAnsi="Times New Roman"/>
+                <w:color w:val="000000"/>
+                <w:sz w:val="24"/>
+              </w:rPr>
+            </w:pPr>
+            <w:r>
+              <w:rPr>
+                <w:rFonts w:ascii="Times New Roman" w:hAnsi="Times New Roman"/>
+                <w:color w:val="000000"/>
+                <w:sz w:val="24"/>
+              </w:rPr>
+              <w:t>L’integrazione del Framework Nazionale amplia ulteriormente gli impieghi possibili: la base dati consente di condurre un’autovalutazione periodica della postura di sicurezza, di documentarne l’evoluzione nel tempo confrontando rilevazioni successive e di produrre, a partire dai divari misurati, un piano di adeguamento ordinato per priorità. Ne beneficiano tanto le funzioni tecniche, che individuano gli interventi da avviare, quanto gli organi di governo, ai quali la percentuale di completamento del profilo offre un indicatore sintetico e immediatamente comprensibile dello stato di conformità.</w:t>
             </w:r>
           </w:p>
         </w:tc>
@@ -8021,7 +8750,7 @@
                           <pic:cNvPicPr/>
                         </pic:nvPicPr>
                         <pic:blipFill>
-                          <a:blip r:embed="rId32">
+                          <a:blip r:embed="rId33">
                             <a:extLst>
                               <a:ext uri="{28A0092B-C50C-407E-A947-70E740481C1C}">
                                 <a14:useLocalDpi xmlns:a14="http://schemas.microsoft.com/office/drawing/2010/main" val="0"/>
@@ -8141,6 +8870,11 @@
             <w:pPr>
               <w:spacing w:after="120"/>
               <w:jc w:val="both"/>
+              <w:rPr>
+                <w:rFonts w:ascii="Times New Roman" w:hAnsi="Times New Roman"/>
+                <w:color w:val="000000"/>
+                <w:sz w:val="24"/>
+              </w:rPr>
             </w:pPr>
             <w:r>
               <w:rPr>
@@ -8182,6 +8916,35 @@
               </w:rPr>
               <w:t>.</w:t>
             </w:r>
+          </w:p>
+          <w:p>
+            <w:pPr>
+              <w:spacing w:after="120"/>
+              <w:jc w:val="both"/>
+              <w:rPr>
+                <w:rFonts w:ascii="Times New Roman" w:hAnsi="Times New Roman"/>
+                <w:color w:val="000000"/>
+                <w:sz w:val="24"/>
+              </w:rPr>
+            </w:pPr>
+            <w:r>
+              <w:rPr>
+                <w:rFonts w:ascii="Times New Roman" w:hAnsi="Times New Roman"/>
+                <w:color w:val="000000"/>
+                <w:sz w:val="24"/>
+              </w:rPr>
+              <w:t>Un ulteriore elemento di forza deriva dall’ancoraggio a uno standard riconosciuto: adottando il Core del Framework Nazionale come riferimento, la valutazione diventa ripetibile nel tempo e confrontabile fra organizzazioni diverse, e la base dati si trasforma da semplice registro in strumento di misurazione e di pianificazione.</w:t>
+            </w:r>
+          </w:p>
+          <w:p>
+            <w:pPr>
+              <w:spacing w:before="160" w:after="80"/>
+              <w:rPr>
+                <w:rFonts w:ascii="Times New Roman" w:hAnsi="Times New Roman"/>
+                <w:b/>
+                <w:sz w:val="24"/>
+              </w:rPr>
+            </w:pPr>
           </w:p>
           <w:p>
             <w:pPr>
@@ -8231,6 +8994,11 @@
             <w:pPr>
               <w:spacing w:after="120"/>
               <w:jc w:val="both"/>
+              <w:rPr>
+                <w:rFonts w:ascii="Times New Roman" w:hAnsi="Times New Roman"/>
+                <w:color w:val="000000"/>
+                <w:sz w:val="24"/>
+              </w:rPr>
             </w:pPr>
             <w:r>
               <w:rPr>
@@ -8259,6 +9027,25 @@
           </w:p>
           <w:p>
             <w:pPr>
+              <w:spacing w:after="120"/>
+              <w:jc w:val="both"/>
+              <w:rPr>
+                <w:rFonts w:ascii="Times New Roman" w:hAnsi="Times New Roman"/>
+                <w:color w:val="000000"/>
+                <w:sz w:val="24"/>
+              </w:rPr>
+            </w:pPr>
+            <w:r>
+              <w:rPr>
+                <w:rFonts w:ascii="Times New Roman" w:hAnsi="Times New Roman"/>
+                <w:color w:val="000000"/>
+                <w:sz w:val="24"/>
+              </w:rPr>
+              <w:t>Con riguardo all’assessment, va inoltre precisato che il modello recepisce un sottoinsieme rappresentativo delle Subcategory del Core e non la loro totalità, e che i livelli target e attuali presenti nel dataset sono ipotizzati a fini dimostrativi: in un impiego reale essi dovrebbero derivare da una rilevazione condotta secondo la metodologia di assessment, con il coinvolgimento delle funzioni competenti.</w:t>
+            </w:r>
+          </w:p>
+          <w:p>
+            <w:pPr>
               <w:spacing w:before="160" w:after="80"/>
             </w:pPr>
             <w:r>
@@ -8362,12 +9149,9 @@
           <w:p>
             <w:pPr>
               <w:rPr>
-                <w:rFonts w:ascii="Times New Roman" w:hAnsi="Times New Roman" w:cs="Times New Roman"/>
-                <w:b/>
-                <w:color w:val="000000"/>
-                <w:sz w:val="28"/>
-                <w:szCs w:val="28"/>
-                <w:lang w:val="it-IT"/>
+                <w:rFonts w:ascii="Times New Roman" w:hAnsi="Times New Roman"/>
+                <w:color w:val="000000"/>
+                <w:sz w:val="24"/>
               </w:rPr>
             </w:pPr>
             <w:r>

</xml_diff>

<commit_message>
Eliminazione db versione precedente e re-inizializzato con schema e dataset aggiornati
Il db precedente alla valutazione è stato eliminato (DROP DATABASE nis2db), inizializzato con lo schema aggiornato, popolato con dataset aggiornato e verificato corretta popolazione tramite query di test e script di export csv aggiornati con tabelle mancanti. Creata cartella "csv\excel- version" con gli export dei file "excel ready" con separatore differente per visualizzazione più immediata.
Correzioni minori nel file di consegna.
</commit_message>
<xml_diff>
--- a/Guerra_Giacomo_0312500522.docx
+++ b/Guerra_Giacomo_0312500522.docx
@@ -1,6 +1,6 @@
 
 <file path=word/document.xml><?xml version="1.0" encoding="utf-8"?>
-<w:document xmlns:wpc="http://schemas.microsoft.com/office/word/2010/wordprocessingCanvas" xmlns:cx="http://schemas.microsoft.com/office/drawing/2014/chartex" xmlns:cx1="http://schemas.microsoft.com/office/drawing/2015/9/8/chartex" xmlns:cx2="http://schemas.microsoft.com/office/drawing/2015/10/21/chartex" xmlns:cx3="http://schemas.microsoft.com/office/drawing/2016/5/9/chartex" xmlns:cx4="http://schemas.microsoft.com/office/drawing/2016/5/10/chartex" xmlns:cx5="http://schemas.microsoft.com/office/drawing/2016/5/11/chartex" xmlns:cx6="http://schemas.microsoft.com/office/drawing/2016/5/12/chartex" xmlns:cx7="http://schemas.microsoft.com/office/drawing/2016/5/13/chartex" xmlns:cx8="http://schemas.microsoft.com/office/drawing/2016/5/14/chartex" xmlns:mc="http://schemas.openxmlformats.org/markup-compatibility/2006" xmlns:aink="http://schemas.microsoft.com/office/drawing/2016/ink" xmlns:am3d="http://schemas.microsoft.com/office/drawing/2017/model3d" xmlns:o="urn:schemas-microsoft-com:office:office" xmlns:oel="http://schemas.microsoft.com/office/2019/extlst" xmlns:r="http://schemas.openxmlformats.org/officeDocument/2006/relationships" xmlns:m="http://schemas.openxmlformats.org/officeDocument/2006/math" xmlns:v="urn:schemas-microsoft-com:vml" xmlns:wp14="http://schemas.microsoft.com/office/word/2010/wordprocessingDrawing" xmlns:wp="http://schemas.openxmlformats.org/drawingml/2006/wordprocessingDrawing" xmlns:w10="urn:schemas-microsoft-com:office:word" xmlns:w="http://schemas.openxmlformats.org/wordprocessingml/2006/main" xmlns:w14="http://schemas.microsoft.com/office/word/2010/wordml" xmlns:w15="http://schemas.microsoft.com/office/word/2012/wordml" xmlns:w16cex="http://schemas.microsoft.com/office/word/2018/wordml/cex" xmlns:w16cid="http://schemas.microsoft.com/office/word/2016/wordml/cid" xmlns:w16="http://schemas.microsoft.com/office/word/2018/wordml" xmlns:w16du="http://schemas.microsoft.com/office/word/2023/wordml/word16du" xmlns:w16sdtdh="http://schemas.microsoft.com/office/word/2020/wordml/sdtdatahash" xmlns:w16sdtfl="http://schemas.microsoft.com/office/word/2024/wordml/sdtformatlock" xmlns:w16se="http://schemas.microsoft.com/office/word/2015/wordml/symex" xmlns:wpg="http://schemas.microsoft.com/office/word/2010/wordprocessingGroup" xmlns:wpi="http://schemas.microsoft.com/office/word/2010/wordprocessingInk" xmlns:wne="http://schemas.microsoft.com/office/word/2006/wordml" xmlns:wps="http://schemas.microsoft.com/office/word/2010/wordprocessingShape" mc:Ignorable="w14 w15 w16se w16cid w16 w16cex w16sdtdh w16sdtfl w16du wp14">
+<w:document xmlns:wpc="http://schemas.microsoft.com/office/word/2010/wordprocessingCanvas" xmlns:cx="http://schemas.microsoft.com/office/drawing/2014/chartex" xmlns:cx1="http://schemas.microsoft.com/office/drawing/2015/9/8/chartex" xmlns:cx2="http://schemas.microsoft.com/office/drawing/2015/10/21/chartex" xmlns:cx3="http://schemas.microsoft.com/office/drawing/2016/5/9/chartex" xmlns:cx4="http://schemas.microsoft.com/office/drawing/2016/5/10/chartex" xmlns:cx5="http://schemas.microsoft.com/office/drawing/2016/5/11/chartex" xmlns:cx6="http://schemas.microsoft.com/office/drawing/2016/5/12/chartex" xmlns:cx7="http://schemas.microsoft.com/office/drawing/2016/5/13/chartex" xmlns:cx8="http://schemas.microsoft.com/office/drawing/2016/5/14/chartex" xmlns:mc="http://schemas.openxmlformats.org/markup-compatibility/2006" xmlns:aink="http://schemas.microsoft.com/office/drawing/2016/ink" xmlns:am3d="http://schemas.microsoft.com/office/drawing/2017/model3d" xmlns:o="urn:schemas-microsoft-com:office:office" xmlns:oel="http://schemas.microsoft.com/office/2019/extlst" xmlns:r="http://schemas.openxmlformats.org/officeDocument/2006/relationships" xmlns:m="http://schemas.openxmlformats.org/officeDocument/2006/math" xmlns:v="urn:schemas-microsoft-com:vml" xmlns:wp14="http://schemas.microsoft.com/office/word/2010/wordprocessingDrawing" xmlns:wp="http://schemas.openxmlformats.org/drawingml/2006/wordprocessingDrawing" xmlns:w10="urn:schemas-microsoft-com:office:word" xmlns:w="http://schemas.openxmlformats.org/wordprocessingml/2006/main" xmlns:w14="http://schemas.microsoft.com/office/word/2010/wordml" xmlns:w15="http://schemas.microsoft.com/office/word/2012/wordml" xmlns:w16cei="http://schemas.microsoft.com/office/word/2026/wordml/cei" xmlns:w16cex="http://schemas.microsoft.com/office/word/2018/wordml/cex" xmlns:w16cid="http://schemas.microsoft.com/office/word/2016/wordml/cid" xmlns:w16="http://schemas.microsoft.com/office/word/2018/wordml" xmlns:w16du="http://schemas.microsoft.com/office/word/2023/wordml/word16du" xmlns:w16sdtdh="http://schemas.microsoft.com/office/word/2020/wordml/sdtdatahash" xmlns:w16sdtfl="http://schemas.microsoft.com/office/word/2024/wordml/sdtformatlock" xmlns:w16se="http://schemas.microsoft.com/office/word/2015/wordml/symex" xmlns:wpg="http://schemas.microsoft.com/office/word/2010/wordprocessingGroup" xmlns:wpi="http://schemas.microsoft.com/office/word/2010/wordprocessingInk" xmlns:wne="http://schemas.microsoft.com/office/word/2006/wordml" xmlns:wps="http://schemas.microsoft.com/office/word/2010/wordprocessingShape" mc:Ignorable="w14 w15 w16se w16cid w16 w16cex w16sdtdh w16sdtfl w16du wp14">
   <w:body>
     <w:tbl>
       <w:tblPr>
@@ -45,7 +45,7 @@
                 <w14:ligatures w14:val="standardContextual"/>
               </w:rPr>
               <w:drawing>
-                <wp:inline distT="0" distB="0" distL="0" distR="0" wp14:anchorId="63CFB47A" wp14:editId="10F85138">
+                <wp:inline distT="0" distB="0" distL="0" distR="0" wp14:anchorId="63CFB47A" wp14:editId="37116FAD">
                   <wp:extent cx="728345" cy="571500"/>
                   <wp:effectExtent l="0" t="0" r="0" b="0"/>
                   <wp:docPr id="6" name="Immagine 6"/>
@@ -2048,7 +2048,23 @@
                 <w:color w:val="000000"/>
                 <w:sz w:val="24"/>
               </w:rPr>
-              <w:t>La sesta fase, di sviluppo delle interrogazioni di estrazione (circa tre giorni), ha portato alla definizione di undici query e dei relativi comandi di esportazione in formato CSV, con la generazione automatica dei file per ciascuna organizzazione.</w:t>
+              <w:t xml:space="preserve">La sesta fase, di sviluppo delle interrogazioni di estrazione (circa tre giorni), ha portato alla definizione di </w:t>
+            </w:r>
+            <w:r>
+              <w:rPr>
+                <w:rFonts w:ascii="Times New Roman" w:hAnsi="Times New Roman"/>
+                <w:color w:val="000000"/>
+                <w:sz w:val="24"/>
+              </w:rPr>
+              <w:t>tredici</w:t>
+            </w:r>
+            <w:r>
+              <w:rPr>
+                <w:rFonts w:ascii="Times New Roman" w:hAnsi="Times New Roman"/>
+                <w:color w:val="000000"/>
+                <w:sz w:val="24"/>
+              </w:rPr>
+              <w:t xml:space="preserve"> query e dei relativi comandi di esportazione in formato CSV, con la generazione automatica dei file per ciascuna organizzazione.</w:t>
             </w:r>
           </w:p>
           <w:p>
@@ -3006,27 +3022,7 @@
                   <w:szCs w:val="24"/>
                   <w:lang w:val="it-IT"/>
                 </w:rPr>
-                <w:t>https://www.cybersecurityfram</w:t>
-              </w:r>
-              <w:r>
-                <w:rPr>
-                  <w:rStyle w:val="Hyperlink"/>
-                  <w:rFonts w:ascii="Times New Roman" w:hAnsi="Times New Roman" w:cs="Times New Roman"/>
-                  <w:sz w:val="24"/>
-                  <w:szCs w:val="24"/>
-                  <w:lang w:val="it-IT"/>
-                </w:rPr>
-                <w:t>e</w:t>
-              </w:r>
-              <w:r>
-                <w:rPr>
-                  <w:rStyle w:val="Hyperlink"/>
-                  <w:rFonts w:ascii="Times New Roman" w:hAnsi="Times New Roman" w:cs="Times New Roman"/>
-                  <w:sz w:val="24"/>
-                  <w:szCs w:val="24"/>
-                  <w:lang w:val="it-IT"/>
-                </w:rPr>
-                <w:t>work.it</w:t>
+                <w:t>https://www.cybersecurityframework.it</w:t>
               </w:r>
             </w:hyperlink>
             <w:r>
@@ -3424,7 +3420,23 @@
                 <w:color w:val="000000"/>
                 <w:sz w:val="24"/>
               </w:rPr>
-              <w:t>nove viste e undici interrogazioni</w:t>
+              <w:t xml:space="preserve">nove viste e </w:t>
+            </w:r>
+            <w:r>
+              <w:rPr>
+                <w:rFonts w:ascii="Times New Roman" w:hAnsi="Times New Roman"/>
+                <w:color w:val="000000"/>
+                <w:sz w:val="24"/>
+              </w:rPr>
+              <w:t>tredici</w:t>
+            </w:r>
+            <w:r>
+              <w:rPr>
+                <w:rFonts w:ascii="Times New Roman" w:hAnsi="Times New Roman"/>
+                <w:color w:val="000000"/>
+                <w:sz w:val="24"/>
+              </w:rPr>
+              <w:t xml:space="preserve"> interrogazioni</w:t>
             </w:r>
             <w:r>
               <w:rPr>
@@ -5155,7 +5167,23 @@
                 <w:color w:val="000000"/>
                 <w:sz w:val="24"/>
               </w:rPr>
-              <w:t xml:space="preserve"> join contemporaneamente. Alle viste si affiancano undici interrogazioni di esportazione che producono, per ciascuna organizzazione, altrettanti file in formato CSV, comprensivi di colonne calcolate quali la classe di disponibilit</w:t>
+              <w:t xml:space="preserve"> join contemporaneamente. Alle viste si affiancano </w:t>
+            </w:r>
+            <w:r>
+              <w:rPr>
+                <w:rFonts w:ascii="Times New Roman" w:hAnsi="Times New Roman"/>
+                <w:color w:val="000000"/>
+                <w:sz w:val="24"/>
+              </w:rPr>
+              <w:t>tredici</w:t>
+            </w:r>
+            <w:r>
+              <w:rPr>
+                <w:rFonts w:ascii="Times New Roman" w:hAnsi="Times New Roman"/>
+                <w:color w:val="000000"/>
+                <w:sz w:val="24"/>
+              </w:rPr>
+              <w:t xml:space="preserve"> interrogazioni di esportazione che producono, per ciascuna organizzazione, altrettanti file in formato CSV, comprensivi di colonne calcolate quali la classe di disponibilit</w:t>
             </w:r>
             <w:r>
               <w:rPr>
@@ -5230,15 +5258,7 @@
                 <w:color w:val="000000"/>
                 <w:sz w:val="24"/>
               </w:rPr>
-              <w:t>trecentoundici</w:t>
-            </w:r>
-            <w:r>
-              <w:rPr>
-                <w:rFonts w:ascii="Times New Roman" w:hAnsi="Times New Roman"/>
-                <w:color w:val="000000"/>
-                <w:sz w:val="24"/>
-              </w:rPr>
-              <w:t xml:space="preserve"> </w:t>
+              <w:t xml:space="preserve">trecentoundici </w:t>
             </w:r>
             <w:r>
               <w:rPr>
@@ -5702,23 +5722,55 @@
                 <w:color w:val="000000"/>
                 <w:sz w:val="24"/>
               </w:rPr>
-              <w:t>Le undici interrogazioni di esportazione producono altrettante viste tabellari del profilo, pensate per essere salvate in file distinti e riutilizzabili. Nel dettaglio, esse generano l’anagrafica del soggetto con il referente ACN; l’elenco completo dei referenti; l’inventario degli asset critici e importanti con il proprietario e i servizi supportati; il perimetro dei servizi erogati con la classe di disponibilit</w:t>
-            </w:r>
-            <w:r>
-              <w:rPr>
-                <w:rFonts w:ascii="Times New Roman" w:hAnsi="Times New Roman"/>
-                <w:color w:val="000000"/>
-                <w:sz w:val="24"/>
-              </w:rPr>
-              <w:t>à</w:t>
-            </w:r>
-            <w:r>
-              <w:rPr>
-                <w:rFonts w:ascii="Times New Roman" w:hAnsi="Times New Roman"/>
-                <w:color w:val="000000"/>
-                <w:sz w:val="24"/>
-              </w:rPr>
-              <w:t>; le dipendenze dalla catena di fornitura con lo stato dei contratti; lo stato delle misure di sicurezza; un quadro riepilogativo dei contatori chiave; l’avviso sui contratti scaduti o in scadenza; l’analisi degli asset privi di proprietario; l’analisi delle misure non ancora attuate; e lo storico delle modifiche agli asset. A queste si aggiunge una vista di confronto sintetico fra tutte le organizzazioni registrate, utile a una lettura d’insieme.</w:t>
+              <w:t xml:space="preserve">Le </w:t>
+            </w:r>
+            <w:r>
+              <w:rPr>
+                <w:rFonts w:ascii="Times New Roman" w:hAnsi="Times New Roman"/>
+                <w:color w:val="000000"/>
+                <w:sz w:val="24"/>
+              </w:rPr>
+              <w:t>tredici</w:t>
+            </w:r>
+            <w:r>
+              <w:rPr>
+                <w:rFonts w:ascii="Times New Roman" w:hAnsi="Times New Roman"/>
+                <w:color w:val="000000"/>
+                <w:sz w:val="24"/>
+              </w:rPr>
+              <w:t xml:space="preserve"> interrogazioni di esportazione producono altrettante viste tabellari del profilo, pensate per essere salvate in file distinti e riutilizzabili. Nel dettaglio, esse generano l’anagrafica del soggetto con il referente ACN; l’elenco completo dei referenti; l’inventario degli asset critici e importanti con il proprietario e i servizi supportati; il perimetro dei servizi erogati con la classe di disponibilit</w:t>
+            </w:r>
+            <w:r>
+              <w:rPr>
+                <w:rFonts w:ascii="Times New Roman" w:hAnsi="Times New Roman"/>
+                <w:color w:val="000000"/>
+                <w:sz w:val="24"/>
+              </w:rPr>
+              <w:t>à</w:t>
+            </w:r>
+            <w:r>
+              <w:rPr>
+                <w:rFonts w:ascii="Times New Roman" w:hAnsi="Times New Roman"/>
+                <w:color w:val="000000"/>
+                <w:sz w:val="24"/>
+              </w:rPr>
+              <w:t xml:space="preserve">; le dipendenze dalla catena di fornitura con lo stato dei contratti; lo stato delle misure di sicurezza; un quadro riepilogativo dei contatori chiave; l’avviso sui contratti scaduti o in scadenza; l’analisi degli asset privi di proprietario; l’analisi delle misure non ancora attuate; e lo storico delle modifiche agli asset. A queste si </w:t>
+            </w:r>
+            <w:r>
+              <w:rPr>
+                <w:rFonts w:ascii="Times New Roman" w:hAnsi="Times New Roman"/>
+                <w:color w:val="000000"/>
+                <w:sz w:val="24"/>
+              </w:rPr>
+              <w:t>aggiungono due viste</w:t>
+            </w:r>
+            <w:r>
+              <w:rPr>
+                <w:rFonts w:ascii="Times New Roman" w:hAnsi="Times New Roman"/>
+                <w:color w:val="000000"/>
+                <w:sz w:val="24"/>
+              </w:rPr>
+              <w:t xml:space="preserve"> di confronto sintetico fra tutte le organizzazioni registrate, utile a una lettura d’insieme.</w:t>
             </w:r>
           </w:p>
           <w:p>
@@ -7118,51 +7170,25 @@
                 <w:rFonts w:ascii="Courier New" w:hAnsi="Courier New"/>
                 <w:color w:val="1F3864"/>
                 <w:sz w:val="18"/>
-              </w:rPr>
-            </w:pPr>
-            <w:r>
-              <w:rPr>
-                <w:rFonts w:ascii="Courier New" w:hAnsi="Courier New"/>
-                <w:color w:val="1F3864"/>
-                <w:sz w:val="18"/>
-              </w:rPr>
-              <w:t xml:space="preserve">       CASE WHEN </w:t>
-            </w:r>
-            <w:proofErr w:type="gramStart"/>
-            <w:r>
-              <w:rPr>
-                <w:rFonts w:ascii="Courier New" w:hAnsi="Courier New"/>
-                <w:color w:val="1F3864"/>
-                <w:sz w:val="18"/>
-              </w:rPr>
-              <w:t>a.livello</w:t>
-            </w:r>
-            <w:proofErr w:type="gramEnd"/>
-            <w:r>
-              <w:rPr>
-                <w:rFonts w:ascii="Courier New" w:hAnsi="Courier New"/>
-                <w:color w:val="1F3864"/>
-                <w:sz w:val="18"/>
-              </w:rPr>
-              <w:t xml:space="preserve">_attuale &gt;= </w:t>
-            </w:r>
-            <w:proofErr w:type="gramStart"/>
-            <w:r>
-              <w:rPr>
-                <w:rFonts w:ascii="Courier New" w:hAnsi="Courier New"/>
-                <w:color w:val="1F3864"/>
-                <w:sz w:val="18"/>
-              </w:rPr>
-              <w:t>a.livello</w:t>
-            </w:r>
-            <w:proofErr w:type="gramEnd"/>
-            <w:r>
-              <w:rPr>
-                <w:rFonts w:ascii="Courier New" w:hAnsi="Courier New"/>
-                <w:color w:val="1F3864"/>
-                <w:sz w:val="18"/>
-              </w:rPr>
-              <w:t>_target THEN 'Raggiunto'</w:t>
+                <w:lang w:val="en-US"/>
+              </w:rPr>
+            </w:pPr>
+            <w:r>
+              <w:rPr>
+                <w:rFonts w:ascii="Courier New" w:hAnsi="Courier New"/>
+                <w:color w:val="1F3864"/>
+                <w:sz w:val="18"/>
+              </w:rPr>
+              <w:t xml:space="preserve">       </w:t>
+            </w:r>
+            <w:r>
+              <w:rPr>
+                <w:rFonts w:ascii="Courier New" w:hAnsi="Courier New"/>
+                <w:color w:val="1F3864"/>
+                <w:sz w:val="18"/>
+                <w:lang w:val="en-US"/>
+              </w:rPr>
+              <w:t>CASE WHEN a.livello_attuale &gt;= a.livello_target THEN 'Raggiunto'</w:t>
             </w:r>
           </w:p>
           <w:p>
@@ -7172,13 +7198,15 @@
                 <w:rFonts w:ascii="Courier New" w:hAnsi="Courier New"/>
                 <w:color w:val="1F3864"/>
                 <w:sz w:val="18"/>
-              </w:rPr>
-            </w:pPr>
-            <w:r>
-              <w:rPr>
-                <w:rFonts w:ascii="Courier New" w:hAnsi="Courier New"/>
-                <w:color w:val="1F3864"/>
-                <w:sz w:val="18"/>
+                <w:lang w:val="en-US"/>
+              </w:rPr>
+            </w:pPr>
+            <w:r>
+              <w:rPr>
+                <w:rFonts w:ascii="Courier New" w:hAnsi="Courier New"/>
+                <w:color w:val="1F3864"/>
+                <w:sz w:val="18"/>
+                <w:lang w:val="en-US"/>
               </w:rPr>
               <w:t xml:space="preserve">            ELSE 'Da colmare' END AS stato</w:t>
             </w:r>
@@ -7190,13 +7218,15 @@
                 <w:rFonts w:ascii="Courier New" w:hAnsi="Courier New"/>
                 <w:color w:val="1F3864"/>
                 <w:sz w:val="18"/>
-              </w:rPr>
-            </w:pPr>
-            <w:r>
-              <w:rPr>
-                <w:rFonts w:ascii="Courier New" w:hAnsi="Courier New"/>
-                <w:color w:val="1F3864"/>
-                <w:sz w:val="18"/>
+                <w:lang w:val="en-US"/>
+              </w:rPr>
+            </w:pPr>
+            <w:r>
+              <w:rPr>
+                <w:rFonts w:ascii="Courier New" w:hAnsi="Courier New"/>
+                <w:color w:val="1F3864"/>
+                <w:sz w:val="18"/>
+                <w:lang w:val="en-US"/>
               </w:rPr>
               <w:t>FROM assessment a</w:t>
             </w:r>
@@ -7226,33 +7256,17 @@
                 <w:rFonts w:ascii="Courier New" w:hAnsi="Courier New"/>
                 <w:color w:val="1F3864"/>
                 <w:sz w:val="18"/>
-              </w:rPr>
-            </w:pPr>
-            <w:r>
-              <w:rPr>
-                <w:rFonts w:ascii="Courier New" w:hAnsi="Courier New"/>
-                <w:color w:val="1F3864"/>
-                <w:sz w:val="18"/>
-              </w:rPr>
-              <w:t xml:space="preserve">ORDER BY CASE </w:t>
-            </w:r>
-            <w:proofErr w:type="gramStart"/>
-            <w:r>
-              <w:rPr>
-                <w:rFonts w:ascii="Courier New" w:hAnsi="Courier New"/>
-                <w:color w:val="1F3864"/>
-                <w:sz w:val="18"/>
-              </w:rPr>
-              <w:t>a.priorita</w:t>
-            </w:r>
-            <w:proofErr w:type="gramEnd"/>
-            <w:r>
-              <w:rPr>
-                <w:rFonts w:ascii="Courier New" w:hAnsi="Courier New"/>
-                <w:color w:val="1F3864"/>
-                <w:sz w:val="18"/>
-              </w:rPr>
-              <w:t xml:space="preserve"> WHEN 'alta' THEN 1 WHEN 'media' THEN 2 ELSE 3 END,</w:t>
+                <w:lang w:val="en-US"/>
+              </w:rPr>
+            </w:pPr>
+            <w:r>
+              <w:rPr>
+                <w:rFonts w:ascii="Courier New" w:hAnsi="Courier New"/>
+                <w:color w:val="1F3864"/>
+                <w:sz w:val="18"/>
+                <w:lang w:val="en-US"/>
+              </w:rPr>
+              <w:t>ORDER BY CASE a.priorita WHEN 'alta' THEN 1 WHEN 'media' THEN 2 ELSE 3 END,</w:t>
             </w:r>
           </w:p>
           <w:p>
@@ -7269,8 +7283,17 @@
                 <w:rFonts w:ascii="Courier New" w:hAnsi="Courier New"/>
                 <w:color w:val="1F3864"/>
                 <w:sz w:val="18"/>
-              </w:rPr>
-              <w:t xml:space="preserve">         (a.livello_target - a.livello_attuale) DESC;</w:t>
+                <w:lang w:val="en-US"/>
+              </w:rPr>
+              <w:t xml:space="preserve">         </w:t>
+            </w:r>
+            <w:r>
+              <w:rPr>
+                <w:rFonts w:ascii="Courier New" w:hAnsi="Courier New"/>
+                <w:color w:val="1F3864"/>
+                <w:sz w:val="18"/>
+              </w:rPr>
+              <w:t>(a.livello_target - a.livello_attuale) DESC;</w:t>
             </w:r>
           </w:p>
           <w:p>

</xml_diff>